<commit_message>
feat: adicao do Relatorio De Desempenho
</commit_message>
<xml_diff>
--- a/FAI-SI-PFC-I-FalaCidade-2026-v1.2.docx
+++ b/FAI-SI-PFC-I-FalaCidade-2026-v1.2.docx
@@ -167,7 +167,6 @@
       <w:r>
         <w:t xml:space="preserve">Plataforma web para reporte de incidentes urbanos e gestão de zeladoria pública.</w:t>
       </w:r>
-      <w:r/>
       <w:r/>
     </w:p>
     <w:p>
@@ -731,7 +730,7 @@
     <w:tbl>
       <w:tblPr>
         <w:tblInd w:w="108" w:type="dxa"/>
-        <w:tblW w:w="9214" w:type="dxa"/>
+        <w:tblW w:w="9212" w:type="dxa"/>
         <w:tblCellMar>
           <w:left w:w="10" w:type="dxa"/>
           <w:right w:w="10" w:type="dxa"/>
@@ -751,7 +750,7 @@
         <w:gridCol w:w="1408"/>
         <w:gridCol w:w="1144"/>
         <w:gridCol w:w="2977"/>
-        <w:gridCol w:w="3685"/>
+        <w:gridCol w:w="3683"/>
       </w:tblGrid>
       <w:tr>
         <w:trPr/>
@@ -839,7 +838,61 @@
               <w:right w:w="108" w:type="dxa"/>
               <w:bottom w:w="100" w:type="dxa"/>
             </w:tcMar>
-            <w:tcW w:w="3685" w:type="dxa"/>
+            <w:tcW w:w="3683" w:type="dxa"/>
+          </w:tcPr>
+          <w:p>
+            <w:pPr>
+              <w:pBdr/>
+              <w:spacing/>
+              <w:ind/>
+              <w:rPr>
+                <w:highlight w:val="none"/>
+              </w:rPr>
+            </w:pPr>
+            <w:r>
+              <w:t xml:space="preserve">Descrição</w:t>
+            </w:r>
+            <w:r>
+              <w:rPr>
+                <w:highlight w:val="none"/>
+              </w:rPr>
+            </w:r>
+            <w:r>
+              <w:rPr>
+                <w:highlight w:val="none"/>
+              </w:rPr>
+            </w:r>
+            <w:r>
+              <w:rPr>
+                <w:highlight w:val="none"/>
+              </w:rPr>
+            </w:r>
+            <w:r>
+              <w:rPr>
+                <w:highlight w:val="none"/>
+              </w:rPr>
+            </w:r>
+            <w:r>
+              <w:rPr>
+                <w:highlight w:val="none"/>
+              </w:rPr>
+            </w:r>
+          </w:p>
+        </w:tc>
+      </w:tr>
+      <w:tr>
+        <w:trPr/>
+        <w:tc>
+          <w:tcPr>
+            <w:tcBorders/>
+            <w:tcMar>
+              <w:left w:w="108" w:type="dxa"/>
+              <w:top w:w="100" w:type="dxa"/>
+              <w:right w:w="108" w:type="dxa"/>
+              <w:bottom w:w="100" w:type="dxa"/>
+            </w:tcMar>
+            <w:tcW w:w="1408" w:type="dxa"/>
+            <w:vMerge w:val="restart"/>
           </w:tcPr>
           <w:p>
             <w:pPr>
@@ -849,8 +902,87 @@
               <w:rPr/>
             </w:pPr>
             <w:r>
-              <w:t xml:space="preserve">Descrição</w:t>
+              <w:t xml:space="preserve">16/04/2026</w:t>
             </w:r>
+            <w:r/>
+          </w:p>
+        </w:tc>
+        <w:tc>
+          <w:tcPr>
+            <w:tcBorders/>
+            <w:tcMar>
+              <w:left w:w="108" w:type="dxa"/>
+              <w:top w:w="100" w:type="dxa"/>
+              <w:right w:w="108" w:type="dxa"/>
+              <w:bottom w:w="100" w:type="dxa"/>
+            </w:tcMar>
+            <w:tcW w:w="1144" w:type="dxa"/>
+            <w:vMerge w:val="restart"/>
+          </w:tcPr>
+          <w:p>
+            <w:pPr>
+              <w:pBdr/>
+              <w:spacing/>
+              <w:ind/>
+              <w:rPr/>
+            </w:pPr>
+            <w:r>
+              <w:t xml:space="preserve">1.2</w:t>
+            </w:r>
+            <w:r/>
+          </w:p>
+        </w:tc>
+        <w:tc>
+          <w:tcPr>
+            <w:tcBorders/>
+            <w:tcMar>
+              <w:left w:w="108" w:type="dxa"/>
+              <w:top w:w="100" w:type="dxa"/>
+              <w:right w:w="108" w:type="dxa"/>
+              <w:bottom w:w="100" w:type="dxa"/>
+            </w:tcMar>
+            <w:tcW w:w="2977" w:type="dxa"/>
+            <w:vMerge w:val="restart"/>
+          </w:tcPr>
+          <w:p>
+            <w:pPr>
+              <w:pBdr/>
+              <w:spacing/>
+              <w:ind/>
+              <w:rPr/>
+            </w:pPr>
+            <w:r>
+              <w:t xml:space="preserve">Rodrigo Pereira Romano</w:t>
+            </w:r>
+            <w:r/>
+          </w:p>
+        </w:tc>
+        <w:tc>
+          <w:tcPr>
+            <w:tcBorders/>
+            <w:tcMar>
+              <w:left w:w="108" w:type="dxa"/>
+              <w:top w:w="100" w:type="dxa"/>
+              <w:right w:w="108" w:type="dxa"/>
+              <w:bottom w:w="100" w:type="dxa"/>
+            </w:tcMar>
+            <w:tcW w:w="3683" w:type="dxa"/>
+            <w:vMerge w:val="restart"/>
+          </w:tcPr>
+          <w:p>
+            <w:pPr>
+              <w:pBdr/>
+              <w:spacing/>
+              <w:ind/>
+              <w:rPr/>
+            </w:pPr>
+            <w:r>
+              <w:t xml:space="preserve">Correç</w:t>
+            </w:r>
+            <w:r>
+              <w:t xml:space="preserve">ões da Fase 1.</w:t>
+            </w:r>
+            <w:r/>
             <w:r/>
           </w:p>
         </w:tc>
@@ -873,12 +1005,23 @@
               <w:pBdr/>
               <w:spacing/>
               <w:ind/>
-              <w:rPr/>
+              <w:rPr>
+                <w:highlight w:val="none"/>
+              </w:rPr>
             </w:pPr>
             <w:r>
               <w:t xml:space="preserve">05/04/2026</w:t>
             </w:r>
-            <w:r/>
+            <w:r>
+              <w:rPr>
+                <w:highlight w:val="none"/>
+              </w:rPr>
+            </w:r>
+            <w:r>
+              <w:rPr>
+                <w:highlight w:val="none"/>
+              </w:rPr>
+            </w:r>
           </w:p>
         </w:tc>
         <w:tc>
@@ -938,7 +1081,7 @@
               <w:right w:w="108" w:type="dxa"/>
               <w:bottom w:w="100" w:type="dxa"/>
             </w:tcMar>
-            <w:tcW w:w="3685" w:type="dxa"/>
+            <w:tcW w:w="3683" w:type="dxa"/>
           </w:tcPr>
           <w:p>
             <w:pPr>
@@ -1055,7 +1198,7 @@
               <w:right w:w="108" w:type="dxa"/>
               <w:bottom w:w="100" w:type="dxa"/>
             </w:tcMar>
-            <w:tcW w:w="3685" w:type="dxa"/>
+            <w:tcW w:w="3683" w:type="dxa"/>
           </w:tcPr>
           <w:p>
             <w:pPr>
@@ -1078,39 +1221,7 @@
         <w:pBdr/>
         <w:spacing/>
         <w:ind/>
-        <w:rPr/>
-      </w:pPr>
-      <w:r/>
-      <w:r/>
-    </w:p>
-    <w:p>
-      <w:pPr>
-        <w:pStyle w:val="1791"/>
-        <w:pBdr/>
-        <w:spacing/>
-        <w:ind/>
-        <w:rPr/>
-      </w:pPr>
-      <w:r/>
-      <w:r/>
-    </w:p>
-    <w:p>
-      <w:pPr>
-        <w:pStyle w:val="1791"/>
-        <w:pBdr/>
-        <w:spacing/>
-        <w:ind/>
-        <w:rPr/>
-      </w:pPr>
-      <w:r/>
-      <w:r/>
-    </w:p>
-    <w:p>
-      <w:pPr>
-        <w:pStyle w:val="1791"/>
-        <w:pBdr/>
-        <w:spacing/>
-        <w:ind/>
+        <w:jc w:val="left"/>
         <w:rPr/>
       </w:pPr>
       <w:r/>
@@ -2868,17 +2979,235 @@
     </w:p>
     <w:p>
       <w:pPr>
-        <w:pStyle w:val="1787"/>
+        <w:pStyle w:val="1788"/>
         <w:pBdr/>
         <w:tabs>
           <w:tab w:val="right" w:leader="dot" w:pos="9072"/>
         </w:tabs>
         <w:spacing/>
         <w:ind/>
-        <w:rPr/>
+        <w:rPr>
+          <w:highlight w:val="none"/>
+        </w:rPr>
       </w:pPr>
       <w:r/>
       <w:hyperlink w:tooltip="#_Toc16" w:anchor="_Toc16" w:history="1">
+        <w:r>
+          <w:rPr>
+            <w:rStyle w:val="1789"/>
+          </w:rPr>
+        </w:r>
+        <w:r>
+          <w:rPr>
+            <w:rStyle w:val="1789"/>
+          </w:rPr>
+          <w:t xml:space="preserve">4.3.1 Recursos Humanos</w:t>
+        </w:r>
+        <w:r>
+          <w:rPr>
+            <w:rStyle w:val="1789"/>
+            <w:highlight w:val="none"/>
+          </w:rPr>
+        </w:r>
+        <w:r>
+          <w:tab/>
+        </w:r>
+        <w:r>
+          <w:fldChar w:fldCharType="begin"/>
+          <w:instrText xml:space="preserve">PAGEREF _Toc16 \h</w:instrText>
+          <w:fldChar w:fldCharType="separate"/>
+          <w:t xml:space="preserve">23</w:t>
+          <w:fldChar w:fldCharType="end"/>
+        </w:r>
+      </w:hyperlink>
+      <w:r>
+        <w:rPr>
+          <w:highlight w:val="none"/>
+        </w:rPr>
+      </w:r>
+      <w:r>
+        <w:rPr>
+          <w:highlight w:val="none"/>
+        </w:rPr>
+      </w:r>
+    </w:p>
+    <w:p>
+      <w:pPr>
+        <w:pStyle w:val="1788"/>
+        <w:pBdr/>
+        <w:tabs>
+          <w:tab w:val="right" w:leader="dot" w:pos="9072"/>
+        </w:tabs>
+        <w:spacing/>
+        <w:ind/>
+        <w:rPr/>
+      </w:pPr>
+      <w:r/>
+      <w:hyperlink w:tooltip="#_Toc17" w:anchor="_Toc17" w:history="1">
+        <w:r>
+          <w:rPr>
+            <w:rStyle w:val="1789"/>
+          </w:rPr>
+        </w:r>
+        <w:r>
+          <w:rPr>
+            <w:rStyle w:val="1789"/>
+            <w:lang w:val="pt-BR"/>
+          </w:rPr>
+          <w:t xml:space="preserve">4.3.2 </w:t>
+        </w:r>
+        <w:r>
+          <w:rPr>
+            <w:rStyle w:val="1789"/>
+            <w:lang w:val="en-US"/>
+          </w:rPr>
+          <w:t xml:space="preserve">Recursos de Hardware</w:t>
+        </w:r>
+        <w:r>
+          <w:rPr>
+            <w:rStyle w:val="1789"/>
+            <w:lang w:val="en-US"/>
+          </w:rPr>
+        </w:r>
+        <w:r>
+          <w:tab/>
+        </w:r>
+        <w:r>
+          <w:fldChar w:fldCharType="begin"/>
+          <w:instrText xml:space="preserve">PAGEREF _Toc17 \h</w:instrText>
+          <w:fldChar w:fldCharType="separate"/>
+          <w:t xml:space="preserve">23</w:t>
+          <w:fldChar w:fldCharType="end"/>
+        </w:r>
+      </w:hyperlink>
+      <w:r>
+        <w:rPr>
+          <w:lang w:val="en-US"/>
+        </w:rPr>
+      </w:r>
+      <w:r/>
+    </w:p>
+    <w:p>
+      <w:pPr>
+        <w:pStyle w:val="1788"/>
+        <w:pBdr/>
+        <w:tabs>
+          <w:tab w:val="right" w:leader="dot" w:pos="9072"/>
+        </w:tabs>
+        <w:spacing/>
+        <w:ind/>
+        <w:rPr>
+          <w:highlight w:val="none"/>
+        </w:rPr>
+      </w:pPr>
+      <w:r/>
+      <w:hyperlink w:tooltip="#_Toc18" w:anchor="_Toc18" w:history="1">
+        <w:r>
+          <w:rPr>
+            <w:rStyle w:val="1789"/>
+          </w:rPr>
+        </w:r>
+        <w:r>
+          <w:rPr>
+            <w:rStyle w:val="1789"/>
+            <w:lang w:val="pt-BR"/>
+          </w:rPr>
+          <w:t xml:space="preserve">4.3.3 </w:t>
+        </w:r>
+        <w:r>
+          <w:rPr>
+            <w:rStyle w:val="1789"/>
+            <w:lang w:val="en-US"/>
+          </w:rPr>
+          <w:t xml:space="preserve">Recursos de Software</w:t>
+        </w:r>
+        <w:r>
+          <w:rPr>
+            <w:rStyle w:val="1789"/>
+            <w:highlight w:val="none"/>
+            <w:lang w:val="en-US"/>
+          </w:rPr>
+        </w:r>
+        <w:r>
+          <w:tab/>
+        </w:r>
+        <w:r>
+          <w:fldChar w:fldCharType="begin"/>
+          <w:instrText xml:space="preserve">PAGEREF _Toc18 \h</w:instrText>
+          <w:fldChar w:fldCharType="separate"/>
+          <w:t xml:space="preserve">24</w:t>
+          <w:fldChar w:fldCharType="end"/>
+        </w:r>
+      </w:hyperlink>
+      <w:r>
+        <w:rPr>
+          <w:highlight w:val="none"/>
+        </w:rPr>
+      </w:r>
+      <w:r>
+        <w:rPr>
+          <w:highlight w:val="none"/>
+        </w:rPr>
+      </w:r>
+    </w:p>
+    <w:p>
+      <w:pPr>
+        <w:pStyle w:val="1788"/>
+        <w:pBdr/>
+        <w:tabs>
+          <w:tab w:val="right" w:leader="dot" w:pos="9072"/>
+        </w:tabs>
+        <w:spacing/>
+        <w:ind/>
+        <w:rPr/>
+      </w:pPr>
+      <w:r/>
+      <w:hyperlink w:tooltip="#_Toc19" w:anchor="_Toc19" w:history="1">
+        <w:r>
+          <w:rPr>
+            <w:rStyle w:val="1789"/>
+          </w:rPr>
+        </w:r>
+        <w:r>
+          <w:rPr>
+            <w:rStyle w:val="1789"/>
+          </w:rPr>
+          <w:t xml:space="preserve">4.3.4 Outros Recursos</w:t>
+        </w:r>
+        <w:r>
+          <w:rPr>
+            <w:rStyle w:val="1789"/>
+          </w:rPr>
+        </w:r>
+        <w:r>
+          <w:tab/>
+        </w:r>
+        <w:r>
+          <w:fldChar w:fldCharType="begin"/>
+          <w:instrText xml:space="preserve">PAGEREF _Toc19 \h</w:instrText>
+          <w:fldChar w:fldCharType="separate"/>
+          <w:t xml:space="preserve">24</w:t>
+          <w:fldChar w:fldCharType="end"/>
+        </w:r>
+      </w:hyperlink>
+      <w:r/>
+      <w:r/>
+    </w:p>
+    <w:p>
+      <w:pPr>
+        <w:pStyle w:val="1787"/>
+        <w:pBdr/>
+        <w:tabs>
+          <w:tab w:val="right" w:leader="dot" w:pos="9072"/>
+        </w:tabs>
+        <w:spacing/>
+        <w:ind/>
+        <w:rPr>
+          <w:highlight w:val="none"/>
+        </w:rPr>
+      </w:pPr>
+      <w:r/>
+      <w:hyperlink w:tooltip="#_Toc20" w:anchor="_Toc20" w:history="1">
         <w:r>
           <w:rPr>
             <w:rStyle w:val="1789"/>
@@ -2911,6 +3240,7 @@
         <w:r>
           <w:rPr>
             <w:rStyle w:val="1789"/>
+            <w:highlight w:val="none"/>
           </w:rPr>
         </w:r>
         <w:r>
@@ -2918,14 +3248,22 @@
         </w:r>
         <w:r>
           <w:fldChar w:fldCharType="begin"/>
-          <w:instrText xml:space="preserve">PAGEREF _Toc16 \h</w:instrText>
+          <w:instrText xml:space="preserve">PAGEREF _Toc20 \h</w:instrText>
           <w:fldChar w:fldCharType="separate"/>
           <w:t xml:space="preserve">24</w:t>
           <w:fldChar w:fldCharType="end"/>
         </w:r>
       </w:hyperlink>
-      <w:r/>
-      <w:r/>
+      <w:r>
+        <w:rPr>
+          <w:highlight w:val="none"/>
+        </w:rPr>
+      </w:r>
+      <w:r>
+        <w:rPr>
+          <w:highlight w:val="none"/>
+        </w:rPr>
+      </w:r>
     </w:p>
     <w:p>
       <w:pPr>
@@ -2939,7 +3277,7 @@
         <w:rPr/>
       </w:pPr>
       <w:r/>
-      <w:hyperlink w:tooltip="#_Toc17" w:anchor="_Toc17" w:history="1">
+      <w:hyperlink w:tooltip="#_Toc21" w:anchor="_Toc21" w:history="1">
         <w:r>
           <w:rPr>
             <w:rStyle w:val="1789"/>
@@ -2985,9 +3323,9 @@
         </w:r>
         <w:r>
           <w:fldChar w:fldCharType="begin"/>
-          <w:instrText xml:space="preserve">PAGEREF _Toc17 \h</w:instrText>
+          <w:instrText xml:space="preserve">PAGEREF _Toc21 \h</w:instrText>
           <w:fldChar w:fldCharType="separate"/>
-          <w:t xml:space="preserve">24</w:t>
+          <w:t xml:space="preserve">25</w:t>
           <w:fldChar w:fldCharType="end"/>
         </w:r>
       </w:hyperlink>
@@ -3006,7 +3344,7 @@
         <w:rPr/>
       </w:pPr>
       <w:r/>
-      <w:hyperlink w:tooltip="#_Toc18" w:anchor="_Toc18" w:history="1">
+      <w:hyperlink w:tooltip="#_Toc22" w:anchor="_Toc22" w:history="1">
         <w:r>
           <w:rPr>
             <w:rStyle w:val="1789"/>
@@ -3046,9 +3384,9 @@
         </w:r>
         <w:r>
           <w:fldChar w:fldCharType="begin"/>
-          <w:instrText xml:space="preserve">PAGEREF _Toc18 \h</w:instrText>
+          <w:instrText xml:space="preserve">PAGEREF _Toc22 \h</w:instrText>
           <w:fldChar w:fldCharType="separate"/>
-          <w:t xml:space="preserve">25</w:t>
+          <w:t xml:space="preserve">26</w:t>
           <w:fldChar w:fldCharType="end"/>
         </w:r>
       </w:hyperlink>
@@ -3067,7 +3405,7 @@
         <w:rPr/>
       </w:pPr>
       <w:r/>
-      <w:hyperlink w:tooltip="#_Toc19" w:anchor="_Toc19" w:history="1">
+      <w:hyperlink w:tooltip="#_Toc23" w:anchor="_Toc23" w:history="1">
         <w:r>
           <w:rPr>
             <w:rStyle w:val="1789"/>
@@ -3113,9 +3451,9 @@
         </w:r>
         <w:r>
           <w:fldChar w:fldCharType="begin"/>
-          <w:instrText xml:space="preserve">PAGEREF _Toc19 \h</w:instrText>
+          <w:instrText xml:space="preserve">PAGEREF _Toc23 \h</w:instrText>
           <w:fldChar w:fldCharType="separate"/>
-          <w:t xml:space="preserve">25</w:t>
+          <w:t xml:space="preserve">26</w:t>
           <w:fldChar w:fldCharType="end"/>
         </w:r>
       </w:hyperlink>
@@ -3134,7 +3472,7 @@
         <w:rPr/>
       </w:pPr>
       <w:r/>
-      <w:hyperlink w:tooltip="#_Toc20" w:anchor="_Toc20" w:history="1">
+      <w:hyperlink w:tooltip="#_Toc24" w:anchor="_Toc24" w:history="1">
         <w:r>
           <w:rPr>
             <w:rStyle w:val="1789"/>
@@ -3174,9 +3512,9 @@
         </w:r>
         <w:r>
           <w:fldChar w:fldCharType="begin"/>
-          <w:instrText xml:space="preserve">PAGEREF _Toc20 \h</w:instrText>
+          <w:instrText xml:space="preserve">PAGEREF _Toc24 \h</w:instrText>
           <w:fldChar w:fldCharType="separate"/>
-          <w:t xml:space="preserve">25</w:t>
+          <w:t xml:space="preserve">26</w:t>
           <w:fldChar w:fldCharType="end"/>
         </w:r>
       </w:hyperlink>
@@ -3195,7 +3533,7 @@
         <w:rPr/>
       </w:pPr>
       <w:r/>
-      <w:hyperlink w:tooltip="#_Toc21" w:anchor="_Toc21" w:history="1">
+      <w:hyperlink w:tooltip="#_Toc25" w:anchor="_Toc25" w:history="1">
         <w:r>
           <w:rPr>
             <w:rStyle w:val="1789"/>
@@ -3217,9 +3555,9 @@
         </w:r>
         <w:r>
           <w:fldChar w:fldCharType="begin"/>
-          <w:instrText xml:space="preserve">PAGEREF _Toc21 \h</w:instrText>
+          <w:instrText xml:space="preserve">PAGEREF _Toc25 \h</w:instrText>
           <w:fldChar w:fldCharType="separate"/>
-          <w:t xml:space="preserve">28</w:t>
+          <w:t xml:space="preserve">29</w:t>
           <w:fldChar w:fldCharType="end"/>
         </w:r>
       </w:hyperlink>
@@ -3228,7 +3566,7 @@
     </w:p>
     <w:p>
       <w:pPr>
-        <w:pStyle w:val="1788"/>
+        <w:pStyle w:val="1787"/>
         <w:pBdr/>
         <w:tabs>
           <w:tab w:val="right" w:leader="dot" w:pos="9072"/>
@@ -3238,66 +3576,7 @@
         <w:rPr/>
       </w:pPr>
       <w:r/>
-      <w:hyperlink w:tooltip="#_Toc22" w:anchor="_Toc22" w:history="1">
-        <w:r>
-          <w:rPr>
-            <w:rStyle w:val="1789"/>
-          </w:rPr>
-        </w:r>
-        <w:r>
-          <w:rPr>
-            <w:rStyle w:val="1789"/>
-            <w:highlight w:val="yellow"/>
-          </w:rPr>
-          <w:t xml:space="preserve">/*Complementação de requisitos não funcionais: tecnologias de programação para </w:t>
-        </w:r>
-        <w:r>
-          <w:rPr>
-            <w:rStyle w:val="1789"/>
-            <w:i/>
-            <w:highlight w:val="yellow"/>
-          </w:rPr>
-          <w:t xml:space="preserve">front-end</w:t>
-        </w:r>
-        <w:r>
-          <w:rPr>
-            <w:rStyle w:val="1789"/>
-            <w:highlight w:val="yellow"/>
-          </w:rPr>
-          <w:t xml:space="preserve"> e back-end; servidor de e-mail; sistema gerenciador de banco de dados; políticas de formação de senhas; termos de uso e privacidade. */</w:t>
-        </w:r>
-        <w:r>
-          <w:rPr>
-            <w:rStyle w:val="1789"/>
-          </w:rPr>
-        </w:r>
-        <w:r>
-          <w:tab/>
-        </w:r>
-        <w:r>
-          <w:fldChar w:fldCharType="begin"/>
-          <w:instrText xml:space="preserve">PAGEREF _Toc22 \h</w:instrText>
-          <w:fldChar w:fldCharType="separate"/>
-          <w:t xml:space="preserve">31</w:t>
-          <w:fldChar w:fldCharType="end"/>
-        </w:r>
-      </w:hyperlink>
-      <w:r/>
-      <w:r/>
-    </w:p>
-    <w:p>
-      <w:pPr>
-        <w:pStyle w:val="1787"/>
-        <w:pBdr/>
-        <w:tabs>
-          <w:tab w:val="right" w:leader="dot" w:pos="9072"/>
-        </w:tabs>
-        <w:spacing/>
-        <w:ind/>
-        <w:rPr/>
-      </w:pPr>
-      <w:r/>
-      <w:hyperlink w:tooltip="#_Toc23" w:anchor="_Toc23" w:history="1">
+      <w:hyperlink w:tooltip="#_Toc26" w:anchor="_Toc26" w:history="1">
         <w:r>
           <w:rPr>
             <w:rStyle w:val="1789"/>
@@ -3319,9 +3598,9 @@
         </w:r>
         <w:r>
           <w:fldChar w:fldCharType="begin"/>
-          <w:instrText xml:space="preserve">PAGEREF _Toc23 \h</w:instrText>
+          <w:instrText xml:space="preserve">PAGEREF _Toc26 \h</w:instrText>
           <w:fldChar w:fldCharType="separate"/>
-          <w:t xml:space="preserve">32</w:t>
+          <w:t xml:space="preserve">33</w:t>
           <w:fldChar w:fldCharType="end"/>
         </w:r>
       </w:hyperlink>
@@ -3340,7 +3619,7 @@
         <w:rPr/>
       </w:pPr>
       <w:r/>
-      <w:hyperlink w:tooltip="#_Toc24" w:anchor="_Toc24" w:history="1">
+      <w:hyperlink w:tooltip="#_Toc27" w:anchor="_Toc27" w:history="1">
         <w:r>
           <w:rPr>
             <w:rStyle w:val="1789"/>
@@ -3362,9 +3641,9 @@
         </w:r>
         <w:r>
           <w:fldChar w:fldCharType="begin"/>
-          <w:instrText xml:space="preserve">PAGEREF _Toc24 \h</w:instrText>
+          <w:instrText xml:space="preserve">PAGEREF _Toc27 \h</w:instrText>
           <w:fldChar w:fldCharType="separate"/>
-          <w:t xml:space="preserve">32</w:t>
+          <w:t xml:space="preserve">33</w:t>
           <w:fldChar w:fldCharType="end"/>
         </w:r>
       </w:hyperlink>
@@ -3383,7 +3662,7 @@
         <w:rPr/>
       </w:pPr>
       <w:r/>
-      <w:hyperlink w:tooltip="#_Toc25" w:anchor="_Toc25" w:history="1">
+      <w:hyperlink w:tooltip="#_Toc28" w:anchor="_Toc28" w:history="1">
         <w:r>
           <w:rPr>
             <w:rStyle w:val="1789"/>
@@ -3405,9 +3684,9 @@
         </w:r>
         <w:r>
           <w:fldChar w:fldCharType="begin"/>
-          <w:instrText xml:space="preserve">PAGEREF _Toc25 \h</w:instrText>
+          <w:instrText xml:space="preserve">PAGEREF _Toc28 \h</w:instrText>
           <w:fldChar w:fldCharType="separate"/>
-          <w:t xml:space="preserve">33</w:t>
+          <w:t xml:space="preserve">34</w:t>
           <w:fldChar w:fldCharType="end"/>
         </w:r>
       </w:hyperlink>
@@ -3426,7 +3705,7 @@
         <w:rPr/>
       </w:pPr>
       <w:r/>
-      <w:hyperlink w:tooltip="#_Toc26" w:anchor="_Toc26" w:history="1">
+      <w:hyperlink w:tooltip="#_Toc29" w:anchor="_Toc29" w:history="1">
         <w:r>
           <w:rPr>
             <w:rStyle w:val="1789"/>
@@ -3448,9 +3727,9 @@
         </w:r>
         <w:r>
           <w:fldChar w:fldCharType="begin"/>
-          <w:instrText xml:space="preserve">PAGEREF _Toc26 \h</w:instrText>
+          <w:instrText xml:space="preserve">PAGEREF _Toc29 \h</w:instrText>
           <w:fldChar w:fldCharType="separate"/>
-          <w:t xml:space="preserve">34</w:t>
+          <w:t xml:space="preserve">35</w:t>
           <w:fldChar w:fldCharType="end"/>
         </w:r>
       </w:hyperlink>
@@ -3469,7 +3748,7 @@
         <w:rPr/>
       </w:pPr>
       <w:r/>
-      <w:hyperlink w:tooltip="#_Toc27" w:anchor="_Toc27" w:history="1">
+      <w:hyperlink w:tooltip="#_Toc30" w:anchor="_Toc30" w:history="1">
         <w:r>
           <w:rPr>
             <w:rStyle w:val="1789"/>
@@ -3503,9 +3782,9 @@
         </w:r>
         <w:r>
           <w:fldChar w:fldCharType="begin"/>
-          <w:instrText xml:space="preserve">PAGEREF _Toc27 \h</w:instrText>
+          <w:instrText xml:space="preserve">PAGEREF _Toc30 \h</w:instrText>
           <w:fldChar w:fldCharType="separate"/>
-          <w:t xml:space="preserve">35</w:t>
+          <w:t xml:space="preserve">36</w:t>
           <w:fldChar w:fldCharType="end"/>
         </w:r>
       </w:hyperlink>
@@ -3524,7 +3803,7 @@
         <w:rPr/>
       </w:pPr>
       <w:r/>
-      <w:hyperlink w:tooltip="#_Toc28" w:anchor="_Toc28" w:history="1">
+      <w:hyperlink w:tooltip="#_Toc31" w:anchor="_Toc31" w:history="1">
         <w:r>
           <w:rPr>
             <w:rStyle w:val="1789"/>
@@ -3552,9 +3831,9 @@
         </w:r>
         <w:r>
           <w:fldChar w:fldCharType="begin"/>
-          <w:instrText xml:space="preserve">PAGEREF _Toc28 \h</w:instrText>
+          <w:instrText xml:space="preserve">PAGEREF _Toc31 \h</w:instrText>
           <w:fldChar w:fldCharType="separate"/>
-          <w:t xml:space="preserve">35</w:t>
+          <w:t xml:space="preserve">36</w:t>
           <w:fldChar w:fldCharType="end"/>
         </w:r>
       </w:hyperlink>
@@ -3573,7 +3852,7 @@
         <w:rPr/>
       </w:pPr>
       <w:r/>
-      <w:hyperlink w:tooltip="#_Toc29" w:anchor="_Toc29" w:history="1">
+      <w:hyperlink w:tooltip="#_Toc32" w:anchor="_Toc32" w:history="1">
         <w:r>
           <w:rPr>
             <w:rStyle w:val="1789"/>
@@ -3607,9 +3886,9 @@
         </w:r>
         <w:r>
           <w:fldChar w:fldCharType="begin"/>
-          <w:instrText xml:space="preserve">PAGEREF _Toc29 \h</w:instrText>
+          <w:instrText xml:space="preserve">PAGEREF _Toc32 \h</w:instrText>
           <w:fldChar w:fldCharType="separate"/>
-          <w:t xml:space="preserve">35</w:t>
+          <w:t xml:space="preserve">36</w:t>
           <w:fldChar w:fldCharType="end"/>
         </w:r>
       </w:hyperlink>
@@ -3628,7 +3907,7 @@
         <w:rPr/>
       </w:pPr>
       <w:r/>
-      <w:hyperlink w:tooltip="#_Toc30" w:anchor="_Toc30" w:history="1">
+      <w:hyperlink w:tooltip="#_Toc33" w:anchor="_Toc33" w:history="1">
         <w:r>
           <w:rPr>
             <w:rStyle w:val="1789"/>
@@ -3662,9 +3941,9 @@
         </w:r>
         <w:r>
           <w:fldChar w:fldCharType="begin"/>
-          <w:instrText xml:space="preserve">PAGEREF _Toc30 \h</w:instrText>
+          <w:instrText xml:space="preserve">PAGEREF _Toc33 \h</w:instrText>
           <w:fldChar w:fldCharType="separate"/>
-          <w:t xml:space="preserve">35</w:t>
+          <w:t xml:space="preserve">36</w:t>
           <w:fldChar w:fldCharType="end"/>
         </w:r>
       </w:hyperlink>
@@ -3683,7 +3962,7 @@
         <w:rPr/>
       </w:pPr>
       <w:r/>
-      <w:hyperlink w:tooltip="#_Toc31" w:anchor="_Toc31" w:history="1">
+      <w:hyperlink w:tooltip="#_Toc34" w:anchor="_Toc34" w:history="1">
         <w:r>
           <w:rPr>
             <w:rStyle w:val="1789"/>
@@ -3705,9 +3984,9 @@
         </w:r>
         <w:r>
           <w:fldChar w:fldCharType="begin"/>
-          <w:instrText xml:space="preserve">PAGEREF _Toc31 \h</w:instrText>
+          <w:instrText xml:space="preserve">PAGEREF _Toc34 \h</w:instrText>
           <w:fldChar w:fldCharType="separate"/>
-          <w:t xml:space="preserve">35</w:t>
+          <w:t xml:space="preserve">36</w:t>
           <w:fldChar w:fldCharType="end"/>
         </w:r>
       </w:hyperlink>
@@ -3726,7 +4005,7 @@
         <w:rPr/>
       </w:pPr>
       <w:r/>
-      <w:hyperlink w:tooltip="#_Toc32" w:anchor="_Toc32" w:history="1">
+      <w:hyperlink w:tooltip="#_Toc35" w:anchor="_Toc35" w:history="1">
         <w:r>
           <w:rPr>
             <w:rStyle w:val="1789"/>
@@ -3766,9 +4045,9 @@
         </w:r>
         <w:r>
           <w:fldChar w:fldCharType="begin"/>
-          <w:instrText xml:space="preserve">PAGEREF _Toc32 \h</w:instrText>
+          <w:instrText xml:space="preserve">PAGEREF _Toc35 \h</w:instrText>
           <w:fldChar w:fldCharType="separate"/>
-          <w:t xml:space="preserve">35</w:t>
+          <w:t xml:space="preserve">36</w:t>
           <w:fldChar w:fldCharType="end"/>
         </w:r>
       </w:hyperlink>
@@ -3787,7 +4066,7 @@
         <w:rPr/>
       </w:pPr>
       <w:r/>
-      <w:hyperlink w:tooltip="#_Toc33" w:anchor="_Toc33" w:history="1">
+      <w:hyperlink w:tooltip="#_Toc36" w:anchor="_Toc36" w:history="1">
         <w:r>
           <w:rPr>
             <w:rStyle w:val="1789"/>
@@ -3821,9 +4100,9 @@
         </w:r>
         <w:r>
           <w:fldChar w:fldCharType="begin"/>
-          <w:instrText xml:space="preserve">PAGEREF _Toc33 \h</w:instrText>
+          <w:instrText xml:space="preserve">PAGEREF _Toc36 \h</w:instrText>
           <w:fldChar w:fldCharType="separate"/>
-          <w:t xml:space="preserve">36</w:t>
+          <w:t xml:space="preserve">37</w:t>
           <w:fldChar w:fldCharType="end"/>
         </w:r>
       </w:hyperlink>
@@ -3842,7 +4121,7 @@
         <w:rPr/>
       </w:pPr>
       <w:r/>
-      <w:hyperlink w:tooltip="#_Toc34" w:anchor="_Toc34" w:history="1">
+      <w:hyperlink w:tooltip="#_Toc37" w:anchor="_Toc37" w:history="1">
         <w:r>
           <w:rPr>
             <w:rStyle w:val="1789"/>
@@ -3870,9 +4149,9 @@
         </w:r>
         <w:r>
           <w:fldChar w:fldCharType="begin"/>
-          <w:instrText xml:space="preserve">PAGEREF _Toc34 \h</w:instrText>
+          <w:instrText xml:space="preserve">PAGEREF _Toc37 \h</w:instrText>
           <w:fldChar w:fldCharType="separate"/>
-          <w:t xml:space="preserve">36</w:t>
+          <w:t xml:space="preserve">37</w:t>
           <w:fldChar w:fldCharType="end"/>
         </w:r>
       </w:hyperlink>
@@ -3891,7 +4170,7 @@
         <w:rPr/>
       </w:pPr>
       <w:r/>
-      <w:hyperlink w:tooltip="#_Toc35" w:anchor="_Toc35" w:history="1">
+      <w:hyperlink w:tooltip="#_Toc38" w:anchor="_Toc38" w:history="1">
         <w:r>
           <w:rPr>
             <w:rStyle w:val="1789"/>
@@ -3931,9 +4210,9 @@
         </w:r>
         <w:r>
           <w:fldChar w:fldCharType="begin"/>
-          <w:instrText xml:space="preserve">PAGEREF _Toc35 \h</w:instrText>
+          <w:instrText xml:space="preserve">PAGEREF _Toc38 \h</w:instrText>
           <w:fldChar w:fldCharType="separate"/>
-          <w:t xml:space="preserve">36</w:t>
+          <w:t xml:space="preserve">37</w:t>
           <w:fldChar w:fldCharType="end"/>
         </w:r>
       </w:hyperlink>
@@ -3952,7 +4231,7 @@
         <w:rPr/>
       </w:pPr>
       <w:r/>
-      <w:hyperlink w:tooltip="#_Toc36" w:anchor="_Toc36" w:history="1">
+      <w:hyperlink w:tooltip="#_Toc39" w:anchor="_Toc39" w:history="1">
         <w:r>
           <w:rPr>
             <w:rStyle w:val="1789"/>
@@ -3986,9 +4265,9 @@
         </w:r>
         <w:r>
           <w:fldChar w:fldCharType="begin"/>
-          <w:instrText xml:space="preserve">PAGEREF _Toc36 \h</w:instrText>
+          <w:instrText xml:space="preserve">PAGEREF _Toc39 \h</w:instrText>
           <w:fldChar w:fldCharType="separate"/>
-          <w:t xml:space="preserve">36</w:t>
+          <w:t xml:space="preserve">37</w:t>
           <w:fldChar w:fldCharType="end"/>
         </w:r>
       </w:hyperlink>
@@ -4007,7 +4286,7 @@
         <w:rPr/>
       </w:pPr>
       <w:r/>
-      <w:hyperlink w:tooltip="#_Toc37" w:anchor="_Toc37" w:history="1">
+      <w:hyperlink w:tooltip="#_Toc40" w:anchor="_Toc40" w:history="1">
         <w:r>
           <w:rPr>
             <w:rStyle w:val="1789"/>
@@ -4065,9 +4344,9 @@
         </w:r>
         <w:r>
           <w:fldChar w:fldCharType="begin"/>
-          <w:instrText xml:space="preserve">PAGEREF _Toc37 \h</w:instrText>
+          <w:instrText xml:space="preserve">PAGEREF _Toc40 \h</w:instrText>
           <w:fldChar w:fldCharType="separate"/>
-          <w:t xml:space="preserve">36</w:t>
+          <w:t xml:space="preserve">37</w:t>
           <w:fldChar w:fldCharType="end"/>
         </w:r>
       </w:hyperlink>
@@ -4086,7 +4365,7 @@
         <w:rPr/>
       </w:pPr>
       <w:r/>
-      <w:hyperlink w:tooltip="#_Toc38" w:anchor="_Toc38" w:history="1">
+      <w:hyperlink w:tooltip="#_Toc41" w:anchor="_Toc41" w:history="1">
         <w:r>
           <w:rPr>
             <w:rStyle w:val="1789"/>
@@ -4114,9 +4393,9 @@
         </w:r>
         <w:r>
           <w:fldChar w:fldCharType="begin"/>
-          <w:instrText xml:space="preserve">PAGEREF _Toc38 \h</w:instrText>
+          <w:instrText xml:space="preserve">PAGEREF _Toc41 \h</w:instrText>
           <w:fldChar w:fldCharType="separate"/>
-          <w:t xml:space="preserve">37</w:t>
+          <w:t xml:space="preserve">38</w:t>
           <w:fldChar w:fldCharType="end"/>
         </w:r>
       </w:hyperlink>
@@ -4135,7 +4414,7 @@
         <w:rPr/>
       </w:pPr>
       <w:r/>
-      <w:hyperlink w:tooltip="#_Toc39" w:anchor="_Toc39" w:history="1">
+      <w:hyperlink w:tooltip="#_Toc42" w:anchor="_Toc42" w:history="1">
         <w:r>
           <w:rPr>
             <w:rStyle w:val="1789"/>
@@ -4157,9 +4436,9 @@
         </w:r>
         <w:r>
           <w:fldChar w:fldCharType="begin"/>
-          <w:instrText xml:space="preserve">PAGEREF _Toc39 \h</w:instrText>
+          <w:instrText xml:space="preserve">PAGEREF _Toc42 \h</w:instrText>
           <w:fldChar w:fldCharType="separate"/>
-          <w:t xml:space="preserve">38</w:t>
+          <w:t xml:space="preserve">39</w:t>
           <w:fldChar w:fldCharType="end"/>
         </w:r>
       </w:hyperlink>
@@ -4178,7 +4457,7 @@
         <w:rPr/>
       </w:pPr>
       <w:r/>
-      <w:hyperlink w:tooltip="#_Toc40" w:anchor="_Toc40" w:history="1">
+      <w:hyperlink w:tooltip="#_Toc43" w:anchor="_Toc43" w:history="1">
         <w:r>
           <w:rPr>
             <w:rStyle w:val="1789"/>
@@ -4206,9 +4485,9 @@
         </w:r>
         <w:r>
           <w:fldChar w:fldCharType="begin"/>
-          <w:instrText xml:space="preserve">PAGEREF _Toc40 \h</w:instrText>
+          <w:instrText xml:space="preserve">PAGEREF _Toc43 \h</w:instrText>
           <w:fldChar w:fldCharType="separate"/>
-          <w:t xml:space="preserve">39</w:t>
+          <w:t xml:space="preserve">40</w:t>
           <w:fldChar w:fldCharType="end"/>
         </w:r>
       </w:hyperlink>
@@ -4227,7 +4506,7 @@
         <w:rPr/>
       </w:pPr>
       <w:r/>
-      <w:hyperlink w:tooltip="#_Toc41" w:anchor="_Toc41" w:history="1">
+      <w:hyperlink w:tooltip="#_Toc44" w:anchor="_Toc44" w:history="1">
         <w:r>
           <w:rPr>
             <w:rStyle w:val="1789"/>
@@ -4285,9 +4564,9 @@
         </w:r>
         <w:r>
           <w:fldChar w:fldCharType="begin"/>
-          <w:instrText xml:space="preserve">PAGEREF _Toc41 \h</w:instrText>
+          <w:instrText xml:space="preserve">PAGEREF _Toc44 \h</w:instrText>
           <w:fldChar w:fldCharType="separate"/>
-          <w:t xml:space="preserve">40</w:t>
+          <w:t xml:space="preserve">41</w:t>
           <w:fldChar w:fldCharType="end"/>
         </w:r>
       </w:hyperlink>
@@ -4306,7 +4585,7 @@
         <w:rPr/>
       </w:pPr>
       <w:r/>
-      <w:hyperlink w:tooltip="#_Toc42" w:anchor="_Toc42" w:history="1">
+      <w:hyperlink w:tooltip="#_Toc45" w:anchor="_Toc45" w:history="1">
         <w:r>
           <w:rPr>
             <w:rStyle w:val="1789"/>
@@ -4334,9 +4613,9 @@
         </w:r>
         <w:r>
           <w:fldChar w:fldCharType="begin"/>
-          <w:instrText xml:space="preserve">PAGEREF _Toc42 \h</w:instrText>
+          <w:instrText xml:space="preserve">PAGEREF _Toc45 \h</w:instrText>
           <w:fldChar w:fldCharType="separate"/>
-          <w:t xml:space="preserve">41</w:t>
+          <w:t xml:space="preserve">42</w:t>
           <w:fldChar w:fldCharType="end"/>
         </w:r>
       </w:hyperlink>
@@ -4355,7 +4634,7 @@
         <w:rPr/>
       </w:pPr>
       <w:r/>
-      <w:hyperlink w:tooltip="#_Toc43" w:anchor="_Toc43" w:history="1">
+      <w:hyperlink w:tooltip="#_Toc46" w:anchor="_Toc46" w:history="1">
         <w:r>
           <w:rPr>
             <w:rStyle w:val="1789"/>
@@ -4383,9 +4662,9 @@
         </w:r>
         <w:r>
           <w:fldChar w:fldCharType="begin"/>
-          <w:instrText xml:space="preserve">PAGEREF _Toc43 \h</w:instrText>
+          <w:instrText xml:space="preserve">PAGEREF _Toc46 \h</w:instrText>
           <w:fldChar w:fldCharType="separate"/>
-          <w:t xml:space="preserve">42</w:t>
+          <w:t xml:space="preserve">43</w:t>
           <w:fldChar w:fldCharType="end"/>
         </w:r>
       </w:hyperlink>
@@ -4404,7 +4683,7 @@
         <w:rPr/>
       </w:pPr>
       <w:r/>
-      <w:hyperlink w:tooltip="#_Toc44" w:anchor="_Toc44" w:history="1">
+      <w:hyperlink w:tooltip="#_Toc47" w:anchor="_Toc47" w:history="1">
         <w:r>
           <w:rPr>
             <w:rStyle w:val="1789"/>
@@ -4432,9 +4711,9 @@
         </w:r>
         <w:r>
           <w:fldChar w:fldCharType="begin"/>
-          <w:instrText xml:space="preserve">PAGEREF _Toc44 \h</w:instrText>
+          <w:instrText xml:space="preserve">PAGEREF _Toc47 \h</w:instrText>
           <w:fldChar w:fldCharType="separate"/>
-          <w:t xml:space="preserve">43</w:t>
+          <w:t xml:space="preserve">44</w:t>
           <w:fldChar w:fldCharType="end"/>
         </w:r>
       </w:hyperlink>
@@ -4453,7 +4732,7 @@
         <w:rPr/>
       </w:pPr>
       <w:r/>
-      <w:hyperlink w:tooltip="#_Toc45" w:anchor="_Toc45" w:history="1">
+      <w:hyperlink w:tooltip="#_Toc48" w:anchor="_Toc48" w:history="1">
         <w:r>
           <w:rPr>
             <w:rStyle w:val="1789"/>
@@ -4475,9 +4754,9 @@
         </w:r>
         <w:r>
           <w:fldChar w:fldCharType="begin"/>
-          <w:instrText xml:space="preserve">PAGEREF _Toc45 \h</w:instrText>
+          <w:instrText xml:space="preserve">PAGEREF _Toc48 \h</w:instrText>
           <w:fldChar w:fldCharType="separate"/>
-          <w:t xml:space="preserve">44</w:t>
+          <w:t xml:space="preserve">45</w:t>
           <w:fldChar w:fldCharType="end"/>
         </w:r>
       </w:hyperlink>
@@ -4496,7 +4775,7 @@
         <w:rPr/>
       </w:pPr>
       <w:r/>
-      <w:hyperlink w:tooltip="#_Toc46" w:anchor="_Toc46" w:history="1">
+      <w:hyperlink w:tooltip="#_Toc49" w:anchor="_Toc49" w:history="1">
         <w:r>
           <w:rPr>
             <w:rStyle w:val="1789"/>
@@ -4542,9 +4821,9 @@
         </w:r>
         <w:r>
           <w:fldChar w:fldCharType="begin"/>
-          <w:instrText xml:space="preserve">PAGEREF _Toc46 \h</w:instrText>
+          <w:instrText xml:space="preserve">PAGEREF _Toc49 \h</w:instrText>
           <w:fldChar w:fldCharType="separate"/>
-          <w:t xml:space="preserve">45</w:t>
+          <w:t xml:space="preserve">46</w:t>
           <w:fldChar w:fldCharType="end"/>
         </w:r>
       </w:hyperlink>
@@ -4563,7 +4842,7 @@
         <w:rPr/>
       </w:pPr>
       <w:r/>
-      <w:hyperlink w:tooltip="#_Toc47" w:anchor="_Toc47" w:history="1">
+      <w:hyperlink w:tooltip="#_Toc50" w:anchor="_Toc50" w:history="1">
         <w:r>
           <w:rPr>
             <w:rStyle w:val="1789"/>
@@ -4609,9 +4888,9 @@
         </w:r>
         <w:r>
           <w:fldChar w:fldCharType="begin"/>
-          <w:instrText xml:space="preserve">PAGEREF _Toc47 \h</w:instrText>
+          <w:instrText xml:space="preserve">PAGEREF _Toc50 \h</w:instrText>
           <w:fldChar w:fldCharType="separate"/>
-          <w:t xml:space="preserve">46</w:t>
+          <w:t xml:space="preserve">47</w:t>
           <w:fldChar w:fldCharType="end"/>
         </w:r>
       </w:hyperlink>
@@ -7274,6 +7553,11 @@
       <w:r>
         <w:t xml:space="preserve"> </w:t>
       </w:r>
+      <w:r>
+        <w:rPr>
+          <w:highlight w:val="none"/>
+        </w:rPr>
+      </w:r>
       <w:bookmarkEnd w:id="16"/>
       <w:r>
         <w:rPr>
@@ -7395,8 +7679,16 @@
           <w:highlight w:val="none"/>
         </w:rPr>
       </w:pPr>
+      <w:r/>
+      <w:bookmarkStart w:id="18" w:name="_Toc16"/>
       <w:r>
         <w:t xml:space="preserve">4.3.1 Recursos Humanos</w:t>
+      </w:r>
+      <w:bookmarkEnd w:id="18"/>
+      <w:r>
+        <w:rPr>
+          <w:highlight w:val="none"/>
+        </w:rPr>
       </w:r>
       <w:r>
         <w:rPr>
@@ -7494,8 +7786,7 @@
       </w:r>
       <w:r>
         <w:rPr>
-          <w:rFonts w:ascii="Times New Roman" w:hAnsi="Times New Roman" w:eastAsia="Times New Roman" w:cs="Times New Roman"/>
-          <w:sz w:val="24"/>
+          <w:highlight w:val="none"/>
         </w:rPr>
       </w:r>
       <w:r>
@@ -7527,7 +7818,9 @@
       </w:r>
       <w:r>
         <w:rPr>
-          <w:highlight w:val="none"/>
+          <w:rFonts w:ascii="Times New Roman" w:hAnsi="Times New Roman" w:eastAsia="Times New Roman" w:cs="Times New Roman"/>
+          <w:sz w:val="24"/>
+          <w:szCs w:val="24"/>
         </w:rPr>
       </w:r>
       <w:r>
@@ -7548,6 +7841,8 @@
           <w:lang w:val="en-US"/>
         </w:rPr>
       </w:pPr>
+      <w:r/>
+      <w:bookmarkStart w:id="19" w:name="_Toc17"/>
       <w:r>
         <w:rPr>
           <w:lang w:val="pt-BR"/>
@@ -7560,6 +7855,12 @@
         </w:rPr>
         <w:t xml:space="preserve">Recursos de Hardware</w:t>
       </w:r>
+      <w:r>
+        <w:rPr>
+          <w:lang w:val="en-US"/>
+        </w:rPr>
+      </w:r>
+      <w:bookmarkEnd w:id="19"/>
       <w:r>
         <w:rPr>
           <w:lang w:val="en-US"/>
@@ -7688,6 +7989,8 @@
           <w:lang w:val="en-US"/>
         </w:rPr>
       </w:pPr>
+      <w:r/>
+      <w:bookmarkStart w:id="20" w:name="_Toc18"/>
       <w:r>
         <w:rPr>
           <w:lang w:val="pt-BR"/>
@@ -7700,6 +8003,13 @@
         </w:rPr>
         <w:t xml:space="preserve">Recursos de Software</w:t>
       </w:r>
+      <w:r>
+        <w:rPr>
+          <w:highlight w:val="none"/>
+          <w:lang w:val="en-US"/>
+        </w:rPr>
+      </w:r>
+      <w:bookmarkEnd w:id="20"/>
       <w:r>
         <w:rPr>
           <w:highlight w:val="none"/>
@@ -7732,8 +8042,7 @@
       </w:r>
       <w:r>
         <w:rPr>
-          <w:rFonts w:ascii="Times New Roman" w:hAnsi="Times New Roman" w:eastAsia="Times New Roman" w:cs="Times New Roman"/>
-          <w:sz w:val="24"/>
+          <w:highlight w:val="none"/>
         </w:rPr>
       </w:r>
       <w:r>
@@ -7859,6 +8168,8 @@
         <w:ind/>
         <w:rPr/>
       </w:pPr>
+      <w:r/>
+      <w:bookmarkStart w:id="21" w:name="_Toc19"/>
       <w:r>
         <w:t xml:space="preserve">4.3.4 Outros Recursos</w:t>
       </w:r>
@@ -7868,6 +8179,8 @@
           <w:sz w:val="24"/>
         </w:rPr>
       </w:r>
+      <w:bookmarkEnd w:id="21"/>
+      <w:r/>
       <w:r/>
     </w:p>
     <w:p>
@@ -7921,7 +8234,7 @@
         </w:rPr>
       </w:pPr>
       <w:r/>
-      <w:bookmarkStart w:id="18" w:name="_Toc16"/>
+      <w:bookmarkStart w:id="22" w:name="_Toc20"/>
       <w:r>
         <w:t xml:space="preserve">4.</w:t>
       </w:r>
@@ -7934,8 +8247,12 @@
       <w:r>
         <w:t xml:space="preserve"> </w:t>
       </w:r>
-      <w:bookmarkEnd w:id="18"/>
-      <w:r/>
+      <w:bookmarkEnd w:id="22"/>
+      <w:r>
+        <w:rPr>
+          <w:highlight w:val="none"/>
+        </w:rPr>
+      </w:r>
       <w:r>
         <w:rPr>
           <w:highlight w:val="none"/>
@@ -8118,41 +8435,555 @@
         <w:pBdr/>
         <w:spacing/>
         <w:ind/>
-        <w:rPr/>
-      </w:pPr>
-      <w:r>
-        <w:t xml:space="preserve">De forma geral, a Fase 1 permitiu estabelecer uma base sólida para o desenvolvimento do sistema, garantindo organização, clareza nos objetivos e viabilidade técnica da solução proposta.</w:t>
-      </w:r>
-      <w:r/>
-    </w:p>
-    <w:p>
-      <w:pPr>
-        <w:pBdr/>
-        <w:spacing/>
-        <w:ind/>
         <w:rPr>
           <w:highlight w:val="none"/>
         </w:rPr>
       </w:pPr>
       <w:r>
+        <w:t xml:space="preserve">De forma geral, a Fase 1 permitiu estabelecer uma base sólida para o desenvolvimento do sistema, garantindo organização, clareza nos objetivos e viabilidade técnica da solução proposta.</w:t>
+      </w:r>
+      <w:r>
+        <w:rPr>
+          <w:highlight w:val="none"/>
+        </w:rPr>
+      </w:r>
+      <w:r>
+        <w:rPr>
+          <w:highlight w:val="none"/>
+        </w:rPr>
+      </w:r>
+    </w:p>
+    <w:p>
+      <w:pPr>
+        <w:pBdr/>
+        <w:spacing/>
+        <w:ind/>
+        <w:rPr>
+          <w:highlight w:val="none"/>
+        </w:rPr>
+      </w:pPr>
+      <w:r>
+        <w:rPr>
+          <w:highlight w:val="none"/>
+        </w:rPr>
+      </w:r>
+      <w:r>
+        <w:t xml:space="preserve">As evidências das atividades realizadas, incluindo os artefatos técnicos, cronogramas de execução e modelos iniciais, encontram-se detalhadas no Apêndice B – Relatório de Desempenho da Fase 1.</w:t>
+      </w:r>
+      <w:r>
+        <w:rPr>
+          <w:highlight w:val="none"/>
+        </w:rPr>
+      </w:r>
+      <w:r>
+        <w:rPr>
+          <w:highlight w:val="none"/>
+        </w:rPr>
+      </w:r>
+    </w:p>
+    <w:p>
+      <w:pPr>
+        <w:pBdr/>
+        <w:spacing/>
+        <w:ind/>
+        <w:rPr/>
+      </w:pPr>
+      <w:r>
+        <w:rPr>
+          <w:highlight w:val="none"/>
+        </w:rPr>
+      </w:r>
+      <w:r>
+        <w:rPr>
+          <w:highlight w:val="none"/>
+        </w:rPr>
+      </w:r>
+      <w:r/>
+    </w:p>
+    <w:p>
+      <w:pPr>
+        <w:pStyle w:val="1776"/>
+        <w:pBdr/>
+        <w:spacing/>
+        <w:ind/>
+        <w:rPr/>
+      </w:pPr>
+      <w:r/>
+      <w:bookmarkStart w:id="23" w:name="_Toc21"/>
+      <w:r>
+        <w:t xml:space="preserve">4.</w:t>
+      </w:r>
+      <w:r>
+        <w:t xml:space="preserve">5</w:t>
+      </w:r>
+      <w:r>
+        <w:t xml:space="preserve"> </w:t>
+      </w:r>
+      <w:r>
+        <w:t xml:space="preserve">GERENCIAMENTO </w:t>
+      </w:r>
+      <w:r>
+        <w:t xml:space="preserve">DE CONFIGURAÇÃO</w:t>
+      </w:r>
+      <w:bookmarkEnd w:id="23"/>
+      <w:r/>
+      <w:r/>
+    </w:p>
+    <w:p>
+      <w:pPr>
+        <w:pBdr/>
+        <w:spacing/>
+        <w:ind/>
+        <w:rPr/>
+      </w:pPr>
+      <w:r>
+        <w:t xml:space="preserve">Descreva </w:t>
+      </w:r>
+      <w:r>
+        <w:t xml:space="preserve">os </w:t>
+      </w:r>
+      <w:r>
+        <w:t xml:space="preserve">papéis e responsabilidades, como são feitos a identificação e o versionamento de cada artefato produzido, a organização do repositório, as ferramentas de software utilizadas para controle das versões. Coloque figura</w:t>
+      </w:r>
+      <w:r>
+        <w:t xml:space="preserve">(</w:t>
+      </w:r>
+      <w:r>
+        <w:t xml:space="preserve">s</w:t>
+      </w:r>
+      <w:r>
+        <w:t xml:space="preserve">)</w:t>
+      </w:r>
+      <w:r>
+        <w:t xml:space="preserve"> para mostrar o(s) repositório(s)</w:t>
+      </w:r>
+      <w:r>
+        <w:t xml:space="preserve"> criado</w:t>
+      </w:r>
+      <w:r>
+        <w:t xml:space="preserve">(</w:t>
+      </w:r>
+      <w:r>
+        <w:t xml:space="preserve">s</w:t>
+      </w:r>
+      <w:r>
+        <w:t xml:space="preserve">)</w:t>
+      </w:r>
+      <w:r>
+        <w:t xml:space="preserve">. </w:t>
+      </w:r>
+      <w:r/>
+    </w:p>
+    <w:p>
+      <w:pPr>
+        <w:pBdr/>
+        <w:spacing w:after="0" w:line="240" w:lineRule="auto"/>
+        <w:ind/>
+        <w:jc w:val="left"/>
+        <w:rPr/>
+      </w:pPr>
+      <w:r/>
+      <w:r/>
+    </w:p>
+    <w:p>
+      <w:pPr>
+        <w:pBdr/>
+        <w:spacing w:after="0" w:line="240" w:lineRule="auto"/>
+        <w:ind/>
+        <w:jc w:val="left"/>
+        <w:rPr/>
+      </w:pPr>
+      <w:r/>
+      <w:r/>
+    </w:p>
+    <w:p>
+      <w:pPr>
+        <w:pBdr/>
+        <w:spacing w:after="0" w:line="240" w:lineRule="auto"/>
+        <w:ind/>
+        <w:jc w:val="left"/>
+        <w:rPr/>
+      </w:pPr>
+      <w:r/>
+      <w:r/>
+    </w:p>
+    <w:p>
+      <w:pPr>
+        <w:pBdr/>
+        <w:spacing w:after="0" w:line="240" w:lineRule="auto"/>
+        <w:ind/>
+        <w:jc w:val="left"/>
+        <w:rPr/>
+      </w:pPr>
+      <w:r/>
+      <w:r/>
+    </w:p>
+    <w:p>
+      <w:pPr>
+        <w:pBdr/>
+        <w:spacing w:after="0" w:line="240" w:lineRule="auto"/>
+        <w:ind/>
+        <w:jc w:val="left"/>
+        <w:rPr/>
+      </w:pPr>
+      <w:r/>
+      <w:r/>
+    </w:p>
+    <w:p>
+      <w:pPr>
+        <w:pBdr/>
+        <w:spacing w:after="0" w:line="240" w:lineRule="auto"/>
+        <w:ind/>
+        <w:jc w:val="left"/>
+        <w:rPr/>
+      </w:pPr>
+      <w:r/>
+      <w:r/>
+    </w:p>
+    <w:p>
+      <w:pPr>
+        <w:pBdr/>
+        <w:spacing w:after="0" w:line="240" w:lineRule="auto"/>
+        <w:ind/>
+        <w:jc w:val="left"/>
+        <w:rPr/>
+      </w:pPr>
+      <w:r/>
+      <w:r/>
+    </w:p>
+    <w:p>
+      <w:pPr>
+        <w:pBdr/>
+        <w:spacing w:after="0" w:line="240" w:lineRule="auto"/>
+        <w:ind/>
+        <w:jc w:val="left"/>
+        <w:rPr/>
+      </w:pPr>
+      <w:r/>
+      <w:r/>
+    </w:p>
+    <w:p>
+      <w:pPr>
+        <w:pBdr/>
+        <w:spacing w:after="0" w:line="240" w:lineRule="auto"/>
+        <w:ind/>
+        <w:jc w:val="left"/>
+        <w:rPr/>
+      </w:pPr>
+      <w:r/>
+      <w:r/>
+    </w:p>
+    <w:p>
+      <w:pPr>
+        <w:pBdr/>
+        <w:spacing w:after="0" w:line="240" w:lineRule="auto"/>
+        <w:ind/>
+        <w:jc w:val="left"/>
+        <w:rPr/>
+      </w:pPr>
+      <w:r/>
+      <w:r/>
+    </w:p>
+    <w:p>
+      <w:pPr>
+        <w:pBdr/>
+        <w:spacing w:after="0" w:line="240" w:lineRule="auto"/>
+        <w:ind/>
+        <w:jc w:val="left"/>
+        <w:rPr/>
+      </w:pPr>
+      <w:r/>
+      <w:r/>
+    </w:p>
+    <w:p>
+      <w:pPr>
+        <w:pBdr/>
+        <w:spacing w:after="0" w:line="240" w:lineRule="auto"/>
+        <w:ind/>
+        <w:jc w:val="left"/>
+        <w:rPr/>
+      </w:pPr>
+      <w:r/>
+      <w:r/>
+    </w:p>
+    <w:p>
+      <w:pPr>
+        <w:pBdr/>
+        <w:spacing w:after="0" w:line="240" w:lineRule="auto"/>
+        <w:ind/>
+        <w:jc w:val="left"/>
+        <w:rPr/>
+      </w:pPr>
+      <w:r/>
+      <w:r/>
+    </w:p>
+    <w:p>
+      <w:pPr>
+        <w:pBdr/>
+        <w:spacing w:after="0" w:line="240" w:lineRule="auto"/>
+        <w:ind/>
+        <w:jc w:val="left"/>
+        <w:rPr/>
+      </w:pPr>
+      <w:r/>
+      <w:r/>
+    </w:p>
+    <w:p>
+      <w:pPr>
+        <w:pBdr/>
+        <w:spacing w:after="0" w:line="240" w:lineRule="auto"/>
+        <w:ind/>
+        <w:jc w:val="left"/>
+        <w:rPr/>
+      </w:pPr>
+      <w:r/>
+      <w:r/>
+    </w:p>
+    <w:p>
+      <w:pPr>
+        <w:pBdr/>
+        <w:spacing w:after="0" w:line="240" w:lineRule="auto"/>
+        <w:ind/>
+        <w:jc w:val="left"/>
+        <w:rPr/>
+      </w:pPr>
+      <w:r/>
+      <w:r/>
+    </w:p>
+    <w:p>
+      <w:pPr>
+        <w:pStyle w:val="1775"/>
+        <w:pBdr/>
+        <w:spacing/>
+        <w:ind/>
+        <w:rPr/>
+      </w:pPr>
+      <w:r/>
+      <w:bookmarkStart w:id="24" w:name="_Toc22"/>
+      <w:r>
+        <w:t xml:space="preserve">5 </w:t>
+      </w:r>
+      <w:r>
+        <w:t xml:space="preserve">ESPECIFICAÇÃO E ANÁLISE D</w:t>
+      </w:r>
+      <w:r>
+        <w:t xml:space="preserve">OS</w:t>
+      </w:r>
+      <w:r>
+        <w:t xml:space="preserve"> REQUISITOS</w:t>
+      </w:r>
+      <w:bookmarkEnd w:id="24"/>
+      <w:r/>
+      <w:r/>
+    </w:p>
+    <w:p>
+      <w:pPr>
+        <w:pBdr/>
+        <w:spacing/>
+        <w:ind/>
+        <w:rPr/>
+      </w:pPr>
+      <w:r>
+        <w:t xml:space="preserve">Este capítulo apresenta a definição e análise dos requisitos do sistema </w:t>
+      </w:r>
+      <w:r>
+        <w:t xml:space="preserve">de software </w:t>
+      </w:r>
+      <w:r>
+        <w:t xml:space="preserve">“Fala, Cidade!”, incluindo os requisitos funcionais, não funcionais, regras de negócio e a análise dos requisitos, com o objetivo de garantir clareza, consistência e viabilidade </w:t>
+      </w:r>
+      <w:r>
+        <w:t xml:space="preserve">no desenvolvimento do projeto.</w:t>
+      </w:r>
+      <w:r/>
+    </w:p>
+    <w:p>
+      <w:pPr>
+        <w:pBdr/>
+        <w:spacing/>
+        <w:ind/>
+        <w:rPr/>
+      </w:pPr>
+      <w:r/>
+      <w:r/>
+    </w:p>
+    <w:p>
+      <w:pPr>
+        <w:pStyle w:val="1776"/>
+        <w:pBdr/>
+        <w:spacing/>
+        <w:ind/>
+        <w:rPr/>
+      </w:pPr>
+      <w:r/>
+      <w:bookmarkStart w:id="25" w:name="_Toc23"/>
+      <w:r>
+        <w:t xml:space="preserve">5.</w:t>
+      </w:r>
+      <w:r>
+        <w:t xml:space="preserve">1</w:t>
+      </w:r>
+      <w:r>
+        <w:t xml:space="preserve"> REQUISITOS</w:t>
+      </w:r>
+      <w:r>
+        <w:t xml:space="preserve"> DO SISTEMA</w:t>
+      </w:r>
+      <w:r>
+        <w:t xml:space="preserve"> DE SOFTWARE</w:t>
+      </w:r>
+      <w:bookmarkEnd w:id="25"/>
+      <w:r/>
+      <w:r/>
+    </w:p>
+    <w:p>
+      <w:pPr>
+        <w:pBdr/>
+        <w:spacing/>
+        <w:ind/>
+        <w:rPr/>
+      </w:pPr>
+      <w:r>
+        <w:t xml:space="preserve">Esta seção apresenta os requisitos do sistema “Fala, Cidade!”, descrev</w:t>
+      </w:r>
+      <w:r>
+        <w:t xml:space="preserve">endo suas funcionalidades, características e restrições. Os requisitos estão organizados em funcionais, não funcionais e regras de negócio, servindo como base para o desenvolvimento do sistema e garantindo que a solução atenda às necessidades dos usuários.</w:t>
+      </w:r>
+      <w:r/>
+    </w:p>
+    <w:p>
+      <w:pPr>
+        <w:pStyle w:val="1777"/>
+        <w:pBdr/>
+        <w:spacing/>
+        <w:ind/>
+        <w:rPr/>
+      </w:pPr>
+      <w:r/>
+      <w:bookmarkStart w:id="26" w:name="_Toc24"/>
+      <w:r>
+        <w:t xml:space="preserve">5.</w:t>
+      </w:r>
+      <w:r>
+        <w:t xml:space="preserve">1</w:t>
+      </w:r>
+      <w:r>
+        <w:t xml:space="preserve">.1 Requisitos F</w:t>
+      </w:r>
+      <w:r>
+        <w:t xml:space="preserve">uncionais</w:t>
+      </w:r>
+      <w:bookmarkEnd w:id="26"/>
+      <w:r/>
+      <w:r/>
+    </w:p>
+    <w:p>
+      <w:pPr>
+        <w:pBdr/>
+        <w:spacing/>
+        <w:ind/>
+        <w:rPr/>
+      </w:pPr>
+      <w:r>
+        <w:t xml:space="preserve">RF01 – Cadastro de </w:t>
+      </w:r>
+      <w:r>
+        <w:t xml:space="preserve">u</w:t>
+      </w:r>
+      <w:r>
+        <w:t xml:space="preserve">suário</w:t>
+      </w:r>
+      <w:r/>
+    </w:p>
+    <w:p>
+      <w:pPr>
+        <w:pBdr/>
+        <w:spacing/>
+        <w:ind/>
+        <w:rPr/>
+      </w:pPr>
+      <w:r>
+        <w:t xml:space="preserve">Descrição: O sistema deve permitir que o usuário realize seu cadastro informando nome, e-mail, senha e o municipio de resid</w:t>
+      </w:r>
+      <w:r>
+        <w:t xml:space="preserve">ência</w:t>
+      </w:r>
+      <w:r>
+        <w:t xml:space="preserve">.</w:t>
+      </w:r>
+      <w:r>
         <w:rPr>
           <w:highlight w:val="yellow"/>
         </w:rPr>
-        <w:t xml:space="preserve">/* Não está na pasta. */</w:t>
-      </w:r>
-      <w:r>
+      </w:r>
+      <w:r/>
+    </w:p>
+    <w:p>
+      <w:pPr>
+        <w:pBdr/>
+        <w:spacing/>
+        <w:ind/>
+        <w:rPr/>
+      </w:pPr>
+      <w:r>
+        <w:t xml:space="preserve">Prioridade: </w:t>
+      </w:r>
+      <w:r>
+        <w:t xml:space="preserve">Essencial</w:t>
+      </w:r>
+      <w:r>
+        <w:t xml:space="preserve">.</w:t>
+      </w:r>
+      <w:r/>
+    </w:p>
+    <w:p>
+      <w:pPr>
+        <w:pBdr/>
+        <w:spacing/>
+        <w:ind/>
+        <w:rPr/>
+      </w:pPr>
+      <w:r>
+        <w:t xml:space="preserve">RF02 – </w:t>
+      </w:r>
+      <w:r>
+        <w:t xml:space="preserve">Aceite dos Termos de Uso e Privacidade</w:t>
+      </w:r>
+      <w:r/>
+    </w:p>
+    <w:p>
+      <w:pPr>
+        <w:pBdr/>
+        <w:spacing/>
+        <w:ind/>
+        <w:rPr/>
+      </w:pPr>
+      <w:r>
+        <w:t xml:space="preserve">Descrição: </w:t>
+      </w:r>
+      <w:r>
+        <w:t xml:space="preserve">O sistema deve exigir que o usuário confirme o aceite aos termos de uso e à política de privacidade (conformidade com a LGPD) antes de concluir o cadastro.</w:t>
+      </w:r>
+      <w:r/>
+    </w:p>
+    <w:p>
+      <w:pPr>
+        <w:pBdr/>
+        <w:spacing/>
+        <w:ind/>
         <w:rPr>
           <w:highlight w:val="none"/>
         </w:rPr>
-      </w:r>
-    </w:p>
-    <w:p>
-      <w:pPr>
-        <w:pBdr/>
-        <w:spacing/>
-        <w:ind/>
-        <w:rPr/>
-      </w:pPr>
+      </w:pPr>
+      <w:r>
+        <w:t xml:space="preserve">Prioridade: </w:t>
+      </w:r>
+      <w:r>
+        <w:t xml:space="preserve">Essencial</w:t>
+      </w:r>
+      <w:r>
+        <w:t xml:space="preserve">.</w:t>
+      </w:r>
       <w:r>
         <w:rPr>
           <w:highlight w:val="none"/>
@@ -8163,473 +8994,6 @@
           <w:highlight w:val="none"/>
         </w:rPr>
       </w:r>
-      <w:r/>
-    </w:p>
-    <w:p>
-      <w:pPr>
-        <w:pStyle w:val="1776"/>
-        <w:pBdr/>
-        <w:spacing/>
-        <w:ind/>
-        <w:rPr/>
-      </w:pPr>
-      <w:r/>
-      <w:bookmarkStart w:id="19" w:name="_Toc17"/>
-      <w:r>
-        <w:t xml:space="preserve">4.</w:t>
-      </w:r>
-      <w:r>
-        <w:t xml:space="preserve">5</w:t>
-      </w:r>
-      <w:r>
-        <w:t xml:space="preserve"> </w:t>
-      </w:r>
-      <w:r>
-        <w:t xml:space="preserve">GERENCIAMENTO </w:t>
-      </w:r>
-      <w:r>
-        <w:t xml:space="preserve">DE CONFIGURAÇÃO</w:t>
-      </w:r>
-      <w:bookmarkEnd w:id="19"/>
-      <w:r/>
-      <w:r/>
-    </w:p>
-    <w:p>
-      <w:pPr>
-        <w:pBdr/>
-        <w:spacing/>
-        <w:ind/>
-        <w:rPr/>
-      </w:pPr>
-      <w:r>
-        <w:t xml:space="preserve">Descreva </w:t>
-      </w:r>
-      <w:r>
-        <w:t xml:space="preserve">os </w:t>
-      </w:r>
-      <w:r>
-        <w:t xml:space="preserve">papéis e responsabilidades, como são feitos a identificação e o versionamento de cada artefato produzido, a organização do repositório, as ferramentas de software utilizadas para controle das versões. Coloque figura</w:t>
-      </w:r>
-      <w:r>
-        <w:t xml:space="preserve">(</w:t>
-      </w:r>
-      <w:r>
-        <w:t xml:space="preserve">s</w:t>
-      </w:r>
-      <w:r>
-        <w:t xml:space="preserve">)</w:t>
-      </w:r>
-      <w:r>
-        <w:t xml:space="preserve"> para mostrar o(s) repositório(s)</w:t>
-      </w:r>
-      <w:r>
-        <w:t xml:space="preserve"> criado</w:t>
-      </w:r>
-      <w:r>
-        <w:t xml:space="preserve">(</w:t>
-      </w:r>
-      <w:r>
-        <w:t xml:space="preserve">s</w:t>
-      </w:r>
-      <w:r>
-        <w:t xml:space="preserve">)</w:t>
-      </w:r>
-      <w:r>
-        <w:t xml:space="preserve">. </w:t>
-      </w:r>
-      <w:r/>
-    </w:p>
-    <w:p>
-      <w:pPr>
-        <w:pBdr/>
-        <w:spacing w:after="0" w:line="240" w:lineRule="auto"/>
-        <w:ind/>
-        <w:jc w:val="left"/>
-        <w:rPr/>
-      </w:pPr>
-      <w:r/>
-      <w:r/>
-    </w:p>
-    <w:p>
-      <w:pPr>
-        <w:pBdr/>
-        <w:spacing w:after="0" w:line="240" w:lineRule="auto"/>
-        <w:ind/>
-        <w:jc w:val="left"/>
-        <w:rPr/>
-      </w:pPr>
-      <w:r/>
-      <w:r/>
-    </w:p>
-    <w:p>
-      <w:pPr>
-        <w:pBdr/>
-        <w:spacing w:after="0" w:line="240" w:lineRule="auto"/>
-        <w:ind/>
-        <w:jc w:val="left"/>
-        <w:rPr/>
-      </w:pPr>
-      <w:r/>
-      <w:r/>
-    </w:p>
-    <w:p>
-      <w:pPr>
-        <w:pBdr/>
-        <w:spacing w:after="0" w:line="240" w:lineRule="auto"/>
-        <w:ind/>
-        <w:jc w:val="left"/>
-        <w:rPr/>
-      </w:pPr>
-      <w:r/>
-      <w:r/>
-    </w:p>
-    <w:p>
-      <w:pPr>
-        <w:pBdr/>
-        <w:spacing w:after="0" w:line="240" w:lineRule="auto"/>
-        <w:ind/>
-        <w:jc w:val="left"/>
-        <w:rPr/>
-      </w:pPr>
-      <w:r/>
-      <w:r/>
-    </w:p>
-    <w:p>
-      <w:pPr>
-        <w:pBdr/>
-        <w:spacing w:after="0" w:line="240" w:lineRule="auto"/>
-        <w:ind/>
-        <w:jc w:val="left"/>
-        <w:rPr/>
-      </w:pPr>
-      <w:r/>
-      <w:r/>
-    </w:p>
-    <w:p>
-      <w:pPr>
-        <w:pBdr/>
-        <w:spacing w:after="0" w:line="240" w:lineRule="auto"/>
-        <w:ind/>
-        <w:jc w:val="left"/>
-        <w:rPr/>
-      </w:pPr>
-      <w:r/>
-      <w:r/>
-    </w:p>
-    <w:p>
-      <w:pPr>
-        <w:pBdr/>
-        <w:spacing w:after="0" w:line="240" w:lineRule="auto"/>
-        <w:ind/>
-        <w:jc w:val="left"/>
-        <w:rPr/>
-      </w:pPr>
-      <w:r/>
-      <w:r/>
-    </w:p>
-    <w:p>
-      <w:pPr>
-        <w:pBdr/>
-        <w:spacing w:after="0" w:line="240" w:lineRule="auto"/>
-        <w:ind/>
-        <w:jc w:val="left"/>
-        <w:rPr/>
-      </w:pPr>
-      <w:r/>
-      <w:r/>
-    </w:p>
-    <w:p>
-      <w:pPr>
-        <w:pBdr/>
-        <w:spacing w:after="0" w:line="240" w:lineRule="auto"/>
-        <w:ind/>
-        <w:jc w:val="left"/>
-        <w:rPr/>
-      </w:pPr>
-      <w:r/>
-      <w:r/>
-    </w:p>
-    <w:p>
-      <w:pPr>
-        <w:pBdr/>
-        <w:spacing w:after="0" w:line="240" w:lineRule="auto"/>
-        <w:ind/>
-        <w:jc w:val="left"/>
-        <w:rPr/>
-      </w:pPr>
-      <w:r/>
-      <w:r/>
-    </w:p>
-    <w:p>
-      <w:pPr>
-        <w:pBdr/>
-        <w:spacing w:after="0" w:line="240" w:lineRule="auto"/>
-        <w:ind/>
-        <w:jc w:val="left"/>
-        <w:rPr/>
-      </w:pPr>
-      <w:r/>
-      <w:r/>
-    </w:p>
-    <w:p>
-      <w:pPr>
-        <w:pBdr/>
-        <w:spacing w:after="0" w:line="240" w:lineRule="auto"/>
-        <w:ind/>
-        <w:jc w:val="left"/>
-        <w:rPr/>
-      </w:pPr>
-      <w:r/>
-      <w:r/>
-    </w:p>
-    <w:p>
-      <w:pPr>
-        <w:pBdr/>
-        <w:spacing w:after="0" w:line="240" w:lineRule="auto"/>
-        <w:ind/>
-        <w:jc w:val="left"/>
-        <w:rPr/>
-      </w:pPr>
-      <w:r/>
-      <w:r/>
-    </w:p>
-    <w:p>
-      <w:pPr>
-        <w:pBdr/>
-        <w:spacing w:after="0" w:line="240" w:lineRule="auto"/>
-        <w:ind/>
-        <w:jc w:val="left"/>
-        <w:rPr/>
-      </w:pPr>
-      <w:r/>
-      <w:r/>
-    </w:p>
-    <w:p>
-      <w:pPr>
-        <w:pBdr/>
-        <w:spacing w:after="0" w:line="240" w:lineRule="auto"/>
-        <w:ind/>
-        <w:jc w:val="left"/>
-        <w:rPr/>
-      </w:pPr>
-      <w:r/>
-      <w:r/>
-    </w:p>
-    <w:p>
-      <w:pPr>
-        <w:pStyle w:val="1775"/>
-        <w:pBdr/>
-        <w:spacing/>
-        <w:ind/>
-        <w:rPr/>
-      </w:pPr>
-      <w:r/>
-      <w:bookmarkStart w:id="20" w:name="_Toc18"/>
-      <w:r>
-        <w:t xml:space="preserve">5 </w:t>
-      </w:r>
-      <w:r>
-        <w:t xml:space="preserve">ESPECIFICAÇÃO E ANÁLISE D</w:t>
-      </w:r>
-      <w:r>
-        <w:t xml:space="preserve">OS</w:t>
-      </w:r>
-      <w:r>
-        <w:t xml:space="preserve"> REQUISITOS</w:t>
-      </w:r>
-      <w:bookmarkEnd w:id="20"/>
-      <w:r/>
-      <w:r/>
-    </w:p>
-    <w:p>
-      <w:pPr>
-        <w:pBdr/>
-        <w:spacing/>
-        <w:ind/>
-        <w:rPr/>
-      </w:pPr>
-      <w:r>
-        <w:t xml:space="preserve">Este capítulo apresenta a definição e análise dos requisitos do sistema </w:t>
-      </w:r>
-      <w:r>
-        <w:t xml:space="preserve">de software </w:t>
-      </w:r>
-      <w:r>
-        <w:t xml:space="preserve">“Fala, Cidade!”, incluindo os requisitos funcionais, não funcionais, regras de negócio e a análise dos requisitos, com o objetivo de garantir clareza, consistência e viabilidade </w:t>
-      </w:r>
-      <w:r>
-        <w:t xml:space="preserve">no desenvolvimento do projeto.</w:t>
-      </w:r>
-      <w:r/>
-    </w:p>
-    <w:p>
-      <w:pPr>
-        <w:pBdr/>
-        <w:spacing/>
-        <w:ind/>
-        <w:rPr/>
-      </w:pPr>
-      <w:r/>
-      <w:r/>
-    </w:p>
-    <w:p>
-      <w:pPr>
-        <w:pStyle w:val="1776"/>
-        <w:pBdr/>
-        <w:spacing/>
-        <w:ind/>
-        <w:rPr/>
-      </w:pPr>
-      <w:r/>
-      <w:bookmarkStart w:id="21" w:name="_Toc19"/>
-      <w:r>
-        <w:t xml:space="preserve">5.</w:t>
-      </w:r>
-      <w:r>
-        <w:t xml:space="preserve">1</w:t>
-      </w:r>
-      <w:r>
-        <w:t xml:space="preserve"> REQUISITOS</w:t>
-      </w:r>
-      <w:r>
-        <w:t xml:space="preserve"> DO SISTEMA</w:t>
-      </w:r>
-      <w:r>
-        <w:t xml:space="preserve"> DE SOFTWARE</w:t>
-      </w:r>
-      <w:bookmarkEnd w:id="21"/>
-      <w:r/>
-      <w:r/>
-    </w:p>
-    <w:p>
-      <w:pPr>
-        <w:pBdr/>
-        <w:spacing/>
-        <w:ind/>
-        <w:rPr/>
-      </w:pPr>
-      <w:r>
-        <w:t xml:space="preserve">Esta seção apresenta os requisitos do sistema “Fala, Cidade!”, descrev</w:t>
-      </w:r>
-      <w:r>
-        <w:t xml:space="preserve">endo suas funcionalidades, características e restrições. Os requisitos estão organizados em funcionais, não funcionais e regras de negócio, servindo como base para o desenvolvimento do sistema e garantindo que a solução atenda às necessidades dos usuários.</w:t>
-      </w:r>
-      <w:r/>
-    </w:p>
-    <w:p>
-      <w:pPr>
-        <w:pStyle w:val="1777"/>
-        <w:pBdr/>
-        <w:spacing/>
-        <w:ind/>
-        <w:rPr/>
-      </w:pPr>
-      <w:r/>
-      <w:bookmarkStart w:id="22" w:name="_Toc20"/>
-      <w:r>
-        <w:t xml:space="preserve">5.</w:t>
-      </w:r>
-      <w:r>
-        <w:t xml:space="preserve">1</w:t>
-      </w:r>
-      <w:r>
-        <w:t xml:space="preserve">.1 Requisitos F</w:t>
-      </w:r>
-      <w:r>
-        <w:t xml:space="preserve">uncionais</w:t>
-      </w:r>
-      <w:bookmarkEnd w:id="22"/>
-      <w:r/>
-      <w:r/>
-    </w:p>
-    <w:p>
-      <w:pPr>
-        <w:pBdr/>
-        <w:spacing/>
-        <w:ind/>
-        <w:rPr/>
-      </w:pPr>
-      <w:r>
-        <w:t xml:space="preserve">RF01 – Cadastro de </w:t>
-      </w:r>
-      <w:r>
-        <w:t xml:space="preserve">u</w:t>
-      </w:r>
-      <w:r>
-        <w:t xml:space="preserve">suário</w:t>
-      </w:r>
-      <w:r/>
-    </w:p>
-    <w:p>
-      <w:pPr>
-        <w:pBdr/>
-        <w:spacing/>
-        <w:ind/>
-        <w:rPr/>
-      </w:pPr>
-      <w:r>
-        <w:t xml:space="preserve">Descrição: O sistema deve permitir que o usuário realize seu cadastro informando nome, e-mail, senha e o municipio de resid</w:t>
-      </w:r>
-      <w:r>
-        <w:t xml:space="preserve">ência</w:t>
-      </w:r>
-      <w:r>
-        <w:t xml:space="preserve">.</w:t>
-      </w:r>
-      <w:r>
-        <w:rPr>
-          <w:highlight w:val="yellow"/>
-        </w:rPr>
-      </w:r>
-      <w:r/>
-    </w:p>
-    <w:p>
-      <w:pPr>
-        <w:pBdr/>
-        <w:spacing/>
-        <w:ind/>
-        <w:rPr/>
-      </w:pPr>
-      <w:r>
-        <w:t xml:space="preserve">Prioridade: </w:t>
-      </w:r>
-      <w:r>
-        <w:t xml:space="preserve">Essencial</w:t>
-      </w:r>
-      <w:r>
-        <w:t xml:space="preserve">.</w:t>
-      </w:r>
-      <w:r/>
-    </w:p>
-    <w:p>
-      <w:pPr>
-        <w:pBdr/>
-        <w:spacing/>
-        <w:ind/>
-        <w:rPr/>
-      </w:pPr>
-      <w:r>
-        <w:t xml:space="preserve">RF02 – </w:t>
-      </w:r>
-      <w:r>
-        <w:t xml:space="preserve">Aceite dos Termos de Uso e Privacidade</w:t>
-      </w:r>
-      <w:r/>
-    </w:p>
-    <w:p>
-      <w:pPr>
-        <w:pBdr/>
-        <w:spacing/>
-        <w:ind/>
-        <w:rPr/>
-      </w:pPr>
-      <w:r>
-        <w:t xml:space="preserve">Descrição: </w:t>
-      </w:r>
-      <w:r>
-        <w:t xml:space="preserve">O sistema deve exigir que o usuário confirme o aceite aos termos de uso e à política de privacidade (conformidade com a LGPD) antes de concluir o cadastro.</w:t>
-      </w:r>
-      <w:r/>
     </w:p>
     <w:p>
       <w:pPr>
@@ -8641,39 +9005,15 @@
         </w:rPr>
       </w:pPr>
       <w:r>
-        <w:t xml:space="preserve">Prioridade: </w:t>
-      </w:r>
-      <w:r>
-        <w:t xml:space="preserve">Essencial</w:t>
-      </w:r>
-      <w:r>
-        <w:t xml:space="preserve">.</w:t>
+        <w:t xml:space="preserve">RF03 –</w:t>
+      </w:r>
+      <w:r>
+        <w:t xml:space="preserve"> Gestão de Conta do Usuário</w:t>
       </w:r>
       <w:r>
         <w:rPr>
           <w:highlight w:val="none"/>
         </w:rPr>
-      </w:r>
-      <w:r>
-        <w:rPr>
-          <w:highlight w:val="none"/>
-        </w:rPr>
-      </w:r>
-    </w:p>
-    <w:p>
-      <w:pPr>
-        <w:pBdr/>
-        <w:spacing/>
-        <w:ind/>
-        <w:rPr>
-          <w:highlight w:val="none"/>
-        </w:rPr>
-      </w:pPr>
-      <w:r>
-        <w:t xml:space="preserve">RF03 –</w:t>
-      </w:r>
-      <w:r>
-        <w:t xml:space="preserve"> Gestão de Conta do Usuário</w:t>
       </w:r>
       <w:r>
         <w:rPr>
@@ -9245,16 +9585,6 @@
     </w:p>
     <w:p>
       <w:pPr>
-        <w:pBdr/>
-        <w:spacing/>
-        <w:ind/>
-        <w:rPr/>
-      </w:pPr>
-      <w:r/>
-      <w:r/>
-    </w:p>
-    <w:p>
-      <w:pPr>
         <w:pStyle w:val="1777"/>
         <w:pBdr/>
         <w:spacing/>
@@ -9262,11 +9592,11 @@
         <w:rPr/>
       </w:pPr>
       <w:r/>
-      <w:bookmarkStart w:id="23" w:name="_Toc21"/>
+      <w:bookmarkStart w:id="27" w:name="_Toc25"/>
       <w:r>
         <w:t xml:space="preserve">5.1.2 Requisitos não funcionais</w:t>
       </w:r>
-      <w:bookmarkEnd w:id="23"/>
+      <w:bookmarkEnd w:id="27"/>
       <w:r/>
       <w:r/>
     </w:p>
@@ -9497,6 +9827,26 @@
         <w:ind/>
         <w:rPr/>
       </w:pPr>
+      <w:r/>
+      <w:r/>
+    </w:p>
+    <w:p>
+      <w:pPr>
+        <w:pBdr/>
+        <w:spacing/>
+        <w:ind/>
+        <w:rPr/>
+      </w:pPr>
+      <w:r/>
+      <w:r/>
+    </w:p>
+    <w:p>
+      <w:pPr>
+        <w:pBdr/>
+        <w:spacing/>
+        <w:ind/>
+        <w:rPr/>
+      </w:pPr>
       <w:r>
         <w:t xml:space="preserve">c) Requisitos de Usabilidade</w:t>
       </w:r>
@@ -9637,71 +9987,63 @@
           <w:highlight w:val="none"/>
         </w:rPr>
       </w:r>
-    </w:p>
-    <w:p>
-      <w:pPr>
-        <w:pBdr/>
-        <w:spacing/>
-        <w:ind/>
-        <w:rPr/>
-      </w:pPr>
-      <w:r>
-        <w:t xml:space="preserve">Descrição: </w:t>
-      </w:r>
-      <w:r>
-        <w:t xml:space="preserve">O backend deve ser implementado seguindo o padrão RESTful em Java, garantindo a escalabilidade e a fácil integração com serviços de mapas.</w:t>
-      </w:r>
-      <w:r/>
-    </w:p>
-    <w:p>
-      <w:pPr>
-        <w:pBdr/>
-        <w:spacing/>
-        <w:ind/>
-        <w:rPr/>
-      </w:pPr>
-      <w:r>
-        <w:t xml:space="preserve">RNF09 – Documentação do Sistema</w:t>
-      </w:r>
-      <w:r/>
-    </w:p>
-    <w:p>
-      <w:pPr>
-        <w:pBdr/>
-        <w:spacing/>
-        <w:ind/>
+      <w:r>
         <w:rPr>
           <w:highlight w:val="none"/>
         </w:rPr>
+      </w:r>
+    </w:p>
+    <w:p>
+      <w:pPr>
+        <w:pBdr/>
+        <w:spacing/>
+        <w:ind/>
+        <w:rPr/>
       </w:pPr>
       <w:r>
         <w:t xml:space="preserve">Descrição: </w:t>
       </w:r>
       <w:r>
-        <w:t xml:space="preserve">o</w:t>
-      </w:r>
-      <w:r>
-        <w:t xml:space="preserve"> sistema deve</w:t>
-      </w:r>
-      <w:r>
-        <w:t xml:space="preserve">rá</w:t>
-      </w:r>
-      <w:r>
-        <w:t xml:space="preserve"> possuir documentação técnica e funcional atualizada.</w:t>
-      </w:r>
-      <w:r>
+        <w:t xml:space="preserve">O backend deve ser implementado seguindo o padrão RESTful em Java, garantindo a escalabilidade e a fácil integração com serviços de mapas.</w:t>
+      </w:r>
+      <w:r/>
+    </w:p>
+    <w:p>
+      <w:pPr>
+        <w:pBdr/>
+        <w:spacing/>
+        <w:ind/>
+        <w:rPr/>
+      </w:pPr>
+      <w:r>
+        <w:t xml:space="preserve">RNF09 – Documentação do Sistema</w:t>
+      </w:r>
+      <w:r/>
+    </w:p>
+    <w:p>
+      <w:pPr>
+        <w:pBdr/>
+        <w:spacing/>
+        <w:ind/>
         <w:rPr>
           <w:highlight w:val="none"/>
         </w:rPr>
-      </w:r>
-    </w:p>
-    <w:p>
-      <w:pPr>
-        <w:pBdr/>
-        <w:spacing/>
-        <w:ind/>
-        <w:rPr/>
-      </w:pPr>
+      </w:pPr>
+      <w:r>
+        <w:t xml:space="preserve">Descrição: </w:t>
+      </w:r>
+      <w:r>
+        <w:t xml:space="preserve">o</w:t>
+      </w:r>
+      <w:r>
+        <w:t xml:space="preserve"> sistema deve</w:t>
+      </w:r>
+      <w:r>
+        <w:t xml:space="preserve">rá</w:t>
+      </w:r>
+      <w:r>
+        <w:t xml:space="preserve"> possuir documentação técnica e funcional atualizada.</w:t>
+      </w:r>
       <w:r>
         <w:rPr>
           <w:highlight w:val="none"/>
@@ -9712,6 +10054,24 @@
           <w:highlight w:val="none"/>
         </w:rPr>
       </w:r>
+    </w:p>
+    <w:p>
+      <w:pPr>
+        <w:pBdr/>
+        <w:spacing/>
+        <w:ind/>
+        <w:rPr/>
+      </w:pPr>
+      <w:r>
+        <w:rPr>
+          <w:highlight w:val="none"/>
+        </w:rPr>
+      </w:r>
+      <w:r>
+        <w:rPr>
+          <w:highlight w:val="none"/>
+        </w:rPr>
+      </w:r>
       <w:r/>
     </w:p>
     <w:p>
@@ -9997,115 +10357,96 @@
           <w:highlight w:val="none"/>
         </w:rPr>
       </w:r>
-    </w:p>
-    <w:p>
-      <w:pPr>
-        <w:pBdr/>
-        <w:spacing/>
-        <w:ind/>
-        <w:rPr/>
-      </w:pPr>
-      <w:r/>
-      <w:r/>
-    </w:p>
-    <w:p>
-      <w:pPr>
-        <w:pBdr/>
-        <w:spacing/>
-        <w:ind/>
-        <w:rPr/>
-      </w:pPr>
       <w:r>
         <w:rPr>
           <w:highlight w:val="none"/>
         </w:rPr>
       </w:r>
-      <w:r>
+    </w:p>
+    <w:p>
+      <w:pPr>
+        <w:pBdr/>
+        <w:spacing/>
+        <w:ind/>
+        <w:rPr/>
+      </w:pPr>
+      <w:r>
+        <w:t xml:space="preserve">b) Requisitos de Privacidade e </w:t>
+      </w:r>
+      <w:r>
+        <w:t xml:space="preserve">Tecnologias de Implementação</w:t>
+      </w:r>
+      <w:r/>
+    </w:p>
+    <w:p>
+      <w:pPr>
+        <w:pBdr/>
+        <w:spacing/>
+        <w:ind/>
+        <w:rPr/>
+      </w:pPr>
+      <w:r>
+        <w:t xml:space="preserve">RNF16 – Conformidade com LGPD </w:t>
+      </w:r>
+      <w:r>
+        <w:t xml:space="preserve">e Políticas de Acesso</w:t>
+      </w:r>
+      <w:r/>
+    </w:p>
+    <w:p>
+      <w:pPr>
+        <w:pBdr/>
+        <w:spacing/>
+        <w:ind/>
+        <w:rPr/>
+      </w:pPr>
+      <w:r>
+        <w:t xml:space="preserve">Descrição: </w:t>
+      </w:r>
+      <w:r>
+        <w:t xml:space="preserve">O sistema deve implementar Termos de Uso e Políticas de Privacidade aceitos obrigatoriamente no cadastro. As senhas devem seguir uma política de complexidade mínima (mínimo de 8 caracteres, incluindo letras e números).</w:t>
+      </w:r>
+      <w:r/>
+    </w:p>
+    <w:p>
+      <w:pPr>
+        <w:pBdr/>
+        <w:spacing/>
+        <w:ind/>
+        <w:rPr/>
+      </w:pPr>
+      <w:r>
+        <w:t xml:space="preserve">RNF17 – </w:t>
+      </w:r>
+      <w:r>
+        <w:t xml:space="preserve">Tecnologias de Desenvolvimento</w:t>
+      </w:r>
+      <w:r>
+        <w:rPr>
+          <w:highlight w:val="yellow"/>
+        </w:rPr>
+      </w:r>
+      <w:r/>
+    </w:p>
+    <w:p>
+      <w:pPr>
+        <w:pBdr/>
+        <w:spacing/>
+        <w:ind/>
         <w:rPr>
           <w:highlight w:val="none"/>
         </w:rPr>
-      </w:r>
-      <w:r/>
-    </w:p>
-    <w:p>
-      <w:pPr>
-        <w:pBdr/>
-        <w:spacing/>
-        <w:ind/>
-        <w:rPr/>
-      </w:pPr>
-      <w:r>
-        <w:t xml:space="preserve">b) Requisitos de Privacidade e </w:t>
-      </w:r>
-      <w:r>
-        <w:t xml:space="preserve">Tecnologias de Implementação</w:t>
-      </w:r>
-      <w:r/>
-    </w:p>
-    <w:p>
-      <w:pPr>
-        <w:pBdr/>
-        <w:spacing/>
-        <w:ind/>
-        <w:rPr/>
-      </w:pPr>
-      <w:r>
-        <w:t xml:space="preserve">RNF16 – Conformidade com LGPD </w:t>
-      </w:r>
-      <w:r>
-        <w:t xml:space="preserve">e Políticas de Acesso</w:t>
-      </w:r>
-      <w:r/>
-    </w:p>
-    <w:p>
-      <w:pPr>
-        <w:pBdr/>
-        <w:spacing/>
-        <w:ind/>
-        <w:rPr/>
-      </w:pPr>
-      <w:r>
-        <w:t xml:space="preserve">Descrição: </w:t>
-      </w:r>
-      <w:r>
-        <w:t xml:space="preserve">O sistema deve implementar Termos de Uso e Políticas de Privacidade aceitos obrigatoriamente no cadastro. As senhas devem seguir uma política de complexidade mínima (mínimo de 8 caracteres, incluindo letras e números).</w:t>
-      </w:r>
-      <w:r/>
-    </w:p>
-    <w:p>
-      <w:pPr>
-        <w:pBdr/>
-        <w:spacing/>
-        <w:ind/>
-        <w:rPr/>
-      </w:pPr>
-      <w:r>
-        <w:t xml:space="preserve">RNF17 – </w:t>
-      </w:r>
-      <w:r>
-        <w:t xml:space="preserve">Tecnologias de Desenvolvimento</w:t>
-      </w:r>
-      <w:r>
-        <w:rPr>
-          <w:highlight w:val="yellow"/>
-        </w:rPr>
-      </w:r>
-      <w:r/>
-    </w:p>
-    <w:p>
-      <w:pPr>
-        <w:pBdr/>
-        <w:spacing/>
-        <w:ind/>
+      </w:pPr>
+      <w:r>
+        <w:t xml:space="preserve">Descrição:</w:t>
+      </w:r>
+      <w:r>
+        <w:t xml:space="preserve"> O backend será desenvolvido em Java 21 com Spring Boot; o frontend utilizará o framework Angular 21; para a persistência, será utilizado o Sistema Gerenciador de Banco de Dados (SGBD) PostgreSQL 18.</w:t>
+      </w:r>
+      <w:r>
         <w:rPr>
           <w:highlight w:val="none"/>
         </w:rPr>
-      </w:pPr>
-      <w:r>
-        <w:t xml:space="preserve">Descrição:</w:t>
-      </w:r>
-      <w:r>
-        <w:t xml:space="preserve"> O backend será desenvolvido em Java 21 com Spring Boot; o frontend utilizará o framework Angular 21; para a persistência, será utilizado o Sistema Gerenciador de Banco de Dados (SGBD) PostgreSQL 18.</w:t>
       </w:r>
       <w:r>
         <w:rPr>
@@ -10145,6 +10486,11 @@
       </w:r>
       <w:r>
         <w:t xml:space="preserve">Para o envio de e-mails de recuperação de senha e confirmação de cadastro, o sistema integrará um servidor SMTP (como Gmail SMTP ou SendGrid).</w:t>
+      </w:r>
+      <w:r>
+        <w:rPr>
+          <w:highlight w:val="none"/>
+        </w:rPr>
       </w:r>
       <w:r>
         <w:rPr>
@@ -10504,11 +10850,11 @@
         <w:rPr/>
       </w:pPr>
       <w:r/>
-      <w:bookmarkStart w:id="25" w:name="_Toc23"/>
+      <w:bookmarkStart w:id="28" w:name="_Toc26"/>
       <w:r>
         <w:t xml:space="preserve">5.2 ANÁLISE DOS REQUISITOS</w:t>
       </w:r>
-      <w:bookmarkEnd w:id="25"/>
+      <w:bookmarkEnd w:id="28"/>
       <w:r/>
       <w:r/>
     </w:p>
@@ -10521,11 +10867,11 @@
         <w:rPr/>
       </w:pPr>
       <w:r/>
-      <w:bookmarkStart w:id="26" w:name="_Toc24"/>
+      <w:bookmarkStart w:id="29" w:name="_Toc27"/>
       <w:r>
         <w:t xml:space="preserve">5.2.1 Visão Funcional</w:t>
       </w:r>
-      <w:bookmarkEnd w:id="26"/>
+      <w:bookmarkEnd w:id="29"/>
       <w:r/>
       <w:r/>
     </w:p>
@@ -10589,11 +10935,11 @@
         <w:rPr/>
       </w:pPr>
       <w:r/>
-      <w:bookmarkStart w:id="27" w:name="_Toc25"/>
+      <w:bookmarkStart w:id="30" w:name="_Toc28"/>
       <w:r>
         <w:t xml:space="preserve">5.2.2 Modelo Conceitual dos Dados</w:t>
       </w:r>
-      <w:bookmarkEnd w:id="27"/>
+      <w:bookmarkEnd w:id="30"/>
       <w:r/>
       <w:r/>
     </w:p>
@@ -10619,8 +10965,7 @@
       </w:r>
       <w:r>
         <w:rPr>
-          <w:rFonts w:ascii="Times New Roman" w:hAnsi="Times New Roman" w:eastAsia="Times New Roman" w:cs="Times New Roman"/>
-          <w:sz w:val="24"/>
+          <w:highlight w:val="none"/>
         </w:rPr>
       </w:r>
       <w:r>
@@ -10628,21 +10973,6 @@
           <w:highlight w:val="none"/>
         </w:rPr>
       </w:r>
-      <w:r>
-        <w:rPr>
-          <w:highlight w:val="none"/>
-        </w:rPr>
-      </w:r>
-      <w:r>
-        <w:rPr>
-          <w:highlight w:val="none"/>
-        </w:rPr>
-      </w:r>
-      <w:r>
-        <w:rPr>
-          <w:highlight w:val="none"/>
-        </w:rPr>
-      </w:r>
     </w:p>
     <w:p>
       <w:pPr>
@@ -10663,7 +10993,6 @@
         <w:ind/>
         <w:rPr/>
       </w:pPr>
-      <w:r/>
       <w:r>
         <w:t xml:space="preserve">Hierarquia de Usuários: A entidade central </w:t>
       </w:r>
@@ -10711,16 +11040,14 @@
         <w:t xml:space="preserve">ficos, como o endereço de residência para o cidadão e o vínculo com secretarias para o funcionário.</w:t>
       </w:r>
       <w:r/>
-      <w:r/>
-    </w:p>
-    <w:p>
-      <w:pPr>
-        <w:pBdr/>
-        <w:spacing/>
-        <w:ind/>
-        <w:rPr/>
-      </w:pPr>
-      <w:r/>
+    </w:p>
+    <w:p>
+      <w:pPr>
+        <w:pBdr/>
+        <w:spacing/>
+        <w:ind/>
+        <w:rPr/>
+      </w:pPr>
       <w:r>
         <w:t xml:space="preserve">Gestão de Notificações: A entidade </w:t>
       </w:r>
@@ -10755,16 +11082,14 @@
         <w:t xml:space="preserve">, que gerencia os anexos fotográficos enviados.</w:t>
       </w:r>
       <w:r/>
-      <w:r/>
-    </w:p>
-    <w:p>
-      <w:pPr>
-        <w:pBdr/>
-        <w:spacing/>
-        <w:ind/>
-        <w:rPr/>
-      </w:pPr>
-      <w:r/>
+    </w:p>
+    <w:p>
+      <w:pPr>
+        <w:pBdr/>
+        <w:spacing/>
+        <w:ind/>
+        <w:rPr/>
+      </w:pPr>
       <w:r>
         <w:t xml:space="preserve">Geolocalização e Territorialidade: O relacionamento com a entidade </w:t>
       </w:r>
@@ -10789,7 +11114,6 @@
         <w:t xml:space="preserve">regionalizados para a administração pública.</w:t>
       </w:r>
       <w:r/>
-      <w:r/>
     </w:p>
     <w:p>
       <w:pPr>
@@ -10825,7 +11149,6 @@
         <w:t xml:space="preserve">, assegurando que cada demanda seja encaminhada ao setor competente para resolução.</w:t>
       </w:r>
       <w:r/>
-      <w:r/>
     </w:p>
     <w:p>
       <w:pPr>
@@ -10836,19 +11159,9 @@
           <w:highlight w:val="none"/>
         </w:rPr>
       </w:pPr>
-      <w:r/>
       <w:r>
         <w:t xml:space="preserve">O Diagrama Entidade-Relacionamento (DER) completo e o respectivo Dicionário de Dados detalhando tipos, tamanhos e restrições de cada campo encontram-se no Apêndice D – Visão dos Dados</w:t>
       </w:r>
-      <w:r/>
-    </w:p>
-    <w:p>
-      <w:pPr>
-        <w:pBdr/>
-        <w:spacing/>
-        <w:ind/>
-        <w:rPr/>
-      </w:pPr>
       <w:r>
         <w:rPr>
           <w:highlight w:val="none"/>
@@ -10859,11 +11172,25 @@
           <w:highlight w:val="none"/>
         </w:rPr>
       </w:r>
+    </w:p>
+    <w:p>
+      <w:pPr>
+        <w:pBdr/>
+        <w:spacing/>
+        <w:ind/>
+        <w:rPr/>
+      </w:pPr>
       <w:r>
         <w:rPr>
           <w:highlight w:val="none"/>
         </w:rPr>
       </w:r>
+      <w:r>
+        <w:rPr>
+          <w:highlight w:val="none"/>
+        </w:rPr>
+      </w:r>
+      <w:r/>
     </w:p>
     <w:p>
       <w:pPr>
@@ -10874,11 +11201,11 @@
         <w:rPr/>
       </w:pPr>
       <w:r/>
-      <w:bookmarkStart w:id="28" w:name="_Toc26"/>
+      <w:bookmarkStart w:id="31" w:name="_Toc29"/>
       <w:r>
         <w:t xml:space="preserve">5.2.3 Modelo Inicial da Interface de Usuário</w:t>
       </w:r>
-      <w:bookmarkEnd w:id="28"/>
+      <w:bookmarkEnd w:id="31"/>
       <w:r/>
       <w:r/>
     </w:p>
@@ -10900,15 +11227,13 @@
       <w:r>
         <w:t xml:space="preserve">o sistema, incluindo:</w:t>
       </w:r>
-      <w:r/>
-      <w:r/>
-      <w:r/>
       <w:r>
         <w:rPr>
           <w:rFonts w:ascii="Times New Roman" w:hAnsi="Times New Roman" w:eastAsia="Times New Roman" w:cs="Times New Roman"/>
           <w:sz w:val="24"/>
         </w:rPr>
       </w:r>
+      <w:r/>
     </w:p>
     <w:p>
       <w:pPr>
@@ -10924,58 +11249,50 @@
         <w:t xml:space="preserve">áginas de Autenticação e Cadastro: interfaces simplificadas que incorporam o aceite aos termos de uso e privacidade (LGPD);</w:t>
       </w:r>
       <w:r/>
-      <w:r/>
-    </w:p>
-    <w:p>
-      <w:pPr>
-        <w:pBdr/>
-        <w:spacing/>
-        <w:ind/>
-        <w:rPr/>
-      </w:pPr>
-      <w:r/>
+    </w:p>
+    <w:p>
+      <w:pPr>
+        <w:pBdr/>
+        <w:spacing/>
+        <w:ind/>
+        <w:rPr/>
+      </w:pPr>
       <w:r>
         <w:t xml:space="preserve">Fluxo de Registro de Ocorrência: formulário dinâmico com suporte a anexos e integração visual com mapas para geolocalização;</w:t>
       </w:r>
       <w:r/>
-      <w:r/>
-    </w:p>
-    <w:p>
-      <w:pPr>
-        <w:pBdr/>
-        <w:spacing/>
-        <w:ind/>
-        <w:rPr/>
-      </w:pPr>
-      <w:r/>
+    </w:p>
+    <w:p>
+      <w:pPr>
+        <w:pBdr/>
+        <w:spacing/>
+        <w:ind/>
+        <w:rPr/>
+      </w:pPr>
       <w:r>
         <w:t xml:space="preserve">Área do Cidadão: painel para acompanhamento de protocolos e histórico de notificações;</w:t>
       </w:r>
       <w:r/>
-      <w:r/>
-    </w:p>
-    <w:p>
-      <w:pPr>
-        <w:pBdr/>
-        <w:spacing/>
-        <w:ind/>
-        <w:rPr/>
-      </w:pPr>
-      <w:r/>
+    </w:p>
+    <w:p>
+      <w:pPr>
+        <w:pBdr/>
+        <w:spacing/>
+        <w:ind/>
+        <w:rPr/>
+      </w:pPr>
       <w:r>
         <w:t xml:space="preserve">Painel Administrativo (Dashboard): visualização analítica destinada aos perfis de Funcionário e Administrador para gestão de demandas.</w:t>
       </w:r>
       <w:r/>
-      <w:r/>
-    </w:p>
-    <w:p>
-      <w:pPr>
-        <w:pBdr/>
-        <w:spacing/>
-        <w:ind/>
-        <w:rPr/>
-      </w:pPr>
-      <w:r/>
+    </w:p>
+    <w:p>
+      <w:pPr>
+        <w:pBdr/>
+        <w:spacing/>
+        <w:ind/>
+        <w:rPr/>
+      </w:pPr>
       <w:r>
         <w:t xml:space="preserve">Os protótipos de baixa  fidelidade, simulando elementos g</w:t>
       </w:r>
@@ -10989,111 +11306,410 @@
         <w:t xml:space="preserve">no Apêndice E – Modelo Inicial da Interface de Usuário.</w:t>
       </w:r>
       <w:r/>
-      <w:r/>
-    </w:p>
-    <w:p>
-      <w:pPr>
-        <w:pBdr/>
-        <w:spacing/>
-        <w:ind/>
-        <w:rPr/>
-      </w:pPr>
-      <w:r>
-        <w:rPr>
-          <w:highlight w:val="yellow"/>
-        </w:rPr>
-        <w:t xml:space="preserve">Não </w:t>
-      </w:r>
-      <w:r>
-        <w:rPr>
-          <w:highlight w:val="yellow"/>
-        </w:rPr>
-        <w:t xml:space="preserve">entregues</w:t>
-      </w:r>
-      <w:r>
-        <w:rPr>
-          <w:highlight w:val="yellow"/>
-        </w:rPr>
+    </w:p>
+    <w:p>
+      <w:pPr>
+        <w:pBdr/>
+        <w:spacing/>
+        <w:ind/>
+        <w:rPr/>
+      </w:pPr>
+      <w:r/>
+      <w:r/>
+    </w:p>
+    <w:p>
+      <w:pPr>
+        <w:pBdr/>
+        <w:spacing w:after="0" w:line="240" w:lineRule="auto"/>
+        <w:ind/>
+        <w:jc w:val="left"/>
+        <w:rPr/>
+      </w:pPr>
+      <w:r>
+        <w:br w:type="page" w:clear="all"/>
+      </w:r>
+      <w:r/>
+    </w:p>
+    <w:p>
+      <w:pPr>
+        <w:pStyle w:val="1775"/>
+        <w:pBdr/>
+        <w:spacing/>
+        <w:ind/>
+        <w:rPr/>
+      </w:pPr>
+      <w:r/>
+      <w:bookmarkStart w:id="32" w:name="_Toc30"/>
+      <w:r>
+        <w:t xml:space="preserve">6 ARQUITETURA E PROJETO</w:t>
+      </w:r>
+      <w:r>
+        <w:t xml:space="preserve"> DO SISTEMA</w:t>
+      </w:r>
+      <w:r>
+        <w:t xml:space="preserve"> DE SOFTWARE</w:t>
+      </w:r>
+      <w:bookmarkEnd w:id="32"/>
+      <w:r/>
+      <w:r/>
+    </w:p>
+    <w:p>
+      <w:pPr>
+        <w:pBdr/>
+        <w:spacing/>
+        <w:ind/>
+        <w:rPr/>
+      </w:pPr>
+      <w:r>
+        <w:t xml:space="preserve">I</w:t>
+      </w:r>
+      <w:r>
+        <w:t xml:space="preserve">nsira</w:t>
+      </w:r>
+      <w:r>
+        <w:t xml:space="preserve"> uma </w:t>
+      </w:r>
+      <w:r>
+        <w:t xml:space="preserve">apresentação</w:t>
+      </w:r>
+      <w:r>
+        <w:t xml:space="preserve"> sobre o assunto tratado neste capítulo</w:t>
+      </w:r>
+      <w:r>
+        <w:t xml:space="preserve">. </w:t>
+      </w:r>
+      <w:r>
+        <w:t xml:space="preserve">A palavra</w:t>
+      </w:r>
+      <w:r>
+        <w:t xml:space="preserve"> projeto aqui se refere à etapa de construção do sistema de software.</w:t>
+      </w:r>
+      <w:r/>
+    </w:p>
+    <w:p>
+      <w:pPr>
+        <w:pBdr/>
+        <w:spacing/>
+        <w:ind/>
+        <w:rPr/>
+      </w:pPr>
+      <w:r/>
+      <w:r/>
+    </w:p>
+    <w:p>
+      <w:pPr>
+        <w:pStyle w:val="1776"/>
+        <w:pBdr/>
+        <w:spacing/>
+        <w:ind/>
+        <w:rPr/>
+      </w:pPr>
+      <w:r/>
+      <w:bookmarkStart w:id="33" w:name="_Toc31"/>
+      <w:r>
+        <w:t xml:space="preserve">6.1 V</w:t>
+      </w:r>
+      <w:r>
+        <w:t xml:space="preserve">ISÃO ESTRUTURAL</w:t>
+      </w:r>
+      <w:bookmarkEnd w:id="33"/>
+      <w:r/>
+      <w:r/>
+    </w:p>
+    <w:p>
+      <w:pPr>
+        <w:pBdr/>
+        <w:spacing/>
+        <w:ind/>
+        <w:rPr/>
+      </w:pPr>
+      <w:r>
+        <w:t xml:space="preserve">Insira</w:t>
+      </w:r>
+      <w:r>
+        <w:t xml:space="preserve"> uma </w:t>
+      </w:r>
+      <w:r>
+        <w:t xml:space="preserve">apresentação</w:t>
+      </w:r>
+      <w:r>
+        <w:t xml:space="preserve"> sobre o assunto tratado nesta seção</w:t>
+      </w:r>
+      <w:r>
         <w:t xml:space="preserve">.</w:t>
       </w:r>
-      <w:r/>
-    </w:p>
-    <w:p>
-      <w:pPr>
-        <w:pBdr/>
-        <w:spacing/>
-        <w:ind/>
-        <w:rPr/>
-      </w:pPr>
-      <w:r/>
-      <w:r/>
-    </w:p>
-    <w:p>
-      <w:pPr>
-        <w:pBdr/>
-        <w:spacing w:after="0" w:line="240" w:lineRule="auto"/>
-        <w:ind/>
-        <w:jc w:val="left"/>
-        <w:rPr/>
-      </w:pPr>
-      <w:r>
-        <w:br w:type="page" w:clear="all"/>
-      </w:r>
-      <w:r/>
-    </w:p>
-    <w:p>
-      <w:pPr>
-        <w:pStyle w:val="1775"/>
-        <w:pBdr/>
-        <w:spacing/>
-        <w:ind/>
-        <w:rPr/>
-      </w:pPr>
-      <w:r/>
-      <w:bookmarkStart w:id="29" w:name="_Toc27"/>
-      <w:r>
-        <w:t xml:space="preserve">6 ARQUITETURA E PROJETO</w:t>
-      </w:r>
-      <w:r>
-        <w:t xml:space="preserve"> DO SISTEMA</w:t>
-      </w:r>
-      <w:r>
-        <w:t xml:space="preserve"> DE SOFTWARE</w:t>
-      </w:r>
-      <w:bookmarkEnd w:id="29"/>
-      <w:r/>
-      <w:r/>
-    </w:p>
-    <w:p>
-      <w:pPr>
-        <w:pBdr/>
-        <w:spacing/>
-        <w:ind/>
-        <w:rPr/>
-      </w:pPr>
+      <w:r>
+        <w:t xml:space="preserve"> </w:t>
+      </w:r>
+      <w:r>
+        <w:t xml:space="preserve">T</w:t>
+      </w:r>
+      <w:r>
+        <w:t xml:space="preserve">odos os diagramas devem ser entregue</w:t>
+      </w:r>
+      <w:r>
+        <w:t xml:space="preserve">s</w:t>
+      </w:r>
+      <w:r>
+        <w:t xml:space="preserve"> dentro da pasta do Apêndice </w:t>
+      </w:r>
+      <w:r>
+        <w:t xml:space="preserve">F</w:t>
+      </w:r>
+      <w:r>
+        <w:t xml:space="preserve">.</w:t>
+      </w:r>
+      <w:r/>
+    </w:p>
+    <w:p>
+      <w:pPr>
+        <w:pBdr/>
+        <w:spacing/>
+        <w:ind/>
+        <w:rPr/>
+      </w:pPr>
+      <w:r/>
+      <w:r/>
+    </w:p>
+    <w:p>
+      <w:pPr>
+        <w:pStyle w:val="1777"/>
+        <w:pBdr/>
+        <w:spacing/>
+        <w:ind/>
+        <w:rPr/>
+      </w:pPr>
+      <w:r/>
+      <w:bookmarkStart w:id="34" w:name="_Toc32"/>
+      <w:r>
+        <w:t xml:space="preserve">6.1.1 Diagrama de </w:t>
+      </w:r>
+      <w:r>
+        <w:t xml:space="preserve">P</w:t>
+      </w:r>
+      <w:r>
+        <w:t xml:space="preserve">acotes</w:t>
+      </w:r>
+      <w:bookmarkEnd w:id="34"/>
+      <w:r/>
+      <w:r/>
+    </w:p>
+    <w:p>
+      <w:pPr>
+        <w:pBdr/>
+        <w:spacing/>
+        <w:ind/>
+        <w:rPr/>
+      </w:pPr>
+      <w:r>
+        <w:t xml:space="preserve">Defin</w:t>
+      </w:r>
+      <w:r>
+        <w:t xml:space="preserve">a</w:t>
+      </w:r>
+      <w:r>
+        <w:t xml:space="preserve"> os pacotes (agrupament</w:t>
+      </w:r>
+      <w:r>
+        <w:t xml:space="preserve">os lógicos) idealizados para </w:t>
+      </w:r>
+      <w:r>
+        <w:t xml:space="preserve">o sistema. Os pacotes geralmente são identificados segundo os padrões de projeto utilizados</w:t>
+      </w:r>
+      <w:r>
+        <w:t xml:space="preserve">.</w:t>
+      </w:r>
+      <w:r/>
+    </w:p>
+    <w:p>
+      <w:pPr>
+        <w:pBdr/>
+        <w:spacing/>
+        <w:ind/>
+        <w:rPr/>
+      </w:pPr>
+      <w:r/>
+      <w:r/>
+    </w:p>
+    <w:p>
+      <w:pPr>
+        <w:pStyle w:val="1777"/>
+        <w:pBdr/>
+        <w:spacing/>
+        <w:ind/>
+        <w:rPr/>
+      </w:pPr>
+      <w:r/>
+      <w:bookmarkStart w:id="35" w:name="_Toc33"/>
+      <w:r>
+        <w:t xml:space="preserve">6.1.2 Diagramas de </w:t>
+      </w:r>
+      <w:r>
+        <w:t xml:space="preserve">C</w:t>
+      </w:r>
+      <w:r>
+        <w:t xml:space="preserve">lasses</w:t>
+      </w:r>
+      <w:bookmarkEnd w:id="35"/>
+      <w:r/>
+      <w:r/>
+    </w:p>
+    <w:p>
+      <w:pPr>
+        <w:pBdr/>
+        <w:spacing/>
+        <w:ind/>
+        <w:rPr/>
+      </w:pPr>
+      <w:r>
+        <w:t xml:space="preserve">De acordo com os pacotes</w:t>
+      </w:r>
+      <w:r>
+        <w:t xml:space="preserve"> identificados na Seção 6.1.1, </w:t>
+      </w:r>
+      <w:r>
+        <w:t xml:space="preserve">constru</w:t>
+      </w:r>
+      <w:r>
+        <w:t xml:space="preserve">a</w:t>
+      </w:r>
+      <w:r>
+        <w:t xml:space="preserve"> o diagrama de classes para cada pacote.</w:t>
+      </w:r>
+      <w:r/>
+    </w:p>
+    <w:p>
+      <w:pPr>
+        <w:pBdr/>
+        <w:spacing/>
+        <w:ind/>
+        <w:rPr/>
+      </w:pPr>
+      <w:r/>
+      <w:r/>
+    </w:p>
+    <w:p>
+      <w:pPr>
+        <w:pStyle w:val="1776"/>
+        <w:pBdr/>
+        <w:spacing/>
+        <w:ind/>
+        <w:rPr/>
+      </w:pPr>
+      <w:r/>
+      <w:bookmarkStart w:id="36" w:name="_Toc34"/>
+      <w:r>
+        <w:t xml:space="preserve">6.2 VISÃO COMPORTAMENTAL</w:t>
+      </w:r>
+      <w:bookmarkEnd w:id="36"/>
+      <w:r/>
+      <w:r/>
+    </w:p>
+    <w:p>
+      <w:pPr>
+        <w:pBdr/>
+        <w:spacing/>
+        <w:ind/>
+        <w:rPr/>
+      </w:pPr>
+      <w:r>
+        <w:t xml:space="preserve">Insira uma apresentação sobre</w:t>
+      </w:r>
+      <w:r>
+        <w:t xml:space="preserve"> o assunto tratado nesta seção. Todos os diagramas devem ser entregu</w:t>
+      </w:r>
+      <w:r>
+        <w:t xml:space="preserve">es </w:t>
+      </w:r>
+      <w:r>
+        <w:t xml:space="preserve">dentro da pasta do Apêndice </w:t>
+      </w:r>
+      <w:r>
+        <w:t xml:space="preserve">F</w:t>
+      </w:r>
+      <w:r>
+        <w:t xml:space="preserve">.</w:t>
+      </w:r>
+      <w:r/>
+    </w:p>
+    <w:p>
+      <w:pPr>
+        <w:pStyle w:val="1777"/>
+        <w:pBdr/>
+        <w:spacing/>
+        <w:ind/>
+        <w:rPr/>
+      </w:pPr>
+      <w:r/>
+      <w:bookmarkStart w:id="37" w:name="_Toc35"/>
+      <w:r>
+        <w:t xml:space="preserve">6.2.1 Projeto das </w:t>
+      </w:r>
       <w:r>
         <w:t xml:space="preserve">I</w:t>
       </w:r>
       <w:r>
-        <w:t xml:space="preserve">nsira</w:t>
-      </w:r>
-      <w:r>
-        <w:t xml:space="preserve"> uma </w:t>
-      </w:r>
-      <w:r>
-        <w:t xml:space="preserve">apresentação</w:t>
-      </w:r>
-      <w:r>
-        <w:t xml:space="preserve"> sobre o assunto tratado neste capítulo</w:t>
-      </w:r>
-      <w:r>
-        <w:t xml:space="preserve">. </w:t>
-      </w:r>
-      <w:r>
-        <w:t xml:space="preserve">A palavra</w:t>
-      </w:r>
-      <w:r>
-        <w:t xml:space="preserve"> projeto aqui se refere à etapa de construção do sistema de software.</w:t>
+        <w:t xml:space="preserve">nterações</w:t>
+      </w:r>
+      <w:r>
+        <w:t xml:space="preserve"> entre Objetos</w:t>
+      </w:r>
+      <w:bookmarkEnd w:id="37"/>
+      <w:r/>
+      <w:r/>
+    </w:p>
+    <w:p>
+      <w:pPr>
+        <w:pBdr/>
+        <w:spacing/>
+        <w:ind/>
+        <w:rPr/>
+      </w:pPr>
+      <w:r/>
+      <w:r/>
+    </w:p>
+    <w:p>
+      <w:pPr>
+        <w:pBdr/>
+        <w:spacing/>
+        <w:ind/>
+        <w:rPr/>
+      </w:pPr>
+      <w:r>
+        <w:t xml:space="preserve">6.2.1.1 Diagramas de </w:t>
+      </w:r>
+      <w:r>
+        <w:t xml:space="preserve">S</w:t>
+      </w:r>
+      <w:r>
+        <w:t xml:space="preserve">equ</w:t>
+      </w:r>
+      <w:r>
+        <w:t xml:space="preserve">ência</w:t>
+      </w:r>
+      <w:r/>
+    </w:p>
+    <w:p>
+      <w:pPr>
+        <w:pBdr/>
+        <w:spacing/>
+        <w:ind/>
+        <w:rPr/>
+      </w:pPr>
+      <w:r>
+        <w:t xml:space="preserve">Para cada cenário dos casos de uso, deverá ser construído um diagrama de seq</w:t>
+      </w:r>
+      <w:r>
+        <w:t xml:space="preserve">u</w:t>
+      </w:r>
+      <w:r>
+        <w:t xml:space="preserve">ência</w:t>
+      </w:r>
+      <w:r>
+        <w:t xml:space="preserve"> ou um diagrama de comunicação</w:t>
+      </w:r>
+      <w:r>
+        <w:t xml:space="preserve">.</w:t>
       </w:r>
       <w:r/>
     </w:p>
@@ -11116,35 +11732,104 @@
         <w:rPr/>
       </w:pPr>
       <w:r/>
-      <w:bookmarkStart w:id="30" w:name="_Toc28"/>
-      <w:r>
-        <w:t xml:space="preserve">6.1 V</w:t>
-      </w:r>
-      <w:r>
-        <w:t xml:space="preserve">ISÃO ESTRUTURAL</w:t>
-      </w:r>
-      <w:bookmarkEnd w:id="30"/>
-      <w:r/>
-      <w:r/>
-    </w:p>
-    <w:p>
-      <w:pPr>
-        <w:pBdr/>
-        <w:spacing/>
-        <w:ind/>
-        <w:rPr/>
-      </w:pPr>
-      <w:r>
-        <w:t xml:space="preserve">Insira</w:t>
-      </w:r>
-      <w:r>
-        <w:t xml:space="preserve"> uma </w:t>
-      </w:r>
-      <w:r>
-        <w:t xml:space="preserve">apresentação</w:t>
-      </w:r>
-      <w:r>
-        <w:t xml:space="preserve"> sobre o assunto tratado nesta seção</w:t>
+      <w:bookmarkStart w:id="38" w:name="_Toc36"/>
+      <w:r>
+        <w:t xml:space="preserve">6.3 VISÃO </w:t>
+      </w:r>
+      <w:r>
+        <w:t xml:space="preserve">DOS</w:t>
+      </w:r>
+      <w:r>
+        <w:t xml:space="preserve"> DADOS</w:t>
+      </w:r>
+      <w:bookmarkEnd w:id="38"/>
+      <w:r/>
+      <w:r/>
+    </w:p>
+    <w:p>
+      <w:pPr>
+        <w:pBdr/>
+        <w:spacing/>
+        <w:ind/>
+        <w:rPr/>
+      </w:pPr>
+      <w:r>
+        <w:t xml:space="preserve">Insira uma apresentação sobre o assunto tratado nesta seção.</w:t>
+      </w:r>
+      <w:r/>
+    </w:p>
+    <w:p>
+      <w:pPr>
+        <w:pBdr/>
+        <w:spacing/>
+        <w:ind/>
+        <w:rPr/>
+      </w:pPr>
+      <w:r/>
+      <w:r/>
+    </w:p>
+    <w:p>
+      <w:pPr>
+        <w:pStyle w:val="1777"/>
+        <w:pBdr/>
+        <w:spacing/>
+        <w:ind/>
+        <w:rPr/>
+      </w:pPr>
+      <w:r/>
+      <w:bookmarkStart w:id="39" w:name="_Toc37"/>
+      <w:r>
+        <w:t xml:space="preserve">6.3.1 Modelo </w:t>
+      </w:r>
+      <w:r>
+        <w:t xml:space="preserve">Lógico</w:t>
+      </w:r>
+      <w:bookmarkEnd w:id="39"/>
+      <w:r/>
+      <w:r/>
+    </w:p>
+    <w:p>
+      <w:pPr>
+        <w:pBdr/>
+        <w:spacing/>
+        <w:ind/>
+        <w:rPr/>
+      </w:pPr>
+      <w:r>
+        <w:t xml:space="preserve">A partir do modelo conceitual</w:t>
+      </w:r>
+      <w:r>
+        <w:t xml:space="preserve"> do Capítulo 5, faça o modelo </w:t>
+      </w:r>
+      <w:r>
+        <w:t xml:space="preserve">lógico</w:t>
+      </w:r>
+      <w:r>
+        <w:t xml:space="preserve"> dos dados </w:t>
+      </w:r>
+      <w:r>
+        <w:t xml:space="preserve">que devem ser</w:t>
+      </w:r>
+      <w:r>
+        <w:t xml:space="preserve"> persistidos.</w:t>
+      </w:r>
+      <w:r>
+        <w:t xml:space="preserve"> O modelo </w:t>
+      </w:r>
+      <w:r>
+        <w:t xml:space="preserve">lógico</w:t>
+      </w:r>
+      <w:r>
+        <w:t xml:space="preserve"> é con</w:t>
+      </w:r>
+      <w:r>
+        <w:t xml:space="preserve">heci</w:t>
+      </w:r>
+      <w:r>
+        <w:t xml:space="preserve">do também como modelo</w:t>
+      </w:r>
+      <w:r>
+        <w:t xml:space="preserve"> operacional</w:t>
       </w:r>
       <w:r>
         <w:t xml:space="preserve">.</w:t>
@@ -11153,19 +11838,10 @@
         <w:t xml:space="preserve"> </w:t>
       </w:r>
       <w:r>
-        <w:t xml:space="preserve">T</w:t>
-      </w:r>
-      <w:r>
-        <w:t xml:space="preserve">odos os diagramas devem ser entregue</w:t>
-      </w:r>
-      <w:r>
-        <w:t xml:space="preserve">s</w:t>
-      </w:r>
-      <w:r>
-        <w:t xml:space="preserve"> dentro da pasta do Apêndice </w:t>
-      </w:r>
-      <w:r>
-        <w:t xml:space="preserve">F</w:t>
+        <w:t xml:space="preserve">Devem ser entregues dentro da pasta do Apêndice </w:t>
+      </w:r>
+      <w:r>
+        <w:t xml:space="preserve">D</w:t>
       </w:r>
       <w:r>
         <w:t xml:space="preserve">.</w:t>
@@ -11191,55 +11867,123 @@
         <w:rPr/>
       </w:pPr>
       <w:r/>
-      <w:bookmarkStart w:id="31" w:name="_Toc29"/>
-      <w:r>
-        <w:t xml:space="preserve">6.1.1 Diagrama de </w:t>
-      </w:r>
-      <w:r>
-        <w:t xml:space="preserve">P</w:t>
-      </w:r>
-      <w:r>
-        <w:t xml:space="preserve">acotes</w:t>
-      </w:r>
-      <w:bookmarkEnd w:id="31"/>
-      <w:r/>
-      <w:r/>
-    </w:p>
-    <w:p>
-      <w:pPr>
-        <w:pBdr/>
-        <w:spacing/>
-        <w:ind/>
-        <w:rPr/>
-      </w:pPr>
-      <w:r>
-        <w:t xml:space="preserve">Defin</w:t>
-      </w:r>
-      <w:r>
-        <w:t xml:space="preserve">a</w:t>
-      </w:r>
-      <w:r>
-        <w:t xml:space="preserve"> os pacotes (agrupament</w:t>
-      </w:r>
-      <w:r>
-        <w:t xml:space="preserve">os lógicos) idealizados para </w:t>
-      </w:r>
-      <w:r>
-        <w:t xml:space="preserve">o sistema. Os pacotes geralmente são identificados segundo os padrões de projeto utilizados</w:t>
+      <w:bookmarkStart w:id="40" w:name="_Toc38"/>
+      <w:r>
+        <w:t xml:space="preserve">6.3.2 Dicionário de D</w:t>
+      </w:r>
+      <w:r>
+        <w:t xml:space="preserve">ados</w:t>
+      </w:r>
+      <w:r>
+        <w:t xml:space="preserve"> do Modelo </w:t>
+      </w:r>
+      <w:r>
+        <w:t xml:space="preserve">Lógico</w:t>
+      </w:r>
+      <w:bookmarkEnd w:id="40"/>
+      <w:r/>
+      <w:r/>
+    </w:p>
+    <w:p>
+      <w:pPr>
+        <w:pBdr/>
+        <w:spacing/>
+        <w:ind/>
+        <w:rPr/>
+      </w:pPr>
+      <w:r>
+        <w:t xml:space="preserve">Descreva os elementos de dados presentes no modelo</w:t>
+      </w:r>
+      <w:r>
+        <w:t xml:space="preserve"> </w:t>
+      </w:r>
+      <w:r>
+        <w:t xml:space="preserve">operacional</w:t>
+      </w:r>
+      <w:r>
+        <w:t xml:space="preserve"> (ou lógico)</w:t>
       </w:r>
       <w:r>
         <w:t xml:space="preserve">.</w:t>
       </w:r>
-      <w:r/>
-    </w:p>
-    <w:p>
-      <w:pPr>
-        <w:pBdr/>
-        <w:spacing/>
-        <w:ind/>
-        <w:rPr/>
-      </w:pPr>
-      <w:r/>
+      <w:r>
+        <w:t xml:space="preserve"> </w:t>
+      </w:r>
+      <w:r>
+        <w:t xml:space="preserve">Devem ser entregues dentro da pasta do Apêndice </w:t>
+      </w:r>
+      <w:r>
+        <w:t xml:space="preserve">D</w:t>
+      </w:r>
+      <w:r>
+        <w:t xml:space="preserve">.</w:t>
+      </w:r>
+      <w:r/>
+    </w:p>
+    <w:p>
+      <w:pPr>
+        <w:pBdr/>
+        <w:spacing/>
+        <w:ind/>
+        <w:rPr/>
+      </w:pPr>
+      <w:r/>
+      <w:r/>
+    </w:p>
+    <w:p>
+      <w:pPr>
+        <w:pStyle w:val="1776"/>
+        <w:pBdr/>
+        <w:spacing/>
+        <w:ind/>
+        <w:rPr/>
+      </w:pPr>
+      <w:r/>
+      <w:bookmarkStart w:id="41" w:name="_Toc39"/>
+      <w:r>
+        <w:t xml:space="preserve">6.</w:t>
+      </w:r>
+      <w:r>
+        <w:t xml:space="preserve">4</w:t>
+      </w:r>
+      <w:r>
+        <w:t xml:space="preserve"> PROJETO DA INTERAÇÃO HUMANO-COMPUTADOR</w:t>
+      </w:r>
+      <w:bookmarkEnd w:id="41"/>
+      <w:r/>
+      <w:r/>
+    </w:p>
+    <w:p>
+      <w:pPr>
+        <w:pBdr/>
+        <w:spacing/>
+        <w:ind/>
+        <w:rPr/>
+      </w:pPr>
+      <w:r>
+        <w:t xml:space="preserve">Apresente</w:t>
+      </w:r>
+      <w:r>
+        <w:t xml:space="preserve"> o estudo dos </w:t>
+      </w:r>
+      <w:r>
+        <w:t xml:space="preserve">perfis de </w:t>
+      </w:r>
+      <w:r>
+        <w:t xml:space="preserve">usuários</w:t>
+      </w:r>
+      <w:r>
+        <w:t xml:space="preserve"> esperados</w:t>
+      </w:r>
+      <w:r>
+        <w:t xml:space="preserve">, m</w:t>
+      </w:r>
+      <w:r>
+        <w:t xml:space="preserve">ostrar os padrões ergonômicos e as heurísticas de usabilidade para a impleme</w:t>
+      </w:r>
+      <w:r>
+        <w:t xml:space="preserve">ntação da interface de usuário.</w:t>
+      </w:r>
       <w:r/>
     </w:p>
     <w:p>
@@ -11251,106 +11995,6 @@
         <w:rPr/>
       </w:pPr>
       <w:r/>
-      <w:bookmarkStart w:id="32" w:name="_Toc30"/>
-      <w:r>
-        <w:t xml:space="preserve">6.1.2 Diagramas de </w:t>
-      </w:r>
-      <w:r>
-        <w:t xml:space="preserve">C</w:t>
-      </w:r>
-      <w:r>
-        <w:t xml:space="preserve">lasses</w:t>
-      </w:r>
-      <w:bookmarkEnd w:id="32"/>
-      <w:r/>
-      <w:r/>
-    </w:p>
-    <w:p>
-      <w:pPr>
-        <w:pBdr/>
-        <w:spacing/>
-        <w:ind/>
-        <w:rPr/>
-      </w:pPr>
-      <w:r>
-        <w:t xml:space="preserve">De acordo com os pacotes</w:t>
-      </w:r>
-      <w:r>
-        <w:t xml:space="preserve"> identificados na Seção 6.1.1, </w:t>
-      </w:r>
-      <w:r>
-        <w:t xml:space="preserve">constru</w:t>
-      </w:r>
-      <w:r>
-        <w:t xml:space="preserve">a</w:t>
-      </w:r>
-      <w:r>
-        <w:t xml:space="preserve"> o diagrama de classes para cada pacote.</w:t>
-      </w:r>
-      <w:r/>
-    </w:p>
-    <w:p>
-      <w:pPr>
-        <w:pBdr/>
-        <w:spacing/>
-        <w:ind/>
-        <w:rPr/>
-      </w:pPr>
-      <w:r/>
-      <w:r/>
-    </w:p>
-    <w:p>
-      <w:pPr>
-        <w:pStyle w:val="1776"/>
-        <w:pBdr/>
-        <w:spacing/>
-        <w:ind/>
-        <w:rPr/>
-      </w:pPr>
-      <w:r/>
-      <w:bookmarkStart w:id="33" w:name="_Toc31"/>
-      <w:r>
-        <w:t xml:space="preserve">6.2 VISÃO COMPORTAMENTAL</w:t>
-      </w:r>
-      <w:bookmarkEnd w:id="33"/>
-      <w:r/>
-      <w:r/>
-    </w:p>
-    <w:p>
-      <w:pPr>
-        <w:pBdr/>
-        <w:spacing/>
-        <w:ind/>
-        <w:rPr/>
-      </w:pPr>
-      <w:r>
-        <w:t xml:space="preserve">Insira uma apresentação sobre</w:t>
-      </w:r>
-      <w:r>
-        <w:t xml:space="preserve"> o assunto tratado nesta seção. Todos os diagramas devem ser entregu</w:t>
-      </w:r>
-      <w:r>
-        <w:t xml:space="preserve">es </w:t>
-      </w:r>
-      <w:r>
-        <w:t xml:space="preserve">dentro da pasta do Apêndice </w:t>
-      </w:r>
-      <w:r>
-        <w:t xml:space="preserve">F</w:t>
-      </w:r>
-      <w:r>
-        <w:t xml:space="preserve">.</w:t>
-      </w:r>
-      <w:r/>
-    </w:p>
-    <w:p>
-      <w:pPr>
-        <w:pBdr/>
-        <w:spacing/>
-        <w:ind/>
-        <w:rPr/>
-      </w:pPr>
-      <w:r/>
       <w:r/>
     </w:p>
     <w:p>
@@ -11362,305 +12006,7 @@
         <w:rPr/>
       </w:pPr>
       <w:r/>
-      <w:bookmarkStart w:id="34" w:name="_Toc32"/>
-      <w:r>
-        <w:t xml:space="preserve">6.2.1 Projeto das </w:t>
-      </w:r>
-      <w:r>
-        <w:t xml:space="preserve">I</w:t>
-      </w:r>
-      <w:r>
-        <w:t xml:space="preserve">nterações</w:t>
-      </w:r>
-      <w:r>
-        <w:t xml:space="preserve"> entre Objetos</w:t>
-      </w:r>
-      <w:bookmarkEnd w:id="34"/>
-      <w:r/>
-      <w:r/>
-    </w:p>
-    <w:p>
-      <w:pPr>
-        <w:pBdr/>
-        <w:spacing/>
-        <w:ind/>
-        <w:rPr/>
-      </w:pPr>
-      <w:r/>
-      <w:r/>
-    </w:p>
-    <w:p>
-      <w:pPr>
-        <w:pBdr/>
-        <w:spacing/>
-        <w:ind/>
-        <w:rPr/>
-      </w:pPr>
-      <w:r>
-        <w:t xml:space="preserve">6.2.1.1 Diagramas de </w:t>
-      </w:r>
-      <w:r>
-        <w:t xml:space="preserve">S</w:t>
-      </w:r>
-      <w:r>
-        <w:t xml:space="preserve">equ</w:t>
-      </w:r>
-      <w:r>
-        <w:t xml:space="preserve">ência</w:t>
-      </w:r>
-      <w:r/>
-    </w:p>
-    <w:p>
-      <w:pPr>
-        <w:pBdr/>
-        <w:spacing/>
-        <w:ind/>
-        <w:rPr/>
-      </w:pPr>
-      <w:r>
-        <w:t xml:space="preserve">Para cada cenário dos casos de uso, deverá ser construído um diagrama de seq</w:t>
-      </w:r>
-      <w:r>
-        <w:t xml:space="preserve">u</w:t>
-      </w:r>
-      <w:r>
-        <w:t xml:space="preserve">ência</w:t>
-      </w:r>
-      <w:r>
-        <w:t xml:space="preserve"> ou um diagrama de comunicação</w:t>
-      </w:r>
-      <w:r>
-        <w:t xml:space="preserve">.</w:t>
-      </w:r>
-      <w:r/>
-    </w:p>
-    <w:p>
-      <w:pPr>
-        <w:pBdr/>
-        <w:spacing/>
-        <w:ind/>
-        <w:rPr/>
-      </w:pPr>
-      <w:r/>
-      <w:r/>
-    </w:p>
-    <w:p>
-      <w:pPr>
-        <w:pStyle w:val="1776"/>
-        <w:pBdr/>
-        <w:spacing/>
-        <w:ind/>
-        <w:rPr/>
-      </w:pPr>
-      <w:r/>
-      <w:bookmarkStart w:id="35" w:name="_Toc33"/>
-      <w:r>
-        <w:t xml:space="preserve">6.3 VISÃO </w:t>
-      </w:r>
-      <w:r>
-        <w:t xml:space="preserve">DOS</w:t>
-      </w:r>
-      <w:r>
-        <w:t xml:space="preserve"> DADOS</w:t>
-      </w:r>
-      <w:bookmarkEnd w:id="35"/>
-      <w:r/>
-      <w:r/>
-    </w:p>
-    <w:p>
-      <w:pPr>
-        <w:pBdr/>
-        <w:spacing/>
-        <w:ind/>
-        <w:rPr/>
-      </w:pPr>
-      <w:r>
-        <w:t xml:space="preserve">Insira uma apresentação sobre o assunto tratado nesta seção.</w:t>
-      </w:r>
-      <w:r/>
-    </w:p>
-    <w:p>
-      <w:pPr>
-        <w:pBdr/>
-        <w:spacing/>
-        <w:ind/>
-        <w:rPr/>
-      </w:pPr>
-      <w:r/>
-      <w:r/>
-    </w:p>
-    <w:p>
-      <w:pPr>
-        <w:pStyle w:val="1777"/>
-        <w:pBdr/>
-        <w:spacing/>
-        <w:ind/>
-        <w:rPr/>
-      </w:pPr>
-      <w:r/>
-      <w:bookmarkStart w:id="36" w:name="_Toc34"/>
-      <w:r>
-        <w:t xml:space="preserve">6.3.1 Modelo </w:t>
-      </w:r>
-      <w:r>
-        <w:t xml:space="preserve">Lógico</w:t>
-      </w:r>
-      <w:bookmarkEnd w:id="36"/>
-      <w:r/>
-      <w:r/>
-    </w:p>
-    <w:p>
-      <w:pPr>
-        <w:pBdr/>
-        <w:spacing/>
-        <w:ind/>
-        <w:rPr/>
-      </w:pPr>
-      <w:r>
-        <w:t xml:space="preserve">A partir do modelo conceitual</w:t>
-      </w:r>
-      <w:r>
-        <w:t xml:space="preserve"> do Capítulo 5, faça o modelo </w:t>
-      </w:r>
-      <w:r>
-        <w:t xml:space="preserve">lógico</w:t>
-      </w:r>
-      <w:r>
-        <w:t xml:space="preserve"> dos dados </w:t>
-      </w:r>
-      <w:r>
-        <w:t xml:space="preserve">que devem ser</w:t>
-      </w:r>
-      <w:r>
-        <w:t xml:space="preserve"> persistidos.</w:t>
-      </w:r>
-      <w:r>
-        <w:t xml:space="preserve"> O modelo </w:t>
-      </w:r>
-      <w:r>
-        <w:t xml:space="preserve">lógico</w:t>
-      </w:r>
-      <w:r>
-        <w:t xml:space="preserve"> é con</w:t>
-      </w:r>
-      <w:r>
-        <w:t xml:space="preserve">heci</w:t>
-      </w:r>
-      <w:r>
-        <w:t xml:space="preserve">do também como modelo</w:t>
-      </w:r>
-      <w:r>
-        <w:t xml:space="preserve"> operacional</w:t>
-      </w:r>
-      <w:r>
-        <w:t xml:space="preserve">.</w:t>
-      </w:r>
-      <w:r>
-        <w:t xml:space="preserve"> </w:t>
-      </w:r>
-      <w:r>
-        <w:t xml:space="preserve">Devem ser entregues dentro da pasta do Apêndice </w:t>
-      </w:r>
-      <w:r>
-        <w:t xml:space="preserve">D</w:t>
-      </w:r>
-      <w:r>
-        <w:t xml:space="preserve">.</w:t>
-      </w:r>
-      <w:r/>
-    </w:p>
-    <w:p>
-      <w:pPr>
-        <w:pBdr/>
-        <w:spacing/>
-        <w:ind/>
-        <w:rPr/>
-      </w:pPr>
-      <w:r/>
-      <w:r/>
-    </w:p>
-    <w:p>
-      <w:pPr>
-        <w:pStyle w:val="1777"/>
-        <w:pBdr/>
-        <w:spacing/>
-        <w:ind/>
-        <w:rPr/>
-      </w:pPr>
-      <w:r/>
-      <w:bookmarkStart w:id="37" w:name="_Toc35"/>
-      <w:r>
-        <w:t xml:space="preserve">6.3.2 Dicionário de D</w:t>
-      </w:r>
-      <w:r>
-        <w:t xml:space="preserve">ados</w:t>
-      </w:r>
-      <w:r>
-        <w:t xml:space="preserve"> do Modelo </w:t>
-      </w:r>
-      <w:r>
-        <w:t xml:space="preserve">Lógico</w:t>
-      </w:r>
-      <w:bookmarkEnd w:id="37"/>
-      <w:r/>
-      <w:r/>
-    </w:p>
-    <w:p>
-      <w:pPr>
-        <w:pBdr/>
-        <w:spacing/>
-        <w:ind/>
-        <w:rPr/>
-      </w:pPr>
-      <w:r>
-        <w:t xml:space="preserve">Descreva os elementos de dados presentes no modelo</w:t>
-      </w:r>
-      <w:r>
-        <w:t xml:space="preserve"> </w:t>
-      </w:r>
-      <w:r>
-        <w:t xml:space="preserve">operacional</w:t>
-      </w:r>
-      <w:r>
-        <w:t xml:space="preserve"> (ou lógico)</w:t>
-      </w:r>
-      <w:r>
-        <w:t xml:space="preserve">.</w:t>
-      </w:r>
-      <w:r>
-        <w:t xml:space="preserve"> </w:t>
-      </w:r>
-      <w:r>
-        <w:t xml:space="preserve">Devem ser entregues dentro da pasta do Apêndice </w:t>
-      </w:r>
-      <w:r>
-        <w:t xml:space="preserve">D</w:t>
-      </w:r>
-      <w:r>
-        <w:t xml:space="preserve">.</w:t>
-      </w:r>
-      <w:r/>
-    </w:p>
-    <w:p>
-      <w:pPr>
-        <w:pBdr/>
-        <w:spacing/>
-        <w:ind/>
-        <w:rPr/>
-      </w:pPr>
-      <w:r/>
-      <w:r/>
-    </w:p>
-    <w:p>
-      <w:pPr>
-        <w:pStyle w:val="1776"/>
-        <w:pBdr/>
-        <w:spacing/>
-        <w:ind/>
-        <w:rPr/>
-      </w:pPr>
-      <w:r/>
-      <w:bookmarkStart w:id="38" w:name="_Toc36"/>
+      <w:bookmarkStart w:id="42" w:name="_Toc40"/>
       <w:r>
         <w:t xml:space="preserve">6.</w:t>
       </w:r>
@@ -11668,73 +12014,6 @@
         <w:t xml:space="preserve">4</w:t>
       </w:r>
       <w:r>
-        <w:t xml:space="preserve"> PROJETO DA INTERAÇÃO HUMANO-COMPUTADOR</w:t>
-      </w:r>
-      <w:bookmarkEnd w:id="38"/>
-      <w:r/>
-      <w:r/>
-    </w:p>
-    <w:p>
-      <w:pPr>
-        <w:pBdr/>
-        <w:spacing/>
-        <w:ind/>
-        <w:rPr/>
-      </w:pPr>
-      <w:r>
-        <w:t xml:space="preserve">Apresente</w:t>
-      </w:r>
-      <w:r>
-        <w:t xml:space="preserve"> o estudo dos </w:t>
-      </w:r>
-      <w:r>
-        <w:t xml:space="preserve">perfis de </w:t>
-      </w:r>
-      <w:r>
-        <w:t xml:space="preserve">usuários</w:t>
-      </w:r>
-      <w:r>
-        <w:t xml:space="preserve"> esperados</w:t>
-      </w:r>
-      <w:r>
-        <w:t xml:space="preserve">, m</w:t>
-      </w:r>
-      <w:r>
-        <w:t xml:space="preserve">ostrar os padrões ergonômicos e as heurísticas de usabilidade para a impleme</w:t>
-      </w:r>
-      <w:r>
-        <w:t xml:space="preserve">ntação da interface de usuário.</w:t>
-      </w:r>
-      <w:r/>
-    </w:p>
-    <w:p>
-      <w:pPr>
-        <w:pStyle w:val="1777"/>
-        <w:pBdr/>
-        <w:spacing/>
-        <w:ind/>
-        <w:rPr/>
-      </w:pPr>
-      <w:r/>
-      <w:r/>
-    </w:p>
-    <w:p>
-      <w:pPr>
-        <w:pStyle w:val="1777"/>
-        <w:pBdr/>
-        <w:spacing/>
-        <w:ind/>
-        <w:rPr/>
-      </w:pPr>
-      <w:r/>
-      <w:bookmarkStart w:id="39" w:name="_Toc37"/>
-      <w:r>
-        <w:t xml:space="preserve">6.</w:t>
-      </w:r>
-      <w:r>
-        <w:t xml:space="preserve">4</w:t>
-      </w:r>
-      <w:r>
         <w:t xml:space="preserve">.1 </w:t>
       </w:r>
       <w:r>
@@ -11749,7 +12028,7 @@
       <w:r>
         <w:t xml:space="preserve">suário</w:t>
       </w:r>
-      <w:bookmarkEnd w:id="39"/>
+      <w:bookmarkEnd w:id="42"/>
       <w:r/>
       <w:r/>
     </w:p>
@@ -11848,14 +12127,14 @@
         <w:rPr/>
       </w:pPr>
       <w:r/>
-      <w:bookmarkStart w:id="40" w:name="_Toc38"/>
+      <w:bookmarkStart w:id="43" w:name="_Toc41"/>
       <w:r>
         <w:t xml:space="preserve">7</w:t>
       </w:r>
       <w:r>
         <w:t xml:space="preserve"> CONCLUSÃO</w:t>
       </w:r>
-      <w:bookmarkEnd w:id="40"/>
+      <w:bookmarkEnd w:id="43"/>
       <w:r/>
       <w:r/>
     </w:p>
@@ -11930,11 +12209,11 @@
         <w:rPr/>
       </w:pPr>
       <w:r/>
-      <w:bookmarkStart w:id="41" w:name="_Toc39"/>
+      <w:bookmarkStart w:id="44" w:name="_Toc42"/>
       <w:r>
         <w:t xml:space="preserve">REFERÊNCIAS</w:t>
       </w:r>
-      <w:bookmarkEnd w:id="41"/>
+      <w:bookmarkEnd w:id="44"/>
       <w:r/>
       <w:r/>
     </w:p>
@@ -12240,7 +12519,7 @@
         <w:rPr/>
       </w:pPr>
       <w:r/>
-      <w:bookmarkStart w:id="42" w:name="_Toc40"/>
+      <w:bookmarkStart w:id="45" w:name="_Toc43"/>
       <w:r>
         <w:br w:type="page" w:clear="all"/>
       </w:r>
@@ -12250,7 +12529,7 @@
       <w:r>
         <w:t xml:space="preserve"> </w:t>
       </w:r>
-      <w:bookmarkEnd w:id="42"/>
+      <w:bookmarkEnd w:id="45"/>
       <w:r/>
       <w:r/>
     </w:p>
@@ -12300,7 +12579,7 @@
         <w:rPr/>
       </w:pPr>
       <w:r/>
-      <w:bookmarkStart w:id="43" w:name="_Toc41"/>
+      <w:bookmarkStart w:id="46" w:name="_Toc44"/>
       <w:r>
         <w:br w:type="page" w:clear="all"/>
       </w:r>
@@ -12325,7 +12604,7 @@
       <w:r>
         <w:t xml:space="preserve"> DO PROJETO</w:t>
       </w:r>
-      <w:bookmarkEnd w:id="43"/>
+      <w:bookmarkEnd w:id="46"/>
       <w:r/>
       <w:r/>
     </w:p>
@@ -12350,7 +12629,7 @@
         <w:rPr/>
       </w:pPr>
       <w:r/>
-      <w:bookmarkStart w:id="44" w:name="_Toc42"/>
+      <w:bookmarkStart w:id="47" w:name="_Toc45"/>
       <w:r>
         <w:br w:type="page" w:clear="all"/>
       </w:r>
@@ -12360,7 +12639,7 @@
       <w:r>
         <w:t xml:space="preserve"> RELATÓRIO DE DESEMPENHO</w:t>
       </w:r>
-      <w:bookmarkEnd w:id="44"/>
+      <w:bookmarkEnd w:id="47"/>
       <w:r/>
       <w:r/>
     </w:p>
@@ -12403,7 +12682,7 @@
         <w:rPr/>
       </w:pPr>
       <w:r/>
-      <w:bookmarkStart w:id="45" w:name="_Toc43"/>
+      <w:bookmarkStart w:id="48" w:name="_Toc46"/>
       <w:r>
         <w:br w:type="page" w:clear="all"/>
       </w:r>
@@ -12413,7 +12692,7 @@
       <w:r>
         <w:t xml:space="preserve">VISÃO FUNCIONAL</w:t>
       </w:r>
-      <w:bookmarkEnd w:id="45"/>
+      <w:bookmarkEnd w:id="48"/>
       <w:r/>
       <w:r/>
     </w:p>
@@ -12438,7 +12717,7 @@
         <w:rPr/>
       </w:pPr>
       <w:r/>
-      <w:bookmarkStart w:id="46" w:name="_Toc44"/>
+      <w:bookmarkStart w:id="49" w:name="_Toc47"/>
       <w:r>
         <w:br w:type="page" w:clear="all"/>
       </w:r>
@@ -12448,7 +12727,7 @@
       <w:r>
         <w:t xml:space="preserve">VISÃO DOS DADOS</w:t>
       </w:r>
-      <w:bookmarkEnd w:id="46"/>
+      <w:bookmarkEnd w:id="49"/>
       <w:r/>
       <w:r/>
     </w:p>
@@ -12485,11 +12764,11 @@
         <w:rPr/>
       </w:pPr>
       <w:r/>
-      <w:bookmarkStart w:id="47" w:name="_Toc45"/>
+      <w:bookmarkStart w:id="50" w:name="_Toc48"/>
       <w:r>
         <w:t xml:space="preserve">APÊNDICE E – MODELO INICIAL DA INTERFACE DE USUÁRIO</w:t>
       </w:r>
-      <w:bookmarkEnd w:id="47"/>
+      <w:bookmarkEnd w:id="50"/>
       <w:r/>
       <w:r/>
     </w:p>
@@ -12537,7 +12816,7 @@
         <w:rPr/>
       </w:pPr>
       <w:r/>
-      <w:bookmarkStart w:id="48" w:name="_Toc46"/>
+      <w:bookmarkStart w:id="51" w:name="_Toc49"/>
       <w:r>
         <w:t xml:space="preserve">APÊNDICE </w:t>
       </w:r>
@@ -12553,7 +12832,7 @@
       <w:r>
         <w:t xml:space="preserve">ÕES ESTRUTURAL E COMPORTAMENTAL</w:t>
       </w:r>
-      <w:bookmarkEnd w:id="48"/>
+      <w:bookmarkEnd w:id="51"/>
       <w:r/>
       <w:r/>
     </w:p>
@@ -12611,7 +12890,7 @@
         <w:rPr/>
       </w:pPr>
       <w:r/>
-      <w:bookmarkStart w:id="49" w:name="_Toc47"/>
+      <w:bookmarkStart w:id="52" w:name="_Toc50"/>
       <w:r>
         <w:t xml:space="preserve">A</w:t>
       </w:r>
@@ -12627,7 +12906,7 @@
       <w:r>
         <w:t xml:space="preserve">RIOS</w:t>
       </w:r>
-      <w:bookmarkEnd w:id="49"/>
+      <w:bookmarkEnd w:id="52"/>
       <w:r/>
       <w:r/>
     </w:p>

</xml_diff>

<commit_message>
feat: correção do DER
</commit_message>
<xml_diff>
--- a/FAI-SI-PFC-I-FalaCidade-2026-v1.2.docx
+++ b/FAI-SI-PFC-I-FalaCidade-2026-v1.2.docx
@@ -862,21 +862,6 @@
                 <w:highlight w:val="none"/>
               </w:rPr>
             </w:r>
-            <w:r>
-              <w:rPr>
-                <w:highlight w:val="none"/>
-              </w:rPr>
-            </w:r>
-            <w:r>
-              <w:rPr>
-                <w:highlight w:val="none"/>
-              </w:rPr>
-            </w:r>
-            <w:r>
-              <w:rPr>
-                <w:highlight w:val="none"/>
-              </w:rPr>
-            </w:r>
           </w:p>
         </w:tc>
       </w:tr>
@@ -982,7 +967,6 @@
             <w:r>
               <w:t xml:space="preserve">ões da Fase 1.</w:t>
             </w:r>
-            <w:r/>
             <w:r/>
           </w:p>
         </w:tc>
@@ -9371,7 +9355,7 @@
         <w:t xml:space="preserve">Prioridade: </w:t>
       </w:r>
       <w:r>
-        <w:t xml:space="preserve">Importante</w:t>
+        <w:t xml:space="preserve">Essencial</w:t>
       </w:r>
       <w:r>
         <w:t xml:space="preserve">.</w:t>
@@ -10723,7 +10707,16 @@
         <w:rPr/>
       </w:pPr>
       <w:r>
-        <w:t xml:space="preserve">O nível de prioridade (Baixa, Média ou Alta) não é editável pelo cidadão. O sistema deve atribuir o peso automaticamente com base na categoria selecionada (Ex: "Fios de alta tensão caídos" = Alta; "Poda de árvore em praça" = Baixa).</w:t>
+        <w:t xml:space="preserve">O nível de prioridade (Baixa, Média ou Alta) não é editável pelo cidadão. O sistema deve atribuir o peso com base na categoria selecionada pelo </w:t>
+      </w:r>
+      <w:r>
+        <w:t xml:space="preserve">cidad</w:t>
+      </w:r>
+      <w:r>
+        <w:t xml:space="preserve">ão</w:t>
+      </w:r>
+      <w:r>
+        <w:t xml:space="preserve"> (Ex: "Fios de alta tensão caídos" = Alta; "Poda de árvore em praça" = Baixa).</w:t>
       </w:r>
       <w:r/>
     </w:p>

</xml_diff>

<commit_message>
feat :sparkles: adicao do apendice de segurança, e atualizacao nos requisitos nao funcionais de segurança
</commit_message>
<xml_diff>
--- a/FAI-SI-PFC-I-FalaCidade-2026-v1.2.docx
+++ b/FAI-SI-PFC-I-FalaCidade-2026-v1.2.docx
@@ -1835,342 +1835,1795 @@
     </w:p>
     <w:tbl>
       <w:tblPr>
-        <w:tblInd w:w="180" w:type="dxa"/>
-        <w:tblW w:w="7815" w:type="dxa"/>
-        <w:tblBorders/>
-        <w:tblLayout w:type="autofit"/>
+        <w:tblStyle w:val="1800"/>
+        <w:tblInd w:w="0" w:type="dxa"/>
+        <w:tblW w:w="0" w:type="auto"/>
+        <w:tblBorders>
+          <w:top w:val="none" w:color="000000" w:sz="4" w:space="0"/>
+          <w:left w:val="none" w:color="000000" w:sz="4" w:space="0"/>
+          <w:bottom w:val="none" w:color="000000" w:sz="4" w:space="0"/>
+          <w:right w:val="none" w:color="000000" w:sz="4" w:space="0"/>
+          <w:insideH w:val="none" w:color="000000" w:sz="4" w:space="0"/>
+          <w:insideV w:val="none" w:color="000000" w:sz="4" w:space="0"/>
+        </w:tblBorders>
+        <w:tblLayout w:type="fixed"/>
         <w:tblLook w:val="04A0" w:firstRow="1" w:lastRow="0" w:firstColumn="1" w:lastColumn="0" w:noHBand="0" w:noVBand="1"/>
       </w:tblPr>
       <w:tblGrid>
-        <w:gridCol w:w="1588"/>
-        <w:gridCol w:w="6227"/>
+        <w:gridCol w:w="1425"/>
+        <w:gridCol w:w="6945"/>
       </w:tblGrid>
       <w:tr>
-        <w:trPr>
-          <w:trHeight w:val="1032"/>
-        </w:trPr>
+        <w:trPr/>
         <w:tc>
           <w:tcPr>
-            <w:tcBorders/>
-            <w:tcW w:w="1588" w:type="dxa"/>
+            <w:shd w:val="clear" w:color="efefef" w:fill="efefef"/>
+            <w:tcBorders>
+              <w:top w:val="single" w:color="1f1f1f" w:sz="6" w:space="0"/>
+              <w:left w:val="single" w:color="1f1f1f" w:sz="6" w:space="0"/>
+              <w:bottom w:val="single" w:color="1f1f1f" w:sz="6" w:space="0"/>
+              <w:right w:val="single" w:color="1f1f1f" w:sz="6" w:space="0"/>
+            </w:tcBorders>
+            <w:tcMar>
+              <w:left w:w="0" w:type="dxa"/>
+              <w:top w:w="240" w:type="dxa"/>
+              <w:right w:w="180" w:type="dxa"/>
+              <w:bottom w:w="240" w:type="dxa"/>
+            </w:tcMar>
+            <w:tcW w:w="1425" w:type="dxa"/>
+            <w:vAlign w:val="center"/>
           </w:tcPr>
           <w:p>
             <w:pPr>
               <w:pBdr/>
-              <w:spacing w:after="120" w:before="120"/>
+              <w:spacing w:after="0" w:before="0" w:line="240"/>
               <w:ind/>
               <w:rPr/>
             </w:pPr>
             <w:r>
-              <w:t xml:space="preserve">FAI -</w:t>
+              <w:rPr>
+                <w:rFonts w:ascii="Arial" w:hAnsi="Arial" w:eastAsia="Arial" w:cs="Arial"/>
+                <w:b/>
+                <w:color w:val="1f1f1f"/>
+                <w:sz w:val="24"/>
+              </w:rPr>
+              <w:t xml:space="preserve">Sigla</w:t>
             </w:r>
             <w:r/>
           </w:p>
         </w:tc>
         <w:tc>
           <w:tcPr>
-            <w:tcBorders/>
-            <w:tcW w:w="6227" w:type="dxa"/>
+            <w:shd w:val="clear" w:color="efefef" w:fill="efefef"/>
+            <w:tcBorders>
+              <w:top w:val="single" w:color="1f1f1f" w:sz="6" w:space="0"/>
+              <w:left w:val="single" w:color="1f1f1f" w:sz="6" w:space="0"/>
+              <w:bottom w:val="single" w:color="1f1f1f" w:sz="6" w:space="0"/>
+              <w:right w:val="single" w:color="1f1f1f" w:sz="6" w:space="0"/>
+            </w:tcBorders>
+            <w:tcMar>
+              <w:left w:w="0" w:type="dxa"/>
+              <w:top w:w="240" w:type="dxa"/>
+              <w:right w:w="0" w:type="dxa"/>
+              <w:bottom w:w="240" w:type="dxa"/>
+            </w:tcMar>
+            <w:tcW w:w="6945" w:type="dxa"/>
+            <w:vAlign w:val="center"/>
           </w:tcPr>
           <w:p>
             <w:pPr>
               <w:pBdr/>
-              <w:spacing w:after="120" w:before="120"/>
+              <w:spacing w:after="0" w:before="0" w:line="240"/>
               <w:ind/>
               <w:rPr/>
             </w:pPr>
             <w:r>
-              <w:t xml:space="preserve">FAI - Centro de Ensino Superior em Gestão, Tecnologia e Educação</w:t>
+              <w:rPr>
+                <w:rFonts w:ascii="Arial" w:hAnsi="Arial" w:eastAsia="Arial" w:cs="Arial"/>
+                <w:b/>
+                <w:color w:val="1f1f1f"/>
+                <w:sz w:val="24"/>
+              </w:rPr>
+              <w:t xml:space="preserve">Significado</w:t>
             </w:r>
             <w:r/>
           </w:p>
         </w:tc>
       </w:tr>
       <w:tr>
-        <w:trPr>
-          <w:trHeight w:val="1032"/>
-        </w:trPr>
+        <w:trPr/>
         <w:tc>
           <w:tcPr>
-            <w:tcBorders/>
-            <w:tcW w:w="1588" w:type="dxa"/>
+            <w:tcBorders>
+              <w:top w:val="single" w:color="1f1f1f" w:sz="6" w:space="0"/>
+              <w:left w:val="single" w:color="1f1f1f" w:sz="6" w:space="0"/>
+              <w:bottom w:val="single" w:color="1f1f1f" w:sz="6" w:space="0"/>
+              <w:right w:val="single" w:color="1f1f1f" w:sz="6" w:space="0"/>
+            </w:tcBorders>
+            <w:tcMar>
+              <w:left w:w="0" w:type="dxa"/>
+              <w:top w:w="240" w:type="dxa"/>
+              <w:right w:w="180" w:type="dxa"/>
+              <w:bottom w:w="240" w:type="dxa"/>
+            </w:tcMar>
+            <w:tcW w:w="1425" w:type="dxa"/>
+            <w:vAlign w:val="center"/>
           </w:tcPr>
           <w:p>
             <w:pPr>
               <w:pBdr/>
-              <w:spacing w:after="120" w:before="120"/>
+              <w:spacing w:after="0" w:before="0" w:line="240"/>
               <w:ind/>
               <w:rPr/>
             </w:pPr>
             <w:r>
-              <w:t xml:space="preserve">FAITEC -</w:t>
+              <w:rPr>
+                <w:rFonts w:ascii="Arial" w:hAnsi="Arial" w:eastAsia="Arial" w:cs="Arial"/>
+                <w:b/>
+                <w:color w:val="1f1f1f"/>
+                <w:sz w:val="24"/>
+              </w:rPr>
+              <w:t xml:space="preserve">API</w:t>
             </w:r>
             <w:r/>
           </w:p>
         </w:tc>
         <w:tc>
           <w:tcPr>
-            <w:tcBorders/>
-            <w:tcW w:w="6227" w:type="dxa"/>
+            <w:tcBorders>
+              <w:top w:val="single" w:color="1f1f1f" w:sz="6" w:space="0"/>
+              <w:left w:val="single" w:color="1f1f1f" w:sz="6" w:space="0"/>
+              <w:bottom w:val="single" w:color="1f1f1f" w:sz="6" w:space="0"/>
+              <w:right w:val="single" w:color="1f1f1f" w:sz="6" w:space="0"/>
+            </w:tcBorders>
+            <w:tcMar>
+              <w:left w:w="0" w:type="dxa"/>
+              <w:top w:w="240" w:type="dxa"/>
+              <w:right w:w="0" w:type="dxa"/>
+              <w:bottom w:w="240" w:type="dxa"/>
+            </w:tcMar>
+            <w:tcW w:w="6945" w:type="dxa"/>
+            <w:vAlign w:val="center"/>
           </w:tcPr>
           <w:p>
             <w:pPr>
-              <w:pBdr/>
-              <w:spacing w:after="120" w:before="120"/>
-              <w:ind/>
+              <w:pBdr>
+                <w:top w:val="none" w:color="000000" w:sz="4" w:space="0"/>
+                <w:left w:val="none" w:color="000000" w:sz="4" w:space="0"/>
+                <w:bottom w:val="none" w:color="000000" w:sz="4" w:space="0"/>
+                <w:right w:val="none" w:color="000000" w:sz="4" w:space="0"/>
+              </w:pBdr>
+              <w:spacing w:after="0" w:before="0" w:line="276" w:lineRule="auto"/>
+              <w:ind w:right="0" w:firstLine="0" w:left="0"/>
               <w:rPr/>
             </w:pPr>
             <w:r>
-              <w:t xml:space="preserve">Feira de Tecnologia e Empreendedorismo da FAI</w:t>
+              <w:rPr>
+                <w:rFonts w:ascii="Arial" w:hAnsi="Arial" w:eastAsia="Arial" w:cs="Arial"/>
+                <w:i/>
+                <w:color w:val="1f1f1f"/>
+                <w:sz w:val="24"/>
+              </w:rPr>
+              <w:t xml:space="preserve">Application Programming Interface</w:t>
+            </w:r>
+            <w:r>
+              <w:rPr>
+                <w:rFonts w:ascii="Arial" w:hAnsi="Arial" w:eastAsia="Arial" w:cs="Arial"/>
+                <w:color w:val="1f1f1f"/>
+                <w:sz w:val="24"/>
+              </w:rPr>
+              <w:t xml:space="preserve"> </w:t>
             </w:r>
             <w:r/>
           </w:p>
         </w:tc>
       </w:tr>
       <w:tr>
-        <w:trPr>
-          <w:trHeight w:val="632"/>
-        </w:trPr>
+        <w:trPr/>
         <w:tc>
           <w:tcPr>
-            <w:tcBorders/>
-            <w:tcW w:w="1588" w:type="dxa"/>
+            <w:tcBorders>
+              <w:top w:val="single" w:color="1f1f1f" w:sz="6" w:space="0"/>
+              <w:left w:val="single" w:color="1f1f1f" w:sz="6" w:space="0"/>
+              <w:bottom w:val="single" w:color="1f1f1f" w:sz="6" w:space="0"/>
+              <w:right w:val="single" w:color="1f1f1f" w:sz="6" w:space="0"/>
+            </w:tcBorders>
+            <w:tcMar>
+              <w:left w:w="0" w:type="dxa"/>
+              <w:top w:w="240" w:type="dxa"/>
+              <w:right w:w="180" w:type="dxa"/>
+              <w:bottom w:w="240" w:type="dxa"/>
+            </w:tcMar>
+            <w:tcW w:w="1425" w:type="dxa"/>
+            <w:vAlign w:val="center"/>
           </w:tcPr>
           <w:p>
             <w:pPr>
               <w:pBdr/>
-              <w:spacing w:after="120" w:before="120"/>
+              <w:spacing w:after="0" w:before="0" w:line="240"/>
               <w:ind/>
               <w:rPr/>
             </w:pPr>
             <w:r>
-              <w:t xml:space="preserve">JRE -</w:t>
+              <w:rPr>
+                <w:rFonts w:ascii="Arial" w:hAnsi="Arial" w:eastAsia="Arial" w:cs="Arial"/>
+                <w:b/>
+                <w:color w:val="1f1f1f"/>
+                <w:sz w:val="24"/>
+              </w:rPr>
+              <w:t xml:space="preserve">FAI</w:t>
             </w:r>
             <w:r/>
           </w:p>
         </w:tc>
         <w:tc>
           <w:tcPr>
-            <w:tcBorders/>
-            <w:tcW w:w="6227" w:type="dxa"/>
+            <w:tcBorders>
+              <w:top w:val="single" w:color="1f1f1f" w:sz="6" w:space="0"/>
+              <w:left w:val="single" w:color="1f1f1f" w:sz="6" w:space="0"/>
+              <w:bottom w:val="single" w:color="1f1f1f" w:sz="6" w:space="0"/>
+              <w:right w:val="single" w:color="1f1f1f" w:sz="6" w:space="0"/>
+            </w:tcBorders>
+            <w:tcMar>
+              <w:left w:w="0" w:type="dxa"/>
+              <w:top w:w="240" w:type="dxa"/>
+              <w:right w:w="0" w:type="dxa"/>
+              <w:bottom w:w="240" w:type="dxa"/>
+            </w:tcMar>
+            <w:tcW w:w="6945" w:type="dxa"/>
+            <w:vAlign w:val="center"/>
+          </w:tcPr>
+          <w:p>
+            <w:pPr>
+              <w:pBdr>
+                <w:top w:val="none" w:color="000000" w:sz="4" w:space="0"/>
+                <w:left w:val="none" w:color="000000" w:sz="4" w:space="0"/>
+                <w:bottom w:val="none" w:color="000000" w:sz="4" w:space="0"/>
+                <w:right w:val="none" w:color="000000" w:sz="4" w:space="0"/>
+              </w:pBdr>
+              <w:spacing w:after="0" w:before="0" w:line="276" w:lineRule="auto"/>
+              <w:ind w:right="0" w:firstLine="0" w:left="0"/>
+              <w:rPr/>
+            </w:pPr>
+            <w:r>
+              <w:rPr>
+                <w:rFonts w:ascii="Arial" w:hAnsi="Arial" w:eastAsia="Arial" w:cs="Arial"/>
+                <w:color w:val="1f1f1f"/>
+                <w:sz w:val="24"/>
+              </w:rPr>
+              <w:t xml:space="preserve">FAI - Centro de Ensino Superior em Gestão, Tecnologia e Educação </w:t>
+            </w:r>
+            <w:r/>
+          </w:p>
+        </w:tc>
+      </w:tr>
+      <w:tr>
+        <w:trPr/>
+        <w:tc>
+          <w:tcPr>
+            <w:tcBorders>
+              <w:top w:val="single" w:color="1f1f1f" w:sz="6" w:space="0"/>
+              <w:left w:val="single" w:color="1f1f1f" w:sz="6" w:space="0"/>
+              <w:bottom w:val="single" w:color="1f1f1f" w:sz="6" w:space="0"/>
+              <w:right w:val="single" w:color="1f1f1f" w:sz="6" w:space="0"/>
+            </w:tcBorders>
+            <w:tcMar>
+              <w:left w:w="0" w:type="dxa"/>
+              <w:top w:w="240" w:type="dxa"/>
+              <w:right w:w="180" w:type="dxa"/>
+              <w:bottom w:w="240" w:type="dxa"/>
+            </w:tcMar>
+            <w:tcW w:w="1425" w:type="dxa"/>
+            <w:vAlign w:val="center"/>
           </w:tcPr>
           <w:p>
             <w:pPr>
               <w:pBdr/>
-              <w:spacing w:after="120" w:before="120"/>
-              <w:ind/>
-              <w:rPr>
-                <w:i/>
-              </w:rPr>
-            </w:pPr>
-            <w:r>
-              <w:rPr>
-                <w:i/>
-              </w:rPr>
-              <w:t xml:space="preserve">Java Standard Runtime Environment</w:t>
-            </w:r>
-            <w:r>
-              <w:rPr>
-                <w:i/>
-              </w:rPr>
-            </w:r>
-            <w:r>
-              <w:rPr>
-                <w:i/>
-              </w:rPr>
-            </w:r>
-          </w:p>
-        </w:tc>
-      </w:tr>
-      <w:tr>
-        <w:trPr>
-          <w:trHeight w:val="632"/>
-        </w:trPr>
-        <w:tc>
-          <w:tcPr>
-            <w:tcBorders/>
-            <w:tcW w:w="1588" w:type="dxa"/>
-          </w:tcPr>
-          <w:p>
-            <w:pPr>
-              <w:pBdr/>
-              <w:spacing w:after="120" w:before="120"/>
+              <w:spacing w:after="0" w:before="0" w:line="240"/>
               <w:ind/>
               <w:rPr/>
             </w:pPr>
             <w:r>
-              <w:t xml:space="preserve">RAM -</w:t>
+              <w:rPr>
+                <w:rFonts w:ascii="Arial" w:hAnsi="Arial" w:eastAsia="Arial" w:cs="Arial"/>
+                <w:b/>
+                <w:color w:val="1f1f1f"/>
+                <w:sz w:val="24"/>
+              </w:rPr>
+              <w:t xml:space="preserve">FAITEC</w:t>
             </w:r>
             <w:r/>
           </w:p>
         </w:tc>
         <w:tc>
           <w:tcPr>
-            <w:tcBorders/>
-            <w:tcW w:w="6227" w:type="dxa"/>
+            <w:tcBorders>
+              <w:top w:val="single" w:color="1f1f1f" w:sz="6" w:space="0"/>
+              <w:left w:val="single" w:color="1f1f1f" w:sz="6" w:space="0"/>
+              <w:bottom w:val="single" w:color="1f1f1f" w:sz="6" w:space="0"/>
+              <w:right w:val="single" w:color="1f1f1f" w:sz="6" w:space="0"/>
+            </w:tcBorders>
+            <w:tcMar>
+              <w:left w:w="0" w:type="dxa"/>
+              <w:top w:w="240" w:type="dxa"/>
+              <w:right w:w="0" w:type="dxa"/>
+              <w:bottom w:w="240" w:type="dxa"/>
+            </w:tcMar>
+            <w:tcW w:w="6945" w:type="dxa"/>
+            <w:vAlign w:val="center"/>
+          </w:tcPr>
+          <w:p>
+            <w:pPr>
+              <w:pBdr>
+                <w:top w:val="none" w:color="000000" w:sz="4" w:space="0"/>
+                <w:left w:val="none" w:color="000000" w:sz="4" w:space="0"/>
+                <w:bottom w:val="none" w:color="000000" w:sz="4" w:space="0"/>
+                <w:right w:val="none" w:color="000000" w:sz="4" w:space="0"/>
+              </w:pBdr>
+              <w:spacing w:after="0" w:before="0" w:line="276" w:lineRule="auto"/>
+              <w:ind w:right="0" w:firstLine="0" w:left="0"/>
+              <w:rPr/>
+            </w:pPr>
+            <w:r>
+              <w:rPr>
+                <w:rFonts w:ascii="Arial" w:hAnsi="Arial" w:eastAsia="Arial" w:cs="Arial"/>
+                <w:color w:val="1f1f1f"/>
+                <w:sz w:val="24"/>
+              </w:rPr>
+              <w:t xml:space="preserve">Feira de Tecnologia e Empreendedorismo da FAI </w:t>
+            </w:r>
+            <w:r/>
+          </w:p>
+        </w:tc>
+      </w:tr>
+      <w:tr>
+        <w:trPr/>
+        <w:tc>
+          <w:tcPr>
+            <w:tcBorders>
+              <w:top w:val="single" w:color="1f1f1f" w:sz="6" w:space="0"/>
+              <w:left w:val="single" w:color="1f1f1f" w:sz="6" w:space="0"/>
+              <w:bottom w:val="single" w:color="1f1f1f" w:sz="6" w:space="0"/>
+              <w:right w:val="single" w:color="1f1f1f" w:sz="6" w:space="0"/>
+            </w:tcBorders>
+            <w:tcMar>
+              <w:left w:w="0" w:type="dxa"/>
+              <w:top w:w="240" w:type="dxa"/>
+              <w:right w:w="180" w:type="dxa"/>
+              <w:bottom w:w="240" w:type="dxa"/>
+            </w:tcMar>
+            <w:tcW w:w="1425" w:type="dxa"/>
+            <w:vAlign w:val="center"/>
           </w:tcPr>
           <w:p>
             <w:pPr>
               <w:pBdr/>
-              <w:spacing w:after="120" w:before="120"/>
-              <w:ind/>
-              <w:rPr>
-                <w:i/>
-              </w:rPr>
-            </w:pPr>
-            <w:r>
-              <w:rPr>
-                <w:i/>
-              </w:rPr>
-              <w:t xml:space="preserve">Random Access Memory</w:t>
-            </w:r>
-            <w:r>
-              <w:rPr>
-                <w:i/>
-              </w:rPr>
-            </w:r>
-            <w:r>
-              <w:rPr>
-                <w:i/>
-              </w:rPr>
-            </w:r>
-          </w:p>
-        </w:tc>
-      </w:tr>
-      <w:tr>
-        <w:trPr>
-          <w:trHeight w:val="632"/>
-        </w:trPr>
-        <w:tc>
-          <w:tcPr>
-            <w:tcBorders/>
-            <w:tcW w:w="1588" w:type="dxa"/>
-          </w:tcPr>
-          <w:p>
-            <w:pPr>
-              <w:pBdr/>
-              <w:spacing w:after="120" w:before="120"/>
+              <w:spacing w:after="0" w:before="0" w:line="240"/>
               <w:ind/>
               <w:rPr/>
             </w:pPr>
             <w:r>
-              <w:t xml:space="preserve">RH -</w:t>
+              <w:rPr>
+                <w:rFonts w:ascii="Arial" w:hAnsi="Arial" w:eastAsia="Arial" w:cs="Arial"/>
+                <w:b/>
+                <w:color w:val="1f1f1f"/>
+                <w:sz w:val="24"/>
+              </w:rPr>
+              <w:t xml:space="preserve">HTTP</w:t>
             </w:r>
             <w:r/>
           </w:p>
         </w:tc>
         <w:tc>
           <w:tcPr>
-            <w:tcBorders/>
-            <w:tcW w:w="6227" w:type="dxa"/>
+            <w:tcBorders>
+              <w:top w:val="single" w:color="1f1f1f" w:sz="6" w:space="0"/>
+              <w:left w:val="single" w:color="1f1f1f" w:sz="6" w:space="0"/>
+              <w:bottom w:val="single" w:color="1f1f1f" w:sz="6" w:space="0"/>
+              <w:right w:val="single" w:color="1f1f1f" w:sz="6" w:space="0"/>
+            </w:tcBorders>
+            <w:tcMar>
+              <w:left w:w="0" w:type="dxa"/>
+              <w:top w:w="240" w:type="dxa"/>
+              <w:right w:w="0" w:type="dxa"/>
+              <w:bottom w:w="240" w:type="dxa"/>
+            </w:tcMar>
+            <w:tcW w:w="6945" w:type="dxa"/>
+            <w:vAlign w:val="center"/>
           </w:tcPr>
           <w:p>
             <w:pPr>
-              <w:pBdr/>
-              <w:spacing w:after="120" w:before="120"/>
-              <w:ind/>
+              <w:pBdr>
+                <w:top w:val="none" w:color="000000" w:sz="4" w:space="0"/>
+                <w:left w:val="none" w:color="000000" w:sz="4" w:space="0"/>
+                <w:bottom w:val="none" w:color="000000" w:sz="4" w:space="0"/>
+                <w:right w:val="none" w:color="000000" w:sz="4" w:space="0"/>
+              </w:pBdr>
+              <w:spacing w:after="0" w:before="0" w:line="276" w:lineRule="auto"/>
+              <w:ind w:right="0" w:firstLine="0" w:left="0"/>
               <w:rPr/>
             </w:pPr>
             <w:r>
-              <w:t xml:space="preserve">Recurso de Hardware</w:t>
+              <w:rPr>
+                <w:rFonts w:ascii="Arial" w:hAnsi="Arial" w:eastAsia="Arial" w:cs="Arial"/>
+                <w:i/>
+                <w:color w:val="1f1f1f"/>
+                <w:sz w:val="24"/>
+              </w:rPr>
+              <w:t xml:space="preserve">Hypertext Transfer Protocol</w:t>
+            </w:r>
+            <w:r>
+              <w:rPr>
+                <w:rFonts w:ascii="Arial" w:hAnsi="Arial" w:eastAsia="Arial" w:cs="Arial"/>
+                <w:color w:val="1f1f1f"/>
+                <w:sz w:val="24"/>
+              </w:rPr>
+              <w:t xml:space="preserve"> </w:t>
             </w:r>
             <w:r/>
           </w:p>
         </w:tc>
       </w:tr>
       <w:tr>
-        <w:trPr>
-          <w:trHeight w:val="632"/>
-        </w:trPr>
+        <w:trPr/>
         <w:tc>
           <w:tcPr>
-            <w:tcBorders/>
-            <w:tcW w:w="1588" w:type="dxa"/>
+            <w:tcBorders>
+              <w:top w:val="single" w:color="1f1f1f" w:sz="6" w:space="0"/>
+              <w:left w:val="single" w:color="1f1f1f" w:sz="6" w:space="0"/>
+              <w:bottom w:val="single" w:color="1f1f1f" w:sz="6" w:space="0"/>
+              <w:right w:val="single" w:color="1f1f1f" w:sz="6" w:space="0"/>
+            </w:tcBorders>
+            <w:tcMar>
+              <w:left w:w="0" w:type="dxa"/>
+              <w:top w:w="240" w:type="dxa"/>
+              <w:right w:w="180" w:type="dxa"/>
+              <w:bottom w:w="240" w:type="dxa"/>
+            </w:tcMar>
+            <w:tcW w:w="1425" w:type="dxa"/>
+            <w:vAlign w:val="center"/>
           </w:tcPr>
           <w:p>
             <w:pPr>
               <w:pBdr/>
-              <w:spacing w:after="120" w:before="120"/>
+              <w:spacing w:after="0" w:before="0" w:line="240"/>
               <w:ind/>
               <w:rPr/>
             </w:pPr>
             <w:r>
-              <w:t xml:space="preserve">RS -</w:t>
+              <w:rPr>
+                <w:rFonts w:ascii="Arial" w:hAnsi="Arial" w:eastAsia="Arial" w:cs="Arial"/>
+                <w:b/>
+                <w:color w:val="1f1f1f"/>
+                <w:sz w:val="24"/>
+              </w:rPr>
+              <w:t xml:space="preserve">HTTPS</w:t>
             </w:r>
             <w:r/>
           </w:p>
         </w:tc>
         <w:tc>
           <w:tcPr>
-            <w:tcBorders/>
-            <w:tcW w:w="6227" w:type="dxa"/>
+            <w:tcBorders>
+              <w:top w:val="single" w:color="1f1f1f" w:sz="6" w:space="0"/>
+              <w:left w:val="single" w:color="1f1f1f" w:sz="6" w:space="0"/>
+              <w:bottom w:val="single" w:color="1f1f1f" w:sz="6" w:space="0"/>
+              <w:right w:val="single" w:color="1f1f1f" w:sz="6" w:space="0"/>
+            </w:tcBorders>
+            <w:tcMar>
+              <w:left w:w="0" w:type="dxa"/>
+              <w:top w:w="240" w:type="dxa"/>
+              <w:right w:w="0" w:type="dxa"/>
+              <w:bottom w:w="240" w:type="dxa"/>
+            </w:tcMar>
+            <w:tcW w:w="6945" w:type="dxa"/>
+            <w:vAlign w:val="center"/>
           </w:tcPr>
           <w:p>
             <w:pPr>
-              <w:pBdr/>
-              <w:spacing w:after="120" w:before="120"/>
-              <w:ind/>
+              <w:pBdr>
+                <w:top w:val="none" w:color="000000" w:sz="4" w:space="0"/>
+                <w:left w:val="none" w:color="000000" w:sz="4" w:space="0"/>
+                <w:bottom w:val="none" w:color="000000" w:sz="4" w:space="0"/>
+                <w:right w:val="none" w:color="000000" w:sz="4" w:space="0"/>
+              </w:pBdr>
+              <w:spacing w:after="0" w:before="0" w:line="276" w:lineRule="auto"/>
+              <w:ind w:right="0" w:firstLine="0" w:left="0"/>
               <w:rPr/>
             </w:pPr>
             <w:r>
-              <w:t xml:space="preserve">Recurso de Software</w:t>
+              <w:rPr>
+                <w:rFonts w:ascii="Arial" w:hAnsi="Arial" w:eastAsia="Arial" w:cs="Arial"/>
+                <w:i/>
+                <w:color w:val="1f1f1f"/>
+                <w:sz w:val="24"/>
+              </w:rPr>
+              <w:t xml:space="preserve">Hypertext Transfer Protocol Secure</w:t>
+            </w:r>
+            <w:r>
+              <w:rPr>
+                <w:rFonts w:ascii="Arial" w:hAnsi="Arial" w:eastAsia="Arial" w:cs="Arial"/>
+                <w:color w:val="1f1f1f"/>
+                <w:sz w:val="24"/>
+              </w:rPr>
+              <w:t xml:space="preserve"> </w:t>
             </w:r>
             <w:r/>
           </w:p>
         </w:tc>
       </w:tr>
       <w:tr>
-        <w:trPr>
-          <w:trHeight w:val="632"/>
-        </w:trPr>
+        <w:trPr/>
         <w:tc>
           <w:tcPr>
-            <w:tcBorders/>
-            <w:tcW w:w="1588" w:type="dxa"/>
+            <w:tcBorders>
+              <w:top w:val="single" w:color="1f1f1f" w:sz="6" w:space="0"/>
+              <w:left w:val="single" w:color="1f1f1f" w:sz="6" w:space="0"/>
+              <w:bottom w:val="single" w:color="1f1f1f" w:sz="6" w:space="0"/>
+              <w:right w:val="single" w:color="1f1f1f" w:sz="6" w:space="0"/>
+            </w:tcBorders>
+            <w:tcMar>
+              <w:left w:w="0" w:type="dxa"/>
+              <w:top w:w="240" w:type="dxa"/>
+              <w:right w:w="180" w:type="dxa"/>
+              <w:bottom w:w="240" w:type="dxa"/>
+            </w:tcMar>
+            <w:tcW w:w="1425" w:type="dxa"/>
+            <w:vAlign w:val="center"/>
           </w:tcPr>
           <w:p>
             <w:pPr>
               <w:pBdr/>
-              <w:spacing w:after="120" w:before="120"/>
+              <w:spacing w:after="0" w:before="0" w:line="240"/>
               <w:ind/>
               <w:rPr/>
             </w:pPr>
             <w:r>
-              <w:t xml:space="preserve">UML - </w:t>
+              <w:rPr>
+                <w:rFonts w:ascii="Arial" w:hAnsi="Arial" w:eastAsia="Arial" w:cs="Arial"/>
+                <w:b/>
+                <w:color w:val="1f1f1f"/>
+                <w:sz w:val="24"/>
+              </w:rPr>
+              <w:t xml:space="preserve">JRE</w:t>
             </w:r>
             <w:r/>
           </w:p>
         </w:tc>
         <w:tc>
           <w:tcPr>
-            <w:tcBorders/>
-            <w:tcW w:w="6227" w:type="dxa"/>
+            <w:tcBorders>
+              <w:top w:val="single" w:color="1f1f1f" w:sz="6" w:space="0"/>
+              <w:left w:val="single" w:color="1f1f1f" w:sz="6" w:space="0"/>
+              <w:bottom w:val="single" w:color="1f1f1f" w:sz="6" w:space="0"/>
+              <w:right w:val="single" w:color="1f1f1f" w:sz="6" w:space="0"/>
+            </w:tcBorders>
+            <w:tcMar>
+              <w:left w:w="0" w:type="dxa"/>
+              <w:top w:w="240" w:type="dxa"/>
+              <w:right w:w="0" w:type="dxa"/>
+              <w:bottom w:w="240" w:type="dxa"/>
+            </w:tcMar>
+            <w:tcW w:w="6945" w:type="dxa"/>
+            <w:vAlign w:val="center"/>
+          </w:tcPr>
+          <w:p>
+            <w:pPr>
+              <w:pBdr>
+                <w:top w:val="none" w:color="000000" w:sz="4" w:space="0"/>
+                <w:left w:val="none" w:color="000000" w:sz="4" w:space="0"/>
+                <w:bottom w:val="none" w:color="000000" w:sz="4" w:space="0"/>
+                <w:right w:val="none" w:color="000000" w:sz="4" w:space="0"/>
+              </w:pBdr>
+              <w:spacing w:after="0" w:before="0" w:line="276" w:lineRule="auto"/>
+              <w:ind w:right="0" w:firstLine="0" w:left="0"/>
+              <w:rPr/>
+            </w:pPr>
+            <w:r>
+              <w:rPr>
+                <w:rFonts w:ascii="Arial" w:hAnsi="Arial" w:eastAsia="Arial" w:cs="Arial"/>
+                <w:i/>
+                <w:color w:val="1f1f1f"/>
+                <w:sz w:val="24"/>
+              </w:rPr>
+              <w:t xml:space="preserve">Java Standard Runtime Environment</w:t>
+            </w:r>
+            <w:r>
+              <w:rPr>
+                <w:rFonts w:ascii="Arial" w:hAnsi="Arial" w:eastAsia="Arial" w:cs="Arial"/>
+                <w:color w:val="1f1f1f"/>
+                <w:sz w:val="24"/>
+              </w:rPr>
+              <w:t xml:space="preserve"> </w:t>
+            </w:r>
+            <w:r/>
+          </w:p>
+        </w:tc>
+      </w:tr>
+      <w:tr>
+        <w:trPr/>
+        <w:tc>
+          <w:tcPr>
+            <w:tcBorders>
+              <w:top w:val="single" w:color="1f1f1f" w:sz="6" w:space="0"/>
+              <w:left w:val="single" w:color="1f1f1f" w:sz="6" w:space="0"/>
+              <w:bottom w:val="single" w:color="1f1f1f" w:sz="6" w:space="0"/>
+              <w:right w:val="single" w:color="1f1f1f" w:sz="6" w:space="0"/>
+            </w:tcBorders>
+            <w:tcMar>
+              <w:left w:w="0" w:type="dxa"/>
+              <w:top w:w="240" w:type="dxa"/>
+              <w:right w:w="180" w:type="dxa"/>
+              <w:bottom w:w="240" w:type="dxa"/>
+            </w:tcMar>
+            <w:tcW w:w="1425" w:type="dxa"/>
+            <w:vAlign w:val="center"/>
           </w:tcPr>
           <w:p>
             <w:pPr>
               <w:pBdr/>
-              <w:spacing w:after="120" w:before="120"/>
+              <w:spacing w:after="0" w:before="0" w:line="240"/>
               <w:ind/>
-              <w:rPr>
-                <w:i/>
-              </w:rPr>
+              <w:rPr/>
             </w:pPr>
             <w:r>
               <w:rPr>
+                <w:rFonts w:ascii="Arial" w:hAnsi="Arial" w:eastAsia="Arial" w:cs="Arial"/>
+                <w:b/>
+                <w:color w:val="1f1f1f"/>
+                <w:sz w:val="24"/>
+              </w:rPr>
+              <w:t xml:space="preserve">JWT</w:t>
+            </w:r>
+            <w:r/>
+          </w:p>
+        </w:tc>
+        <w:tc>
+          <w:tcPr>
+            <w:tcBorders>
+              <w:top w:val="single" w:color="1f1f1f" w:sz="6" w:space="0"/>
+              <w:left w:val="single" w:color="1f1f1f" w:sz="6" w:space="0"/>
+              <w:bottom w:val="single" w:color="1f1f1f" w:sz="6" w:space="0"/>
+              <w:right w:val="single" w:color="1f1f1f" w:sz="6" w:space="0"/>
+            </w:tcBorders>
+            <w:tcMar>
+              <w:left w:w="0" w:type="dxa"/>
+              <w:top w:w="240" w:type="dxa"/>
+              <w:right w:w="0" w:type="dxa"/>
+              <w:bottom w:w="240" w:type="dxa"/>
+            </w:tcMar>
+            <w:tcW w:w="6945" w:type="dxa"/>
+            <w:vAlign w:val="center"/>
+          </w:tcPr>
+          <w:p>
+            <w:pPr>
+              <w:pBdr>
+                <w:top w:val="none" w:color="000000" w:sz="4" w:space="0"/>
+                <w:left w:val="none" w:color="000000" w:sz="4" w:space="0"/>
+                <w:bottom w:val="none" w:color="000000" w:sz="4" w:space="0"/>
+                <w:right w:val="none" w:color="000000" w:sz="4" w:space="0"/>
+              </w:pBdr>
+              <w:spacing w:after="0" w:before="0" w:line="276" w:lineRule="auto"/>
+              <w:ind w:right="0" w:firstLine="0" w:left="0"/>
+              <w:rPr/>
+            </w:pPr>
+            <w:r>
+              <w:rPr>
+                <w:rFonts w:ascii="Arial" w:hAnsi="Arial" w:eastAsia="Arial" w:cs="Arial"/>
                 <w:i/>
+                <w:color w:val="1f1f1f"/>
+                <w:sz w:val="24"/>
+              </w:rPr>
+              <w:t xml:space="preserve">JSON Web Token</w:t>
+            </w:r>
+            <w:r>
+              <w:rPr>
+                <w:rFonts w:ascii="Arial" w:hAnsi="Arial" w:eastAsia="Arial" w:cs="Arial"/>
+                <w:color w:val="1f1f1f"/>
+                <w:sz w:val="24"/>
+              </w:rPr>
+              <w:t xml:space="preserve"> </w:t>
+            </w:r>
+            <w:r/>
+          </w:p>
+        </w:tc>
+      </w:tr>
+      <w:tr>
+        <w:trPr/>
+        <w:tc>
+          <w:tcPr>
+            <w:tcBorders>
+              <w:top w:val="single" w:color="1f1f1f" w:sz="6" w:space="0"/>
+              <w:left w:val="single" w:color="1f1f1f" w:sz="6" w:space="0"/>
+              <w:bottom w:val="single" w:color="1f1f1f" w:sz="6" w:space="0"/>
+              <w:right w:val="single" w:color="1f1f1f" w:sz="6" w:space="0"/>
+            </w:tcBorders>
+            <w:tcMar>
+              <w:left w:w="0" w:type="dxa"/>
+              <w:top w:w="240" w:type="dxa"/>
+              <w:right w:w="180" w:type="dxa"/>
+              <w:bottom w:w="240" w:type="dxa"/>
+            </w:tcMar>
+            <w:tcW w:w="1425" w:type="dxa"/>
+            <w:vAlign w:val="center"/>
+          </w:tcPr>
+          <w:p>
+            <w:pPr>
+              <w:pBdr/>
+              <w:spacing w:after="0" w:before="0" w:line="240"/>
+              <w:ind/>
+              <w:rPr/>
+            </w:pPr>
+            <w:r>
+              <w:rPr>
+                <w:rFonts w:ascii="Arial" w:hAnsi="Arial" w:eastAsia="Arial" w:cs="Arial"/>
+                <w:b/>
+                <w:color w:val="1f1f1f"/>
+                <w:sz w:val="24"/>
+              </w:rPr>
+              <w:t xml:space="preserve">LGPD</w:t>
+            </w:r>
+            <w:r/>
+          </w:p>
+        </w:tc>
+        <w:tc>
+          <w:tcPr>
+            <w:tcBorders>
+              <w:top w:val="single" w:color="1f1f1f" w:sz="6" w:space="0"/>
+              <w:left w:val="single" w:color="1f1f1f" w:sz="6" w:space="0"/>
+              <w:bottom w:val="single" w:color="1f1f1f" w:sz="6" w:space="0"/>
+              <w:right w:val="single" w:color="1f1f1f" w:sz="6" w:space="0"/>
+            </w:tcBorders>
+            <w:tcMar>
+              <w:left w:w="0" w:type="dxa"/>
+              <w:top w:w="240" w:type="dxa"/>
+              <w:right w:w="0" w:type="dxa"/>
+              <w:bottom w:w="240" w:type="dxa"/>
+            </w:tcMar>
+            <w:tcW w:w="6945" w:type="dxa"/>
+            <w:vAlign w:val="center"/>
+          </w:tcPr>
+          <w:p>
+            <w:pPr>
+              <w:pBdr>
+                <w:top w:val="none" w:color="000000" w:sz="4" w:space="0"/>
+                <w:left w:val="none" w:color="000000" w:sz="4" w:space="0"/>
+                <w:bottom w:val="none" w:color="000000" w:sz="4" w:space="0"/>
+                <w:right w:val="none" w:color="000000" w:sz="4" w:space="0"/>
+              </w:pBdr>
+              <w:spacing w:after="0" w:before="0" w:line="276" w:lineRule="auto"/>
+              <w:ind w:right="0" w:firstLine="0" w:left="0"/>
+              <w:rPr/>
+            </w:pPr>
+            <w:r>
+              <w:rPr>
+                <w:rFonts w:ascii="Arial" w:hAnsi="Arial" w:eastAsia="Arial" w:cs="Arial"/>
+                <w:color w:val="1f1f1f"/>
+                <w:sz w:val="24"/>
+              </w:rPr>
+              <w:t xml:space="preserve">Lei Geral de Proteção de Dados Pessoais </w:t>
+            </w:r>
+            <w:r/>
+          </w:p>
+        </w:tc>
+      </w:tr>
+      <w:tr>
+        <w:trPr/>
+        <w:tc>
+          <w:tcPr>
+            <w:tcBorders>
+              <w:top w:val="single" w:color="1f1f1f" w:sz="6" w:space="0"/>
+              <w:left w:val="single" w:color="1f1f1f" w:sz="6" w:space="0"/>
+              <w:bottom w:val="single" w:color="1f1f1f" w:sz="6" w:space="0"/>
+              <w:right w:val="single" w:color="1f1f1f" w:sz="6" w:space="0"/>
+            </w:tcBorders>
+            <w:tcMar>
+              <w:left w:w="0" w:type="dxa"/>
+              <w:top w:w="240" w:type="dxa"/>
+              <w:right w:w="180" w:type="dxa"/>
+              <w:bottom w:w="240" w:type="dxa"/>
+            </w:tcMar>
+            <w:tcW w:w="1425" w:type="dxa"/>
+            <w:vAlign w:val="center"/>
+          </w:tcPr>
+          <w:p>
+            <w:pPr>
+              <w:pBdr/>
+              <w:spacing w:after="0" w:before="0" w:line="240"/>
+              <w:ind/>
+              <w:rPr/>
+            </w:pPr>
+            <w:r>
+              <w:rPr>
+                <w:rFonts w:ascii="Arial" w:hAnsi="Arial" w:eastAsia="Arial" w:cs="Arial"/>
+                <w:b/>
+                <w:color w:val="1f1f1f"/>
+                <w:sz w:val="24"/>
+              </w:rPr>
+              <w:t xml:space="preserve">MFA</w:t>
+            </w:r>
+            <w:r/>
+          </w:p>
+        </w:tc>
+        <w:tc>
+          <w:tcPr>
+            <w:tcBorders>
+              <w:top w:val="single" w:color="1f1f1f" w:sz="6" w:space="0"/>
+              <w:left w:val="single" w:color="1f1f1f" w:sz="6" w:space="0"/>
+              <w:bottom w:val="single" w:color="1f1f1f" w:sz="6" w:space="0"/>
+              <w:right w:val="single" w:color="1f1f1f" w:sz="6" w:space="0"/>
+            </w:tcBorders>
+            <w:tcMar>
+              <w:left w:w="0" w:type="dxa"/>
+              <w:top w:w="240" w:type="dxa"/>
+              <w:right w:w="0" w:type="dxa"/>
+              <w:bottom w:w="240" w:type="dxa"/>
+            </w:tcMar>
+            <w:tcW w:w="6945" w:type="dxa"/>
+            <w:vAlign w:val="center"/>
+          </w:tcPr>
+          <w:p>
+            <w:pPr>
+              <w:pBdr>
+                <w:top w:val="none" w:color="000000" w:sz="4" w:space="0"/>
+                <w:left w:val="none" w:color="000000" w:sz="4" w:space="0"/>
+                <w:bottom w:val="none" w:color="000000" w:sz="4" w:space="0"/>
+                <w:right w:val="none" w:color="000000" w:sz="4" w:space="0"/>
+              </w:pBdr>
+              <w:spacing w:after="0" w:before="0" w:line="276" w:lineRule="auto"/>
+              <w:ind w:right="0" w:firstLine="0" w:left="0"/>
+              <w:rPr/>
+            </w:pPr>
+            <w:r>
+              <w:rPr>
+                <w:rFonts w:ascii="Arial" w:hAnsi="Arial" w:eastAsia="Arial" w:cs="Arial"/>
+                <w:i/>
+                <w:color w:val="1f1f1f"/>
+                <w:sz w:val="24"/>
+              </w:rPr>
+              <w:t xml:space="preserve">Multi-Factor Authentication</w:t>
+            </w:r>
+            <w:r>
+              <w:rPr>
+                <w:rFonts w:ascii="Arial" w:hAnsi="Arial" w:eastAsia="Arial" w:cs="Arial"/>
+                <w:color w:val="1f1f1f"/>
+                <w:sz w:val="24"/>
+              </w:rPr>
+              <w:t xml:space="preserve"> (Autenticação Multifator) </w:t>
+            </w:r>
+            <w:r/>
+          </w:p>
+        </w:tc>
+      </w:tr>
+      <w:tr>
+        <w:trPr/>
+        <w:tc>
+          <w:tcPr>
+            <w:tcBorders>
+              <w:top w:val="single" w:color="1f1f1f" w:sz="6" w:space="0"/>
+              <w:left w:val="single" w:color="1f1f1f" w:sz="6" w:space="0"/>
+              <w:bottom w:val="single" w:color="1f1f1f" w:sz="6" w:space="0"/>
+              <w:right w:val="single" w:color="1f1f1f" w:sz="6" w:space="0"/>
+            </w:tcBorders>
+            <w:tcMar>
+              <w:left w:w="0" w:type="dxa"/>
+              <w:top w:w="240" w:type="dxa"/>
+              <w:right w:w="180" w:type="dxa"/>
+              <w:bottom w:w="240" w:type="dxa"/>
+            </w:tcMar>
+            <w:tcW w:w="1425" w:type="dxa"/>
+            <w:vAlign w:val="center"/>
+          </w:tcPr>
+          <w:p>
+            <w:pPr>
+              <w:pBdr/>
+              <w:spacing w:after="0" w:before="0" w:line="240"/>
+              <w:ind/>
+              <w:rPr/>
+            </w:pPr>
+            <w:r>
+              <w:rPr>
+                <w:rFonts w:ascii="Arial" w:hAnsi="Arial" w:eastAsia="Arial" w:cs="Arial"/>
+                <w:b/>
+                <w:color w:val="1f1f1f"/>
+                <w:sz w:val="24"/>
+              </w:rPr>
+              <w:t xml:space="preserve">PWA</w:t>
+            </w:r>
+            <w:r/>
+          </w:p>
+        </w:tc>
+        <w:tc>
+          <w:tcPr>
+            <w:tcBorders>
+              <w:top w:val="single" w:color="1f1f1f" w:sz="6" w:space="0"/>
+              <w:left w:val="single" w:color="1f1f1f" w:sz="6" w:space="0"/>
+              <w:bottom w:val="single" w:color="1f1f1f" w:sz="6" w:space="0"/>
+              <w:right w:val="single" w:color="1f1f1f" w:sz="6" w:space="0"/>
+            </w:tcBorders>
+            <w:tcMar>
+              <w:left w:w="0" w:type="dxa"/>
+              <w:top w:w="240" w:type="dxa"/>
+              <w:right w:w="0" w:type="dxa"/>
+              <w:bottom w:w="240" w:type="dxa"/>
+            </w:tcMar>
+            <w:tcW w:w="6945" w:type="dxa"/>
+            <w:vAlign w:val="center"/>
+          </w:tcPr>
+          <w:p>
+            <w:pPr>
+              <w:pBdr>
+                <w:top w:val="none" w:color="000000" w:sz="4" w:space="0"/>
+                <w:left w:val="none" w:color="000000" w:sz="4" w:space="0"/>
+                <w:bottom w:val="none" w:color="000000" w:sz="4" w:space="0"/>
+                <w:right w:val="none" w:color="000000" w:sz="4" w:space="0"/>
+              </w:pBdr>
+              <w:spacing w:after="0" w:before="0" w:line="276" w:lineRule="auto"/>
+              <w:ind w:right="0" w:firstLine="0" w:left="0"/>
+              <w:rPr/>
+            </w:pPr>
+            <w:r>
+              <w:rPr>
+                <w:rFonts w:ascii="Arial" w:hAnsi="Arial" w:eastAsia="Arial" w:cs="Arial"/>
+                <w:i/>
+                <w:color w:val="1f1f1f"/>
+                <w:sz w:val="24"/>
+              </w:rPr>
+              <w:t xml:space="preserve">Progressive Web App</w:t>
+            </w:r>
+            <w:r>
+              <w:rPr>
+                <w:rFonts w:ascii="Arial" w:hAnsi="Arial" w:eastAsia="Arial" w:cs="Arial"/>
+                <w:color w:val="1f1f1f"/>
+                <w:sz w:val="24"/>
+              </w:rPr>
+              <w:t xml:space="preserve"> </w:t>
+            </w:r>
+            <w:r/>
+          </w:p>
+        </w:tc>
+      </w:tr>
+      <w:tr>
+        <w:trPr/>
+        <w:tc>
+          <w:tcPr>
+            <w:tcBorders>
+              <w:top w:val="single" w:color="1f1f1f" w:sz="6" w:space="0"/>
+              <w:left w:val="single" w:color="1f1f1f" w:sz="6" w:space="0"/>
+              <w:bottom w:val="single" w:color="1f1f1f" w:sz="6" w:space="0"/>
+              <w:right w:val="single" w:color="1f1f1f" w:sz="6" w:space="0"/>
+            </w:tcBorders>
+            <w:tcMar>
+              <w:left w:w="0" w:type="dxa"/>
+              <w:top w:w="240" w:type="dxa"/>
+              <w:right w:w="180" w:type="dxa"/>
+              <w:bottom w:w="240" w:type="dxa"/>
+            </w:tcMar>
+            <w:tcW w:w="1425" w:type="dxa"/>
+            <w:vAlign w:val="center"/>
+          </w:tcPr>
+          <w:p>
+            <w:pPr>
+              <w:pBdr/>
+              <w:spacing w:after="0" w:before="0" w:line="240"/>
+              <w:ind/>
+              <w:rPr/>
+            </w:pPr>
+            <w:r>
+              <w:rPr>
+                <w:rFonts w:ascii="Arial" w:hAnsi="Arial" w:eastAsia="Arial" w:cs="Arial"/>
+                <w:b/>
+                <w:color w:val="1f1f1f"/>
+                <w:sz w:val="24"/>
+              </w:rPr>
+              <w:t xml:space="preserve">RAM</w:t>
+            </w:r>
+            <w:r/>
+          </w:p>
+        </w:tc>
+        <w:tc>
+          <w:tcPr>
+            <w:tcBorders>
+              <w:top w:val="single" w:color="1f1f1f" w:sz="6" w:space="0"/>
+              <w:left w:val="single" w:color="1f1f1f" w:sz="6" w:space="0"/>
+              <w:bottom w:val="single" w:color="1f1f1f" w:sz="6" w:space="0"/>
+              <w:right w:val="single" w:color="1f1f1f" w:sz="6" w:space="0"/>
+            </w:tcBorders>
+            <w:tcMar>
+              <w:left w:w="0" w:type="dxa"/>
+              <w:top w:w="240" w:type="dxa"/>
+              <w:right w:w="0" w:type="dxa"/>
+              <w:bottom w:w="240" w:type="dxa"/>
+            </w:tcMar>
+            <w:tcW w:w="6945" w:type="dxa"/>
+            <w:vAlign w:val="center"/>
+          </w:tcPr>
+          <w:p>
+            <w:pPr>
+              <w:pBdr>
+                <w:top w:val="none" w:color="000000" w:sz="4" w:space="0"/>
+                <w:left w:val="none" w:color="000000" w:sz="4" w:space="0"/>
+                <w:bottom w:val="none" w:color="000000" w:sz="4" w:space="0"/>
+                <w:right w:val="none" w:color="000000" w:sz="4" w:space="0"/>
+              </w:pBdr>
+              <w:spacing w:after="0" w:before="0" w:line="276" w:lineRule="auto"/>
+              <w:ind w:right="0" w:firstLine="0" w:left="0"/>
+              <w:rPr/>
+            </w:pPr>
+            <w:r>
+              <w:rPr>
+                <w:rFonts w:ascii="Arial" w:hAnsi="Arial" w:eastAsia="Arial" w:cs="Arial"/>
+                <w:i/>
+                <w:color w:val="1f1f1f"/>
+                <w:sz w:val="24"/>
+              </w:rPr>
+              <w:t xml:space="preserve">Random Access Memory</w:t>
+            </w:r>
+            <w:r>
+              <w:rPr>
+                <w:rFonts w:ascii="Arial" w:hAnsi="Arial" w:eastAsia="Arial" w:cs="Arial"/>
+                <w:color w:val="1f1f1f"/>
+                <w:sz w:val="24"/>
+              </w:rPr>
+              <w:t xml:space="preserve"> </w:t>
+            </w:r>
+            <w:r/>
+          </w:p>
+        </w:tc>
+      </w:tr>
+      <w:tr>
+        <w:trPr/>
+        <w:tc>
+          <w:tcPr>
+            <w:tcBorders>
+              <w:top w:val="single" w:color="1f1f1f" w:sz="6" w:space="0"/>
+              <w:left w:val="single" w:color="1f1f1f" w:sz="6" w:space="0"/>
+              <w:bottom w:val="single" w:color="1f1f1f" w:sz="6" w:space="0"/>
+              <w:right w:val="single" w:color="1f1f1f" w:sz="6" w:space="0"/>
+            </w:tcBorders>
+            <w:tcMar>
+              <w:left w:w="0" w:type="dxa"/>
+              <w:top w:w="240" w:type="dxa"/>
+              <w:right w:w="180" w:type="dxa"/>
+              <w:bottom w:w="240" w:type="dxa"/>
+            </w:tcMar>
+            <w:tcW w:w="1425" w:type="dxa"/>
+            <w:vAlign w:val="center"/>
+          </w:tcPr>
+          <w:p>
+            <w:pPr>
+              <w:pBdr/>
+              <w:spacing w:after="0" w:before="0" w:line="240"/>
+              <w:ind/>
+              <w:rPr/>
+            </w:pPr>
+            <w:r>
+              <w:rPr>
+                <w:rFonts w:ascii="Arial" w:hAnsi="Arial" w:eastAsia="Arial" w:cs="Arial"/>
+                <w:b/>
+                <w:color w:val="1f1f1f"/>
+                <w:sz w:val="24"/>
+              </w:rPr>
+              <w:t xml:space="preserve">REST</w:t>
+            </w:r>
+            <w:r/>
+          </w:p>
+        </w:tc>
+        <w:tc>
+          <w:tcPr>
+            <w:tcBorders>
+              <w:top w:val="single" w:color="1f1f1f" w:sz="6" w:space="0"/>
+              <w:left w:val="single" w:color="1f1f1f" w:sz="6" w:space="0"/>
+              <w:bottom w:val="single" w:color="1f1f1f" w:sz="6" w:space="0"/>
+              <w:right w:val="single" w:color="1f1f1f" w:sz="6" w:space="0"/>
+            </w:tcBorders>
+            <w:tcMar>
+              <w:left w:w="0" w:type="dxa"/>
+              <w:top w:w="240" w:type="dxa"/>
+              <w:right w:w="0" w:type="dxa"/>
+              <w:bottom w:w="240" w:type="dxa"/>
+            </w:tcMar>
+            <w:tcW w:w="6945" w:type="dxa"/>
+            <w:vAlign w:val="center"/>
+          </w:tcPr>
+          <w:p>
+            <w:pPr>
+              <w:pBdr>
+                <w:top w:val="none" w:color="000000" w:sz="4" w:space="0"/>
+                <w:left w:val="none" w:color="000000" w:sz="4" w:space="0"/>
+                <w:bottom w:val="none" w:color="000000" w:sz="4" w:space="0"/>
+                <w:right w:val="none" w:color="000000" w:sz="4" w:space="0"/>
+              </w:pBdr>
+              <w:spacing w:after="0" w:before="0" w:line="276" w:lineRule="auto"/>
+              <w:ind w:right="0" w:firstLine="0" w:left="0"/>
+              <w:rPr/>
+            </w:pPr>
+            <w:r>
+              <w:rPr>
+                <w:rFonts w:ascii="Arial" w:hAnsi="Arial" w:eastAsia="Arial" w:cs="Arial"/>
+                <w:i/>
+                <w:color w:val="1f1f1f"/>
+                <w:sz w:val="24"/>
+              </w:rPr>
+              <w:t xml:space="preserve">Representational State Transfer</w:t>
+            </w:r>
+            <w:r>
+              <w:rPr>
+                <w:rFonts w:ascii="Arial" w:hAnsi="Arial" w:eastAsia="Arial" w:cs="Arial"/>
+                <w:color w:val="1f1f1f"/>
+                <w:sz w:val="24"/>
+              </w:rPr>
+              <w:t xml:space="preserve"> </w:t>
+            </w:r>
+            <w:r/>
+          </w:p>
+        </w:tc>
+      </w:tr>
+      <w:tr>
+        <w:trPr/>
+        <w:tc>
+          <w:tcPr>
+            <w:tcBorders>
+              <w:top w:val="single" w:color="1f1f1f" w:sz="6" w:space="0"/>
+              <w:left w:val="single" w:color="1f1f1f" w:sz="6" w:space="0"/>
+              <w:bottom w:val="single" w:color="1f1f1f" w:sz="6" w:space="0"/>
+              <w:right w:val="single" w:color="1f1f1f" w:sz="6" w:space="0"/>
+            </w:tcBorders>
+            <w:tcMar>
+              <w:left w:w="0" w:type="dxa"/>
+              <w:top w:w="240" w:type="dxa"/>
+              <w:right w:w="180" w:type="dxa"/>
+              <w:bottom w:w="240" w:type="dxa"/>
+            </w:tcMar>
+            <w:tcW w:w="1425" w:type="dxa"/>
+            <w:vAlign w:val="center"/>
+          </w:tcPr>
+          <w:p>
+            <w:pPr>
+              <w:pBdr/>
+              <w:spacing w:after="0" w:before="0" w:line="240"/>
+              <w:ind/>
+              <w:rPr/>
+            </w:pPr>
+            <w:r>
+              <w:rPr>
+                <w:rFonts w:ascii="Arial" w:hAnsi="Arial" w:eastAsia="Arial" w:cs="Arial"/>
+                <w:b/>
+                <w:color w:val="1f1f1f"/>
+                <w:sz w:val="24"/>
+              </w:rPr>
+              <w:t xml:space="preserve">RH</w:t>
+            </w:r>
+            <w:r/>
+          </w:p>
+        </w:tc>
+        <w:tc>
+          <w:tcPr>
+            <w:tcBorders>
+              <w:top w:val="single" w:color="1f1f1f" w:sz="6" w:space="0"/>
+              <w:left w:val="single" w:color="1f1f1f" w:sz="6" w:space="0"/>
+              <w:bottom w:val="single" w:color="1f1f1f" w:sz="6" w:space="0"/>
+              <w:right w:val="single" w:color="1f1f1f" w:sz="6" w:space="0"/>
+            </w:tcBorders>
+            <w:tcMar>
+              <w:left w:w="0" w:type="dxa"/>
+              <w:top w:w="240" w:type="dxa"/>
+              <w:right w:w="0" w:type="dxa"/>
+              <w:bottom w:w="240" w:type="dxa"/>
+            </w:tcMar>
+            <w:tcW w:w="6945" w:type="dxa"/>
+            <w:vAlign w:val="center"/>
+          </w:tcPr>
+          <w:p>
+            <w:pPr>
+              <w:pBdr>
+                <w:top w:val="none" w:color="000000" w:sz="4" w:space="0"/>
+                <w:left w:val="none" w:color="000000" w:sz="4" w:space="0"/>
+                <w:bottom w:val="none" w:color="000000" w:sz="4" w:space="0"/>
+                <w:right w:val="none" w:color="000000" w:sz="4" w:space="0"/>
+              </w:pBdr>
+              <w:spacing w:after="0" w:before="0" w:line="276" w:lineRule="auto"/>
+              <w:ind w:right="0" w:firstLine="0" w:left="0"/>
+              <w:rPr/>
+            </w:pPr>
+            <w:r>
+              <w:rPr>
+                <w:rFonts w:ascii="Arial" w:hAnsi="Arial" w:eastAsia="Arial" w:cs="Arial"/>
+                <w:color w:val="1f1f1f"/>
+                <w:sz w:val="24"/>
+              </w:rPr>
+              <w:t xml:space="preserve">Recurso de Hardware </w:t>
+            </w:r>
+            <w:r/>
+          </w:p>
+        </w:tc>
+      </w:tr>
+      <w:tr>
+        <w:trPr/>
+        <w:tc>
+          <w:tcPr>
+            <w:tcBorders>
+              <w:top w:val="single" w:color="1f1f1f" w:sz="6" w:space="0"/>
+              <w:left w:val="single" w:color="1f1f1f" w:sz="6" w:space="0"/>
+              <w:bottom w:val="single" w:color="1f1f1f" w:sz="6" w:space="0"/>
+              <w:right w:val="single" w:color="1f1f1f" w:sz="6" w:space="0"/>
+            </w:tcBorders>
+            <w:tcMar>
+              <w:left w:w="0" w:type="dxa"/>
+              <w:top w:w="240" w:type="dxa"/>
+              <w:right w:w="180" w:type="dxa"/>
+              <w:bottom w:w="240" w:type="dxa"/>
+            </w:tcMar>
+            <w:tcW w:w="1425" w:type="dxa"/>
+            <w:vAlign w:val="center"/>
+          </w:tcPr>
+          <w:p>
+            <w:pPr>
+              <w:pBdr/>
+              <w:spacing w:after="0" w:before="0" w:line="240"/>
+              <w:ind/>
+              <w:rPr/>
+            </w:pPr>
+            <w:r>
+              <w:rPr>
+                <w:rFonts w:ascii="Arial" w:hAnsi="Arial" w:eastAsia="Arial" w:cs="Arial"/>
+                <w:b/>
+                <w:color w:val="1f1f1f"/>
+                <w:sz w:val="24"/>
+              </w:rPr>
+              <w:t xml:space="preserve">RS</w:t>
+            </w:r>
+            <w:r/>
+          </w:p>
+        </w:tc>
+        <w:tc>
+          <w:tcPr>
+            <w:tcBorders>
+              <w:top w:val="single" w:color="1f1f1f" w:sz="6" w:space="0"/>
+              <w:left w:val="single" w:color="1f1f1f" w:sz="6" w:space="0"/>
+              <w:bottom w:val="single" w:color="1f1f1f" w:sz="6" w:space="0"/>
+              <w:right w:val="single" w:color="1f1f1f" w:sz="6" w:space="0"/>
+            </w:tcBorders>
+            <w:tcMar>
+              <w:left w:w="0" w:type="dxa"/>
+              <w:top w:w="240" w:type="dxa"/>
+              <w:right w:w="0" w:type="dxa"/>
+              <w:bottom w:w="240" w:type="dxa"/>
+            </w:tcMar>
+            <w:tcW w:w="6945" w:type="dxa"/>
+            <w:vAlign w:val="center"/>
+          </w:tcPr>
+          <w:p>
+            <w:pPr>
+              <w:pBdr>
+                <w:top w:val="none" w:color="000000" w:sz="4" w:space="0"/>
+                <w:left w:val="none" w:color="000000" w:sz="4" w:space="0"/>
+                <w:bottom w:val="none" w:color="000000" w:sz="4" w:space="0"/>
+                <w:right w:val="none" w:color="000000" w:sz="4" w:space="0"/>
+              </w:pBdr>
+              <w:spacing w:after="0" w:before="0" w:line="276" w:lineRule="auto"/>
+              <w:ind w:right="0" w:firstLine="0" w:left="0"/>
+              <w:rPr/>
+            </w:pPr>
+            <w:r>
+              <w:rPr>
+                <w:rFonts w:ascii="Arial" w:hAnsi="Arial" w:eastAsia="Arial" w:cs="Arial"/>
+                <w:color w:val="1f1f1f"/>
+                <w:sz w:val="24"/>
+              </w:rPr>
+              <w:t xml:space="preserve">Recurso de Software </w:t>
+            </w:r>
+            <w:r/>
+          </w:p>
+        </w:tc>
+      </w:tr>
+      <w:tr>
+        <w:trPr/>
+        <w:tc>
+          <w:tcPr>
+            <w:tcBorders>
+              <w:top w:val="single" w:color="1f1f1f" w:sz="6" w:space="0"/>
+              <w:left w:val="single" w:color="1f1f1f" w:sz="6" w:space="0"/>
+              <w:bottom w:val="single" w:color="1f1f1f" w:sz="6" w:space="0"/>
+              <w:right w:val="single" w:color="1f1f1f" w:sz="6" w:space="0"/>
+            </w:tcBorders>
+            <w:tcMar>
+              <w:left w:w="0" w:type="dxa"/>
+              <w:top w:w="240" w:type="dxa"/>
+              <w:right w:w="180" w:type="dxa"/>
+              <w:bottom w:w="240" w:type="dxa"/>
+            </w:tcMar>
+            <w:tcW w:w="1425" w:type="dxa"/>
+            <w:vAlign w:val="center"/>
+          </w:tcPr>
+          <w:p>
+            <w:pPr>
+              <w:pBdr/>
+              <w:spacing w:after="0" w:before="0" w:line="240"/>
+              <w:ind/>
+              <w:rPr/>
+            </w:pPr>
+            <w:r>
+              <w:rPr>
+                <w:rFonts w:ascii="Arial" w:hAnsi="Arial" w:eastAsia="Arial" w:cs="Arial"/>
+                <w:b/>
+                <w:color w:val="1f1f1f"/>
+                <w:sz w:val="24"/>
+              </w:rPr>
+              <w:t xml:space="preserve">SGBD</w:t>
+            </w:r>
+            <w:r/>
+          </w:p>
+        </w:tc>
+        <w:tc>
+          <w:tcPr>
+            <w:tcBorders>
+              <w:top w:val="single" w:color="1f1f1f" w:sz="6" w:space="0"/>
+              <w:left w:val="single" w:color="1f1f1f" w:sz="6" w:space="0"/>
+              <w:bottom w:val="single" w:color="1f1f1f" w:sz="6" w:space="0"/>
+              <w:right w:val="single" w:color="1f1f1f" w:sz="6" w:space="0"/>
+            </w:tcBorders>
+            <w:tcMar>
+              <w:left w:w="0" w:type="dxa"/>
+              <w:top w:w="240" w:type="dxa"/>
+              <w:right w:w="0" w:type="dxa"/>
+              <w:bottom w:w="240" w:type="dxa"/>
+            </w:tcMar>
+            <w:tcW w:w="6945" w:type="dxa"/>
+            <w:vAlign w:val="center"/>
+          </w:tcPr>
+          <w:p>
+            <w:pPr>
+              <w:pBdr>
+                <w:top w:val="none" w:color="000000" w:sz="4" w:space="0"/>
+                <w:left w:val="none" w:color="000000" w:sz="4" w:space="0"/>
+                <w:bottom w:val="none" w:color="000000" w:sz="4" w:space="0"/>
+                <w:right w:val="none" w:color="000000" w:sz="4" w:space="0"/>
+              </w:pBdr>
+              <w:spacing w:after="0" w:before="0" w:line="276" w:lineRule="auto"/>
+              <w:ind w:right="0" w:firstLine="0" w:left="0"/>
+              <w:rPr/>
+            </w:pPr>
+            <w:r>
+              <w:rPr>
+                <w:rFonts w:ascii="Arial" w:hAnsi="Arial" w:eastAsia="Arial" w:cs="Arial"/>
+                <w:color w:val="1f1f1f"/>
+                <w:sz w:val="24"/>
+              </w:rPr>
+              <w:t xml:space="preserve">Sistema Gerenciador de Banco de Dados </w:t>
+            </w:r>
+            <w:r/>
+          </w:p>
+        </w:tc>
+      </w:tr>
+      <w:tr>
+        <w:trPr/>
+        <w:tc>
+          <w:tcPr>
+            <w:tcBorders>
+              <w:top w:val="single" w:color="1f1f1f" w:sz="6" w:space="0"/>
+              <w:left w:val="single" w:color="1f1f1f" w:sz="6" w:space="0"/>
+              <w:bottom w:val="single" w:color="1f1f1f" w:sz="6" w:space="0"/>
+              <w:right w:val="single" w:color="1f1f1f" w:sz="6" w:space="0"/>
+            </w:tcBorders>
+            <w:tcMar>
+              <w:left w:w="0" w:type="dxa"/>
+              <w:top w:w="240" w:type="dxa"/>
+              <w:right w:w="180" w:type="dxa"/>
+              <w:bottom w:w="240" w:type="dxa"/>
+            </w:tcMar>
+            <w:tcW w:w="1425" w:type="dxa"/>
+            <w:vAlign w:val="center"/>
+          </w:tcPr>
+          <w:p>
+            <w:pPr>
+              <w:pBdr/>
+              <w:spacing w:after="0" w:before="0" w:line="240"/>
+              <w:ind/>
+              <w:rPr/>
+            </w:pPr>
+            <w:r>
+              <w:rPr>
+                <w:rFonts w:ascii="Arial" w:hAnsi="Arial" w:eastAsia="Arial" w:cs="Arial"/>
+                <w:b/>
+                <w:color w:val="1f1f1f"/>
+                <w:sz w:val="24"/>
+              </w:rPr>
+              <w:t xml:space="preserve">SSL</w:t>
+            </w:r>
+            <w:r/>
+          </w:p>
+        </w:tc>
+        <w:tc>
+          <w:tcPr>
+            <w:tcBorders>
+              <w:top w:val="single" w:color="1f1f1f" w:sz="6" w:space="0"/>
+              <w:left w:val="single" w:color="1f1f1f" w:sz="6" w:space="0"/>
+              <w:bottom w:val="single" w:color="1f1f1f" w:sz="6" w:space="0"/>
+              <w:right w:val="single" w:color="1f1f1f" w:sz="6" w:space="0"/>
+            </w:tcBorders>
+            <w:tcMar>
+              <w:left w:w="0" w:type="dxa"/>
+              <w:top w:w="240" w:type="dxa"/>
+              <w:right w:w="0" w:type="dxa"/>
+              <w:bottom w:w="240" w:type="dxa"/>
+            </w:tcMar>
+            <w:tcW w:w="6945" w:type="dxa"/>
+            <w:vAlign w:val="center"/>
+          </w:tcPr>
+          <w:p>
+            <w:pPr>
+              <w:pBdr>
+                <w:top w:val="none" w:color="000000" w:sz="4" w:space="0"/>
+                <w:left w:val="none" w:color="000000" w:sz="4" w:space="0"/>
+                <w:bottom w:val="none" w:color="000000" w:sz="4" w:space="0"/>
+                <w:right w:val="none" w:color="000000" w:sz="4" w:space="0"/>
+              </w:pBdr>
+              <w:spacing w:after="0" w:before="0" w:line="276" w:lineRule="auto"/>
+              <w:ind w:right="0" w:firstLine="0" w:left="0"/>
+              <w:rPr/>
+            </w:pPr>
+            <w:r>
+              <w:rPr>
+                <w:rFonts w:ascii="Arial" w:hAnsi="Arial" w:eastAsia="Arial" w:cs="Arial"/>
+                <w:i/>
+                <w:color w:val="1f1f1f"/>
+                <w:sz w:val="24"/>
+              </w:rPr>
+              <w:t xml:space="preserve">Secure Sockets Layer</w:t>
+            </w:r>
+            <w:r>
+              <w:rPr>
+                <w:rFonts w:ascii="Arial" w:hAnsi="Arial" w:eastAsia="Arial" w:cs="Arial"/>
+                <w:color w:val="1f1f1f"/>
+                <w:sz w:val="24"/>
+              </w:rPr>
+              <w:t xml:space="preserve"> </w:t>
+            </w:r>
+            <w:r/>
+          </w:p>
+        </w:tc>
+      </w:tr>
+      <w:tr>
+        <w:trPr/>
+        <w:tc>
+          <w:tcPr>
+            <w:tcBorders>
+              <w:top w:val="single" w:color="1f1f1f" w:sz="6" w:space="0"/>
+              <w:left w:val="single" w:color="1f1f1f" w:sz="6" w:space="0"/>
+              <w:bottom w:val="single" w:color="1f1f1f" w:sz="6" w:space="0"/>
+              <w:right w:val="single" w:color="1f1f1f" w:sz="6" w:space="0"/>
+            </w:tcBorders>
+            <w:tcMar>
+              <w:left w:w="0" w:type="dxa"/>
+              <w:top w:w="240" w:type="dxa"/>
+              <w:right w:w="180" w:type="dxa"/>
+              <w:bottom w:w="240" w:type="dxa"/>
+            </w:tcMar>
+            <w:tcW w:w="1425" w:type="dxa"/>
+            <w:vAlign w:val="center"/>
+          </w:tcPr>
+          <w:p>
+            <w:pPr>
+              <w:pBdr/>
+              <w:spacing w:after="0" w:before="0" w:line="240"/>
+              <w:ind/>
+              <w:rPr/>
+            </w:pPr>
+            <w:r>
+              <w:rPr>
+                <w:rFonts w:ascii="Arial" w:hAnsi="Arial" w:eastAsia="Arial" w:cs="Arial"/>
+                <w:b/>
+                <w:color w:val="1f1f1f"/>
+                <w:sz w:val="24"/>
+              </w:rPr>
+              <w:t xml:space="preserve">TIC</w:t>
+            </w:r>
+            <w:r/>
+          </w:p>
+        </w:tc>
+        <w:tc>
+          <w:tcPr>
+            <w:tcBorders>
+              <w:top w:val="single" w:color="1f1f1f" w:sz="6" w:space="0"/>
+              <w:left w:val="single" w:color="1f1f1f" w:sz="6" w:space="0"/>
+              <w:bottom w:val="single" w:color="1f1f1f" w:sz="6" w:space="0"/>
+              <w:right w:val="single" w:color="1f1f1f" w:sz="6" w:space="0"/>
+            </w:tcBorders>
+            <w:tcMar>
+              <w:left w:w="0" w:type="dxa"/>
+              <w:top w:w="240" w:type="dxa"/>
+              <w:right w:w="0" w:type="dxa"/>
+              <w:bottom w:w="240" w:type="dxa"/>
+            </w:tcMar>
+            <w:tcW w:w="6945" w:type="dxa"/>
+            <w:vAlign w:val="center"/>
+          </w:tcPr>
+          <w:p>
+            <w:pPr>
+              <w:pBdr>
+                <w:top w:val="none" w:color="000000" w:sz="4" w:space="0"/>
+                <w:left w:val="none" w:color="000000" w:sz="4" w:space="0"/>
+                <w:bottom w:val="none" w:color="000000" w:sz="4" w:space="0"/>
+                <w:right w:val="none" w:color="000000" w:sz="4" w:space="0"/>
+              </w:pBdr>
+              <w:spacing w:after="0" w:before="0" w:line="276" w:lineRule="auto"/>
+              <w:ind w:right="0" w:firstLine="0" w:left="0"/>
+              <w:rPr/>
+            </w:pPr>
+            <w:r>
+              <w:rPr>
+                <w:rFonts w:ascii="Arial" w:hAnsi="Arial" w:eastAsia="Arial" w:cs="Arial"/>
+                <w:color w:val="1f1f1f"/>
+                <w:sz w:val="24"/>
+              </w:rPr>
+              <w:t xml:space="preserve">Tecnologias da Informação e Comunicação </w:t>
+            </w:r>
+            <w:r/>
+          </w:p>
+        </w:tc>
+      </w:tr>
+      <w:tr>
+        <w:trPr/>
+        <w:tc>
+          <w:tcPr>
+            <w:tcBorders>
+              <w:top w:val="single" w:color="1f1f1f" w:sz="6" w:space="0"/>
+              <w:left w:val="single" w:color="1f1f1f" w:sz="6" w:space="0"/>
+              <w:bottom w:val="single" w:color="1f1f1f" w:sz="6" w:space="0"/>
+              <w:right w:val="single" w:color="1f1f1f" w:sz="6" w:space="0"/>
+            </w:tcBorders>
+            <w:tcMar>
+              <w:left w:w="0" w:type="dxa"/>
+              <w:top w:w="240" w:type="dxa"/>
+              <w:right w:w="180" w:type="dxa"/>
+              <w:bottom w:w="240" w:type="dxa"/>
+            </w:tcMar>
+            <w:tcW w:w="1425" w:type="dxa"/>
+            <w:vAlign w:val="center"/>
+          </w:tcPr>
+          <w:p>
+            <w:pPr>
+              <w:pBdr/>
+              <w:spacing w:after="0" w:before="0" w:line="240"/>
+              <w:ind/>
+              <w:rPr/>
+            </w:pPr>
+            <w:r>
+              <w:rPr>
+                <w:rFonts w:ascii="Arial" w:hAnsi="Arial" w:eastAsia="Arial" w:cs="Arial"/>
+                <w:b/>
+                <w:color w:val="1f1f1f"/>
+                <w:sz w:val="24"/>
+              </w:rPr>
+              <w:t xml:space="preserve">TLS</w:t>
+            </w:r>
+            <w:r/>
+          </w:p>
+        </w:tc>
+        <w:tc>
+          <w:tcPr>
+            <w:tcBorders>
+              <w:top w:val="single" w:color="1f1f1f" w:sz="6" w:space="0"/>
+              <w:left w:val="single" w:color="1f1f1f" w:sz="6" w:space="0"/>
+              <w:bottom w:val="single" w:color="1f1f1f" w:sz="6" w:space="0"/>
+              <w:right w:val="single" w:color="1f1f1f" w:sz="6" w:space="0"/>
+            </w:tcBorders>
+            <w:tcMar>
+              <w:left w:w="0" w:type="dxa"/>
+              <w:top w:w="240" w:type="dxa"/>
+              <w:right w:w="0" w:type="dxa"/>
+              <w:bottom w:w="240" w:type="dxa"/>
+            </w:tcMar>
+            <w:tcW w:w="6945" w:type="dxa"/>
+            <w:vAlign w:val="center"/>
+          </w:tcPr>
+          <w:p>
+            <w:pPr>
+              <w:pBdr>
+                <w:top w:val="none" w:color="000000" w:sz="4" w:space="0"/>
+                <w:left w:val="none" w:color="000000" w:sz="4" w:space="0"/>
+                <w:bottom w:val="none" w:color="000000" w:sz="4" w:space="0"/>
+                <w:right w:val="none" w:color="000000" w:sz="4" w:space="0"/>
+              </w:pBdr>
+              <w:spacing w:after="0" w:before="0" w:line="276" w:lineRule="auto"/>
+              <w:ind w:right="0" w:firstLine="0" w:left="0"/>
+              <w:rPr/>
+            </w:pPr>
+            <w:r>
+              <w:rPr>
+                <w:rFonts w:ascii="Arial" w:hAnsi="Arial" w:eastAsia="Arial" w:cs="Arial"/>
+                <w:i/>
+                <w:color w:val="1f1f1f"/>
+                <w:sz w:val="24"/>
+              </w:rPr>
+              <w:t xml:space="preserve">Transport Layer Security</w:t>
+            </w:r>
+            <w:r>
+              <w:rPr>
+                <w:rFonts w:ascii="Arial" w:hAnsi="Arial" w:eastAsia="Arial" w:cs="Arial"/>
+                <w:color w:val="1f1f1f"/>
+                <w:sz w:val="24"/>
+              </w:rPr>
+              <w:t xml:space="preserve"> </w:t>
+            </w:r>
+            <w:r/>
+          </w:p>
+        </w:tc>
+      </w:tr>
+      <w:tr>
+        <w:trPr/>
+        <w:tc>
+          <w:tcPr>
+            <w:tcBorders>
+              <w:top w:val="single" w:color="1f1f1f" w:sz="6" w:space="0"/>
+              <w:left w:val="single" w:color="1f1f1f" w:sz="6" w:space="0"/>
+              <w:bottom w:val="single" w:color="1f1f1f" w:sz="6" w:space="0"/>
+              <w:right w:val="single" w:color="1f1f1f" w:sz="6" w:space="0"/>
+            </w:tcBorders>
+            <w:tcMar>
+              <w:left w:w="0" w:type="dxa"/>
+              <w:top w:w="240" w:type="dxa"/>
+              <w:right w:w="180" w:type="dxa"/>
+              <w:bottom w:w="240" w:type="dxa"/>
+            </w:tcMar>
+            <w:tcW w:w="1425" w:type="dxa"/>
+            <w:vAlign w:val="center"/>
+          </w:tcPr>
+          <w:p>
+            <w:pPr>
+              <w:pBdr/>
+              <w:spacing w:after="0" w:before="0" w:line="240"/>
+              <w:ind/>
+              <w:rPr/>
+            </w:pPr>
+            <w:r>
+              <w:rPr>
+                <w:rFonts w:ascii="Arial" w:hAnsi="Arial" w:eastAsia="Arial" w:cs="Arial"/>
+                <w:b/>
+                <w:color w:val="1f1f1f"/>
+                <w:sz w:val="24"/>
+              </w:rPr>
+              <w:t xml:space="preserve">UML</w:t>
+            </w:r>
+            <w:r/>
+          </w:p>
+        </w:tc>
+        <w:tc>
+          <w:tcPr>
+            <w:tcBorders>
+              <w:top w:val="single" w:color="1f1f1f" w:sz="6" w:space="0"/>
+              <w:left w:val="single" w:color="1f1f1f" w:sz="6" w:space="0"/>
+              <w:bottom w:val="single" w:color="1f1f1f" w:sz="6" w:space="0"/>
+              <w:right w:val="single" w:color="1f1f1f" w:sz="6" w:space="0"/>
+            </w:tcBorders>
+            <w:tcMar>
+              <w:left w:w="0" w:type="dxa"/>
+              <w:top w:w="240" w:type="dxa"/>
+              <w:right w:w="0" w:type="dxa"/>
+              <w:bottom w:w="240" w:type="dxa"/>
+            </w:tcMar>
+            <w:tcW w:w="6945" w:type="dxa"/>
+            <w:vAlign w:val="center"/>
+          </w:tcPr>
+          <w:p>
+            <w:pPr>
+              <w:pBdr>
+                <w:top w:val="none" w:color="000000" w:sz="4" w:space="0"/>
+                <w:left w:val="none" w:color="000000" w:sz="4" w:space="0"/>
+                <w:bottom w:val="none" w:color="000000" w:sz="4" w:space="0"/>
+                <w:right w:val="none" w:color="000000" w:sz="4" w:space="0"/>
+              </w:pBdr>
+              <w:spacing w:after="0" w:before="0" w:line="276" w:lineRule="auto"/>
+              <w:ind w:right="0" w:firstLine="0" w:left="0"/>
+              <w:rPr/>
+            </w:pPr>
+            <w:r>
+              <w:rPr>
+                <w:rFonts w:ascii="Arial" w:hAnsi="Arial" w:eastAsia="Arial" w:cs="Arial"/>
+                <w:i/>
+                <w:color w:val="1f1f1f"/>
+                <w:sz w:val="24"/>
               </w:rPr>
               <w:t xml:space="preserve">Unified Modeling Language</w:t>
             </w:r>
             <w:r>
               <w:rPr>
+                <w:rFonts w:ascii="Arial" w:hAnsi="Arial" w:eastAsia="Arial" w:cs="Arial"/>
+                <w:color w:val="1f1f1f"/>
+                <w:sz w:val="24"/>
+              </w:rPr>
+              <w:t xml:space="preserve"> </w:t>
+            </w:r>
+            <w:r/>
+          </w:p>
+        </w:tc>
+      </w:tr>
+      <w:tr>
+        <w:trPr/>
+        <w:tc>
+          <w:tcPr>
+            <w:tcBorders>
+              <w:top w:val="single" w:color="1f1f1f" w:sz="6" w:space="0"/>
+              <w:left w:val="single" w:color="1f1f1f" w:sz="6" w:space="0"/>
+              <w:bottom w:val="single" w:color="1f1f1f" w:sz="6" w:space="0"/>
+              <w:right w:val="single" w:color="1f1f1f" w:sz="6" w:space="0"/>
+            </w:tcBorders>
+            <w:tcMar>
+              <w:left w:w="0" w:type="dxa"/>
+              <w:top w:w="240" w:type="dxa"/>
+              <w:right w:w="180" w:type="dxa"/>
+              <w:bottom w:w="240" w:type="dxa"/>
+            </w:tcMar>
+            <w:tcW w:w="1425" w:type="dxa"/>
+            <w:vAlign w:val="center"/>
+          </w:tcPr>
+          <w:p>
+            <w:pPr>
+              <w:pBdr/>
+              <w:spacing w:after="0" w:before="0" w:line="240"/>
+              <w:ind/>
+              <w:rPr/>
+            </w:pPr>
+            <w:r>
+              <w:rPr>
+                <w:rFonts w:ascii="Arial" w:hAnsi="Arial" w:eastAsia="Arial" w:cs="Arial"/>
+                <w:b/>
+                <w:color w:val="1f1f1f"/>
+                <w:sz w:val="24"/>
+              </w:rPr>
+              <w:t xml:space="preserve">UX</w:t>
+            </w:r>
+            <w:r/>
+          </w:p>
+        </w:tc>
+        <w:tc>
+          <w:tcPr>
+            <w:tcBorders>
+              <w:top w:val="single" w:color="1f1f1f" w:sz="6" w:space="0"/>
+              <w:left w:val="single" w:color="1f1f1f" w:sz="6" w:space="0"/>
+              <w:bottom w:val="single" w:color="1f1f1f" w:sz="6" w:space="0"/>
+              <w:right w:val="single" w:color="1f1f1f" w:sz="6" w:space="0"/>
+            </w:tcBorders>
+            <w:tcMar>
+              <w:left w:w="0" w:type="dxa"/>
+              <w:top w:w="240" w:type="dxa"/>
+              <w:right w:w="0" w:type="dxa"/>
+              <w:bottom w:w="240" w:type="dxa"/>
+            </w:tcMar>
+            <w:tcW w:w="6945" w:type="dxa"/>
+            <w:vAlign w:val="center"/>
+          </w:tcPr>
+          <w:p>
+            <w:pPr>
+              <w:pBdr>
+                <w:top w:val="none" w:color="000000" w:sz="4" w:space="0"/>
+                <w:left w:val="none" w:color="000000" w:sz="4" w:space="0"/>
+                <w:bottom w:val="none" w:color="000000" w:sz="4" w:space="0"/>
+                <w:right w:val="none" w:color="000000" w:sz="4" w:space="0"/>
+              </w:pBdr>
+              <w:spacing w:after="0" w:before="0" w:line="276" w:lineRule="auto"/>
+              <w:ind w:right="0" w:firstLine="0" w:left="0"/>
+              <w:rPr/>
+            </w:pPr>
+            <w:r>
+              <w:rPr>
+                <w:rFonts w:ascii="Arial" w:hAnsi="Arial" w:eastAsia="Arial" w:cs="Arial"/>
                 <w:i/>
+                <w:color w:val="1f1f1f"/>
+                <w:sz w:val="24"/>
               </w:rPr>
+              <w:t xml:space="preserve">User Experience</w:t>
             </w:r>
             <w:r>
               <w:rPr>
-                <w:i/>
+                <w:rFonts w:ascii="Arial" w:hAnsi="Arial" w:eastAsia="Arial" w:cs="Arial"/>
+                <w:color w:val="1f1f1f"/>
+                <w:sz w:val="24"/>
               </w:rPr>
+              <w:t xml:space="preserve"> </w:t>
             </w:r>
+            <w:r/>
           </w:p>
         </w:tc>
       </w:tr>
@@ -10122,8 +11575,12 @@
         <w:rPr/>
       </w:pPr>
       <w:r>
-        <w:t xml:space="preserve">RNF11 – Comunicação via Internet</w:t>
-      </w:r>
+        <w:t xml:space="preserve">RNF11 – </w:t>
+      </w:r>
+      <w:r>
+        <w:t xml:space="preserve">Comunicação Criptografada (SSL/TLS)</w:t>
+      </w:r>
+      <w:r/>
       <w:r/>
     </w:p>
     <w:p>
@@ -10137,6 +11594,114 @@
         <w:t xml:space="preserve">Descrição: </w:t>
       </w:r>
       <w:r>
+        <w:rPr>
+          <w:rFonts w:ascii="Times New Roman" w:hAnsi="Times New Roman" w:eastAsia="Times New Roman" w:cs="Times New Roman"/>
+          <w:color w:val="000000"/>
+          <w:sz w:val="24"/>
+        </w:rPr>
+        <w:t xml:space="preserve">O sistema deverá operar exclusivamente por meio de conexão segura utilizando o protocolo </w:t>
+      </w:r>
+      <w:r>
+        <w:rPr>
+          <w:rFonts w:ascii="Times New Roman" w:hAnsi="Times New Roman" w:eastAsia="Times New Roman" w:cs="Times New Roman"/>
+          <w:b w:val="0"/>
+          <w:bCs w:val="0"/>
+          <w:color w:val="000000"/>
+          <w:sz w:val="24"/>
+        </w:rPr>
+        <w:t xml:space="preserve">HTTPS</w:t>
+      </w:r>
+      <w:r>
+        <w:rPr>
+          <w:rFonts w:ascii="Times New Roman" w:hAnsi="Times New Roman" w:eastAsia="Times New Roman" w:cs="Times New Roman"/>
+          <w:color w:val="000000"/>
+          <w:sz w:val="24"/>
+        </w:rPr>
+        <w:t xml:space="preserve">. A integridade do canal de comunicação deve ser garantida por certificados </w:t>
+      </w:r>
+      <w:r>
+        <w:rPr>
+          <w:rFonts w:ascii="Times New Roman" w:hAnsi="Times New Roman" w:eastAsia="Times New Roman" w:cs="Times New Roman"/>
+          <w:b w:val="0"/>
+          <w:bCs w:val="0"/>
+          <w:color w:val="000000"/>
+          <w:sz w:val="24"/>
+        </w:rPr>
+        <w:t xml:space="preserve">SSL/TLS</w:t>
+      </w:r>
+      <w:r>
+        <w:rPr>
+          <w:rFonts w:ascii="Times New Roman" w:hAnsi="Times New Roman" w:eastAsia="Times New Roman" w:cs="Times New Roman"/>
+          <w:color w:val="000000"/>
+          <w:sz w:val="24"/>
+        </w:rPr>
+        <w:t xml:space="preserve"> atualizados, impedindo ataques de interceptação de dados (</w:t>
+      </w:r>
+      <w:r>
+        <w:rPr>
+          <w:rFonts w:ascii="Times New Roman" w:hAnsi="Times New Roman" w:eastAsia="Times New Roman" w:cs="Times New Roman"/>
+          <w:i/>
+          <w:color w:val="000000"/>
+          <w:sz w:val="24"/>
+        </w:rPr>
+        <w:t xml:space="preserve">Man-in-the-Middle</w:t>
+      </w:r>
+      <w:r>
+        <w:rPr>
+          <w:rFonts w:ascii="Times New Roman" w:hAnsi="Times New Roman" w:eastAsia="Times New Roman" w:cs="Times New Roman"/>
+          <w:color w:val="000000"/>
+          <w:sz w:val="24"/>
+        </w:rPr>
+        <w:t xml:space="preserve">).</w:t>
+      </w:r>
+      <w:r/>
+      <w:r/>
+    </w:p>
+    <w:p>
+      <w:pPr>
+        <w:pBdr/>
+        <w:spacing/>
+        <w:ind/>
+        <w:rPr/>
+      </w:pPr>
+      <w:r/>
+      <w:r/>
+    </w:p>
+    <w:p>
+      <w:pPr>
+        <w:pBdr/>
+        <w:spacing/>
+        <w:ind/>
+        <w:rPr/>
+      </w:pPr>
+      <w:r>
+        <w:t xml:space="preserve">b) Requisitos Éticos</w:t>
+      </w:r>
+      <w:r/>
+    </w:p>
+    <w:p>
+      <w:pPr>
+        <w:pBdr/>
+        <w:spacing/>
+        <w:ind/>
+        <w:rPr/>
+      </w:pPr>
+      <w:r>
+        <w:t xml:space="preserve">RNF12 – Uso Responsável da Informação</w:t>
+      </w:r>
+      <w:r/>
+    </w:p>
+    <w:p>
+      <w:pPr>
+        <w:pBdr/>
+        <w:spacing/>
+        <w:ind/>
+        <w:rPr/>
+      </w:pPr>
+      <w:r>
+        <w:t xml:space="preserve">Descrição: </w:t>
+      </w:r>
+      <w:r>
         <w:t xml:space="preserve">o</w:t>
       </w:r>
       <w:r>
@@ -10146,42 +11711,58 @@
         <w:t xml:space="preserve">rá</w:t>
       </w:r>
       <w:r>
-        <w:t xml:space="preserve"> operar por meio de conexão com a internet utilizando protocolo HTTP/HTTPS.</w:t>
-      </w:r>
-      <w:r/>
-    </w:p>
-    <w:p>
-      <w:pPr>
-        <w:pBdr/>
-        <w:spacing/>
-        <w:ind/>
-        <w:rPr/>
-      </w:pPr>
-      <w:r/>
-      <w:r/>
-    </w:p>
-    <w:p>
-      <w:pPr>
-        <w:pBdr/>
-        <w:spacing/>
-        <w:ind/>
-        <w:rPr/>
-      </w:pPr>
-      <w:r>
-        <w:t xml:space="preserve">b) Requisitos Éticos</w:t>
-      </w:r>
-      <w:r/>
-    </w:p>
-    <w:p>
-      <w:pPr>
-        <w:pBdr/>
-        <w:spacing/>
-        <w:ind/>
-        <w:rPr/>
-      </w:pPr>
-      <w:r>
-        <w:t xml:space="preserve">RNF12 – Uso Responsável da Informação</w:t>
-      </w:r>
+        <w:t xml:space="preserve"> garantir que as informações sejam utilizadas de forma ética, evitando exposição indevida de dados.</w:t>
+      </w:r>
+      <w:r/>
+    </w:p>
+    <w:p>
+      <w:pPr>
+        <w:pBdr/>
+        <w:spacing/>
+        <w:ind/>
+        <w:rPr/>
+      </w:pPr>
+      <w:r/>
+      <w:r/>
+    </w:p>
+    <w:p>
+      <w:pPr>
+        <w:pBdr/>
+        <w:spacing/>
+        <w:ind/>
+        <w:rPr/>
+      </w:pPr>
+      <w:r>
+        <w:t xml:space="preserve">5.1.2.4 Requisitos de Segurança da Informação</w:t>
+      </w:r>
+      <w:r/>
+    </w:p>
+    <w:p>
+      <w:pPr>
+        <w:pBdr/>
+        <w:spacing/>
+        <w:ind/>
+        <w:rPr/>
+      </w:pPr>
+      <w:r>
+        <w:t xml:space="preserve">a) Requisitos de Segurança (confiabilidade, disponibilidade, autenticidade e integridade)</w:t>
+      </w:r>
+      <w:r/>
+    </w:p>
+    <w:p>
+      <w:pPr>
+        <w:pBdr/>
+        <w:spacing/>
+        <w:ind/>
+        <w:rPr/>
+      </w:pPr>
+      <w:r>
+        <w:t xml:space="preserve">RNF13 – </w:t>
+      </w:r>
+      <w:r>
+        <w:t xml:space="preserve">Autenticação Robusta (JWT e MFA)</w:t>
+      </w:r>
+      <w:r/>
       <w:r/>
     </w:p>
     <w:p>
@@ -10194,63 +11775,48 @@
       <w:r>
         <w:t xml:space="preserve">Descrição: </w:t>
       </w:r>
-      <w:r>
-        <w:t xml:space="preserve">o</w:t>
-      </w:r>
-      <w:r>
-        <w:t xml:space="preserve"> sistema deve</w:t>
-      </w:r>
-      <w:r>
-        <w:t xml:space="preserve">rá</w:t>
-      </w:r>
-      <w:r>
-        <w:t xml:space="preserve"> garantir que as informações sejam utilizadas de forma ética, evitando exposição indevida de dados.</w:t>
-      </w:r>
-      <w:r/>
-    </w:p>
-    <w:p>
-      <w:pPr>
-        <w:pBdr/>
-        <w:spacing/>
-        <w:ind/>
-        <w:rPr/>
-      </w:pPr>
-      <w:r/>
-      <w:r/>
-    </w:p>
-    <w:p>
-      <w:pPr>
-        <w:pBdr/>
-        <w:spacing/>
-        <w:ind/>
-        <w:rPr/>
-      </w:pPr>
-      <w:r>
-        <w:t xml:space="preserve">5.1.2.4 Requisitos de Segurança da Informação</w:t>
-      </w:r>
-      <w:r/>
-    </w:p>
-    <w:p>
-      <w:pPr>
-        <w:pBdr/>
-        <w:spacing/>
-        <w:ind/>
-        <w:rPr/>
-      </w:pPr>
-      <w:r>
-        <w:t xml:space="preserve">a) Requisitos de Segurança (confiabilidade, disponibilidade, autenticidade e integridade)</w:t>
-      </w:r>
-      <w:r/>
-    </w:p>
-    <w:p>
-      <w:pPr>
-        <w:pBdr/>
-        <w:spacing/>
-        <w:ind/>
-        <w:rPr/>
-      </w:pPr>
-      <w:r>
-        <w:t xml:space="preserve">RNF13 – Autenticação Segura</w:t>
+      <w:r/>
+      <w:r>
+        <w:t xml:space="preserve">O sistema deve garantir a autenticidade dos usuários por meio de criptografia de senhas com o algoritmo BCrypt no </w:t>
+      </w:r>
+      <w:r>
+        <w:rPr>
+          <w:i/>
+          <w:iCs/>
+        </w:rPr>
+        <w:t xml:space="preserve">backend </w:t>
+      </w:r>
+      <w:r>
+        <w:t xml:space="preserve">Java. O gerenciamento de sessões será realizado via tokens JWT (</w:t>
+      </w:r>
+      <w:r>
+        <w:rPr>
+          <w:i/>
+          <w:iCs/>
+        </w:rPr>
+        <w:t xml:space="preserve">JSON Web Token</w:t>
+      </w:r>
+      <w:r>
+        <w:t xml:space="preserve">). Adicionalmente, para os perfis de Funcionário e Admini</w:t>
+      </w:r>
+      <w:r>
+        <w:t xml:space="preserve">strador, será exigida a Autenticação Multifator (MFA) para validar o acesso às áreas administrativas.</w:t>
+      </w:r>
+      <w:r/>
+      <w:r/>
+    </w:p>
+    <w:p>
+      <w:pPr>
+        <w:pBdr/>
+        <w:spacing/>
+        <w:ind/>
+        <w:rPr/>
+      </w:pPr>
+      <w:r>
+        <w:t xml:space="preserve">RNF14 – I</w:t>
+      </w:r>
+      <w:r>
+        <w:t xml:space="preserve">ntegridade e Proteção dos Dados</w:t>
       </w:r>
       <w:r/>
     </w:p>
@@ -10264,8 +11830,85 @@
       <w:r>
         <w:t xml:space="preserve">Descrição: </w:t>
       </w:r>
-      <w:r>
-        <w:t xml:space="preserve">O sistema deve garantir a autenticidade por meio de criptografia de senhas (utilizando algoritmos como BCrypt no Java/Spring Security) e gerenciamento de sessões via tokens JWT (JSON Web Token).</w:t>
+      <w:r/>
+      <w:r>
+        <w:rPr>
+          <w:rFonts w:ascii="Times New Roman" w:hAnsi="Times New Roman" w:eastAsia="Times New Roman" w:cs="Times New Roman"/>
+          <w:color w:val="000000"/>
+          <w:sz w:val="24"/>
+        </w:rPr>
+        <w:t xml:space="preserve">A integridade dos dados armazenados no </w:t>
+      </w:r>
+      <w:r>
+        <w:rPr>
+          <w:rFonts w:ascii="Times New Roman" w:hAnsi="Times New Roman" w:eastAsia="Times New Roman" w:cs="Times New Roman"/>
+          <w:b/>
+          <w:color w:val="000000"/>
+          <w:sz w:val="24"/>
+        </w:rPr>
+        <w:t xml:space="preserve">PostgreSQL 18</w:t>
+      </w:r>
+      <w:r>
+        <w:rPr>
+          <w:rFonts w:ascii="Times New Roman" w:hAnsi="Times New Roman" w:eastAsia="Times New Roman" w:cs="Times New Roman"/>
+          <w:color w:val="000000"/>
+          <w:sz w:val="24"/>
+        </w:rPr>
+        <w:t xml:space="preserve"> será assegurada por restrições de acesso e políticas</w:t>
+      </w:r>
+      <w:r>
+        <w:rPr>
+          <w:rFonts w:ascii="Times New Roman" w:hAnsi="Times New Roman" w:eastAsia="Times New Roman" w:cs="Times New Roman"/>
+          <w:color w:val="000000"/>
+          <w:sz w:val="24"/>
+        </w:rPr>
+        <w:t xml:space="preserve">. A proteção durante o trânsito de informações entre o </w:t>
+      </w:r>
+      <w:r>
+        <w:rPr>
+          <w:rFonts w:ascii="Times New Roman" w:hAnsi="Times New Roman" w:eastAsia="Times New Roman" w:cs="Times New Roman"/>
+          <w:i/>
+          <w:color w:val="000000"/>
+          <w:sz w:val="24"/>
+        </w:rPr>
+        <w:t xml:space="preserve">frontend</w:t>
+      </w:r>
+      <w:r>
+        <w:rPr>
+          <w:rFonts w:ascii="Times New Roman" w:hAnsi="Times New Roman" w:eastAsia="Times New Roman" w:cs="Times New Roman"/>
+          <w:color w:val="000000"/>
+          <w:sz w:val="24"/>
+        </w:rPr>
+        <w:t xml:space="preserve"> Angular 21 e o </w:t>
+      </w:r>
+      <w:r>
+        <w:rPr>
+          <w:rFonts w:ascii="Times New Roman" w:hAnsi="Times New Roman" w:eastAsia="Times New Roman" w:cs="Times New Roman"/>
+          <w:i/>
+          <w:color w:val="000000"/>
+          <w:sz w:val="24"/>
+        </w:rPr>
+        <w:t xml:space="preserve">backend</w:t>
+      </w:r>
+      <w:r>
+        <w:rPr>
+          <w:rFonts w:ascii="Times New Roman" w:hAnsi="Times New Roman" w:eastAsia="Times New Roman" w:cs="Times New Roman"/>
+          <w:color w:val="000000"/>
+          <w:sz w:val="24"/>
+        </w:rPr>
+        <w:t xml:space="preserve"> Java 21 será garantida pelo uso mandatório de túneis criptografados </w:t>
+      </w:r>
+      <w:r>
+        <w:rPr>
+          <w:rFonts w:ascii="Times New Roman" w:hAnsi="Times New Roman" w:eastAsia="Times New Roman" w:cs="Times New Roman"/>
+          <w:b/>
+          <w:color w:val="000000"/>
+          <w:sz w:val="24"/>
+        </w:rPr>
+        <w:t xml:space="preserve">TLS/SSL</w:t>
+      </w:r>
+      <w:r>
+        <w:t xml:space="preserve">.</w:t>
       </w:r>
       <w:r>
         <w:rPr>
@@ -10282,25 +11925,132 @@
         <w:rPr/>
       </w:pPr>
       <w:r>
-        <w:t xml:space="preserve">RNF14 – I</w:t>
-      </w:r>
-      <w:r>
-        <w:t xml:space="preserve">ntegridade e Proteção dos Dados</w:t>
-      </w:r>
-      <w:r/>
-    </w:p>
-    <w:p>
-      <w:pPr>
-        <w:pBdr/>
-        <w:spacing/>
-        <w:ind/>
-        <w:rPr/>
+        <w:t xml:space="preserve">RNF15 – Disponibilidade do Sistema</w:t>
+      </w:r>
+      <w:r/>
+    </w:p>
+    <w:p>
+      <w:pPr>
+        <w:pBdr/>
+        <w:spacing/>
+        <w:ind/>
+        <w:rPr>
+          <w:highlight w:val="none"/>
+        </w:rPr>
       </w:pPr>
       <w:r>
         <w:t xml:space="preserve">Descrição: </w:t>
       </w:r>
-      <w:r>
-        <w:t xml:space="preserve">A integridade será assegurada pela restrição de acesso a nível de banco de dados (PostgreSQL) e pelo uso de protocolos de comunicação criptografados (HTTPS/TLS), impedindo a interceptação ou alteração indevida de dados durante o tráfego.</w:t>
+      <w:r/>
+      <w:r>
+        <w:t xml:space="preserve">O sistema deve manter um índice de disponibilidade (</w:t>
+      </w:r>
+      <w:r>
+        <w:rPr>
+          <w:i/>
+          <w:iCs/>
+        </w:rPr>
+        <w:t xml:space="preserve">Uptime</w:t>
+      </w:r>
+      <w:r>
+        <w:t xml:space="preserve">) de no mínimo 99%, com janelas de manutenção programadas em horários de baixa utilização</w:t>
+      </w:r>
+      <w:r/>
+      <w:r>
+        <w:t xml:space="preserve">.</w:t>
+      </w:r>
+      <w:r>
+        <w:rPr>
+          <w:highlight w:val="none"/>
+        </w:rPr>
+      </w:r>
+      <w:r>
+        <w:rPr>
+          <w:highlight w:val="none"/>
+        </w:rPr>
+      </w:r>
+    </w:p>
+    <w:p>
+      <w:pPr>
+        <w:pBdr/>
+        <w:spacing/>
+        <w:ind/>
+        <w:rPr/>
+      </w:pPr>
+      <w:r>
+        <w:t xml:space="preserve">b) Requisitos de Privacidade e </w:t>
+      </w:r>
+      <w:r>
+        <w:t xml:space="preserve">Tecnologias de Implementação</w:t>
+      </w:r>
+      <w:r/>
+    </w:p>
+    <w:p>
+      <w:pPr>
+        <w:pBdr/>
+        <w:spacing/>
+        <w:ind/>
+        <w:rPr/>
+      </w:pPr>
+      <w:r>
+        <w:t xml:space="preserve">RNF16 – Conformidade com LGPD </w:t>
+      </w:r>
+      <w:r>
+        <w:t xml:space="preserve">e Políticas de Acesso</w:t>
+      </w:r>
+      <w:r/>
+    </w:p>
+    <w:p>
+      <w:pPr>
+        <w:pBdr/>
+        <w:spacing/>
+        <w:ind/>
+        <w:rPr/>
+      </w:pPr>
+      <w:r>
+        <w:t xml:space="preserve">Descrição: </w:t>
+      </w:r>
+      <w:r>
+        <w:rPr>
+          <w:rFonts w:ascii="Times New Roman" w:hAnsi="Times New Roman" w:eastAsia="Times New Roman" w:cs="Times New Roman"/>
+          <w:color w:val="000000"/>
+          <w:sz w:val="24"/>
+        </w:rPr>
+        <w:t xml:space="preserve">O sistema deve implementar Termos de Uso e Políticas de Privacidade aceitos obrigatoriamente no cadastro, conforme a </w:t>
+      </w:r>
+      <w:r>
+        <w:rPr>
+          <w:rFonts w:ascii="Times New Roman" w:hAnsi="Times New Roman" w:eastAsia="Times New Roman" w:cs="Times New Roman"/>
+          <w:b w:val="0"/>
+          <w:bCs w:val="0"/>
+          <w:color w:val="000000"/>
+          <w:sz w:val="24"/>
+        </w:rPr>
+        <w:t xml:space="preserve">LGPD</w:t>
+      </w:r>
+      <w:r>
+        <w:rPr>
+          <w:rFonts w:ascii="Times New Roman" w:hAnsi="Times New Roman" w:eastAsia="Times New Roman" w:cs="Times New Roman"/>
+          <w:color w:val="000000"/>
+          <w:sz w:val="24"/>
+        </w:rPr>
+        <w:t xml:space="preserve">. As senhas devem seguir uma política de complexidade mínima de 8 caracteres, incluindo letras, números e caracteres especiais.</w:t>
+      </w:r>
+      <w:r/>
+      <w:r/>
+    </w:p>
+    <w:p>
+      <w:pPr>
+        <w:pBdr/>
+        <w:spacing/>
+        <w:ind/>
+        <w:rPr/>
+      </w:pPr>
+      <w:r>
+        <w:t xml:space="preserve">RNF17 – </w:t>
+      </w:r>
+      <w:r>
+        <w:t xml:space="preserve">Tecnologias de Desenvolvimento</w:t>
       </w:r>
       <w:r>
         <w:rPr>
@@ -10314,119 +12064,40 @@
         <w:pBdr/>
         <w:spacing/>
         <w:ind/>
-        <w:rPr/>
-      </w:pPr>
-      <w:r>
-        <w:t xml:space="preserve">RNF15 – Disponibilidade do Sistema</w:t>
-      </w:r>
-      <w:r/>
-    </w:p>
-    <w:p>
-      <w:pPr>
-        <w:pBdr/>
-        <w:spacing/>
-        <w:ind/>
         <w:rPr>
           <w:highlight w:val="none"/>
         </w:rPr>
       </w:pPr>
       <w:r>
-        <w:t xml:space="preserve">Descrição: </w:t>
-      </w:r>
-      <w:r>
-        <w:t xml:space="preserve">O sistema deve manter um índice de disponibilidade (Uptime) de no mínimo 99%, prevendo janelas de manutenção programadas em horários de baixa utilização.</w:t>
+        <w:t xml:space="preserve">Descrição:</w:t>
+      </w:r>
+      <w:r>
+        <w:t xml:space="preserve"> </w:t>
+      </w:r>
+      <w:r>
+        <w:t xml:space="preserve">O </w:t>
       </w:r>
       <w:r>
         <w:rPr>
-          <w:highlight w:val="none"/>
+          <w:i/>
+          <w:iCs/>
         </w:rPr>
+        <w:t xml:space="preserve">backend </w:t>
+      </w:r>
+      <w:r>
+        <w:t xml:space="preserve">será desenvolvido em Java 21 com </w:t>
       </w:r>
       <w:r>
         <w:rPr>
-          <w:highlight w:val="none"/>
+          <w:i/>
+          <w:iCs/>
         </w:rPr>
-      </w:r>
-    </w:p>
-    <w:p>
-      <w:pPr>
-        <w:pBdr/>
-        <w:spacing/>
-        <w:ind/>
-        <w:rPr/>
-      </w:pPr>
-      <w:r>
-        <w:t xml:space="preserve">b) Requisitos de Privacidade e </w:t>
-      </w:r>
-      <w:r>
-        <w:t xml:space="preserve">Tecnologias de Implementação</w:t>
-      </w:r>
-      <w:r/>
-    </w:p>
-    <w:p>
-      <w:pPr>
-        <w:pBdr/>
-        <w:spacing/>
-        <w:ind/>
-        <w:rPr/>
-      </w:pPr>
-      <w:r>
-        <w:t xml:space="preserve">RNF16 – Conformidade com LGPD </w:t>
-      </w:r>
-      <w:r>
-        <w:t xml:space="preserve">e Políticas de Acesso</w:t>
-      </w:r>
-      <w:r/>
-    </w:p>
-    <w:p>
-      <w:pPr>
-        <w:pBdr/>
-        <w:spacing/>
-        <w:ind/>
-        <w:rPr/>
-      </w:pPr>
-      <w:r>
-        <w:t xml:space="preserve">Descrição: </w:t>
-      </w:r>
-      <w:r>
-        <w:t xml:space="preserve">O sistema deve implementar Termos de Uso e Políticas de Privacidade aceitos obrigatoriamente no cadastro. As senhas devem seguir uma política de complexidade mínima (mínimo de 8 caracteres, incluindo letras e números).</w:t>
-      </w:r>
-      <w:r/>
-    </w:p>
-    <w:p>
-      <w:pPr>
-        <w:pBdr/>
-        <w:spacing/>
-        <w:ind/>
-        <w:rPr/>
-      </w:pPr>
-      <w:r>
-        <w:t xml:space="preserve">RNF17 – </w:t>
-      </w:r>
-      <w:r>
-        <w:t xml:space="preserve">Tecnologias de Desenvolvimento</w:t>
-      </w:r>
-      <w:r>
-        <w:rPr>
-          <w:highlight w:val="yellow"/>
-        </w:rPr>
-      </w:r>
-      <w:r/>
-    </w:p>
-    <w:p>
-      <w:pPr>
-        <w:pBdr/>
-        <w:spacing/>
-        <w:ind/>
-        <w:rPr>
-          <w:highlight w:val="none"/>
-        </w:rPr>
-      </w:pPr>
-      <w:r>
-        <w:t xml:space="preserve">Descrição:</w:t>
-      </w:r>
-      <w:r>
-        <w:t xml:space="preserve"> O backend será desenvolvido em Java 21 com Spring Boot; o frontend utilizará o framework Angular 21; para a persistência, será utilizado o Sistema Gerenciador de Banco de Dados (SGBD) PostgreSQL 18.</w:t>
-      </w:r>
+        <w:t xml:space="preserve">Spring Boot</w:t>
+      </w:r>
+      <w:r>
+        <w:t xml:space="preserve"> (utilizando Spring Security para gestão de JWT e MFA); o frontend utilizará o framework Angular 21; para a persistência, será utilizado o SGBD PostgreSQL 18</w:t>
+      </w:r>
+      <w:r/>
       <w:r>
         <w:rPr>
           <w:highlight w:val="none"/>

</xml_diff>